<commit_message>
Document changes 005-019 in the project log
</commit_message>
<xml_diff>
--- a/Chowly - Project Log.docx
+++ b/Chowly - Project Log.docx
@@ -4572,7 +4572,7 @@
                 <w:sz w:val="19"/>
                 <w:szCs w:val="19"/>
               </w:rPr>
-              <w:t xml:space="preserve">—</w:t>
+              <w:t xml:space="preserve">6 Sep 2026</w:t>
             </w:r>
           </w:p>
         </w:tc>
@@ -4599,7 +4599,7 @@
                 <w:sz w:val="19"/>
                 <w:szCs w:val="19"/>
               </w:rPr>
-              <w:t xml:space="preserve">Whether the app serves one restaurant or both seeded restaurants</w:t>
+              <w:t xml:space="preserve">The application serves all twelve seeded restaurants, not one</w:t>
             </w:r>
           </w:p>
         </w:tc>
@@ -4626,35 +4626,1987 @@
                 <w:sz w:val="19"/>
                 <w:szCs w:val="19"/>
               </w:rPr>
-              <w:t xml:space="preserve">AWAITING REASON — the submitted model supports many restaurants; scope affects whether those relationships are exercised or left decorative.</w:t>
+              <w:t xml:space="preserve">The submitted model supports many restaurants, and restricting the interface to one would have left the Restaurant–Menu–MenuItem and Restaurant–Staff relationships in the database but unreachable — decorative rather than exercised. Serving all twelve proves those relationships work against real data rather than against one hardcoded case, and gives anyone marking the work twelve menus to open instead of one. The cost is the restaurant switcher in the header, which is additional surface area to get right; change 019 records a defect it caused.</w:t>
             </w:r>
           </w:p>
         </w:tc>
         <w:tc>
           <w:tcPr>
             <w:tcW w:type="dxa" w:w="1200"/>
-            <w:shd w:fill="FDECEA" w:color="auto" w:val="clear"/>
-            <w:tcMar>
-              <w:top w:type="dxa" w:w="80"/>
-              <w:left w:type="dxa" w:w="120"/>
-              <w:bottom w:type="dxa" w:w="80"/>
-              <w:right w:type="dxa" w:w="120"/>
-            </w:tcMar>
-          </w:tcPr>
-          <w:p>
-            <w:pPr>
-              <w:spacing w:after="0" w:line="260"/>
-            </w:pPr>
-            <w:r>
-              <w:rPr>
-                <w:rFonts w:ascii="Calibri" w:cs="Calibri" w:eastAsia="Calibri" w:hAnsi="Calibri"/>
-                <w:b w:val="false"/>
-                <w:bCs w:val="false"/>
-                <w:color w:val="1A1A1A"/>
-                <w:sz w:val="19"/>
-                <w:szCs w:val="19"/>
-              </w:rPr>
-              <w:t xml:space="preserve">Open</w:t>
+            <w:tcMar>
+              <w:top w:type="dxa" w:w="80"/>
+              <w:left w:type="dxa" w:w="120"/>
+              <w:bottom w:type="dxa" w:w="80"/>
+              <w:right w:type="dxa" w:w="120"/>
+            </w:tcMar>
+          </w:tcPr>
+          <w:p>
+            <w:pPr>
+              <w:spacing w:after="0" w:line="260"/>
+            </w:pPr>
+            <w:r>
+              <w:rPr>
+                <w:rFonts w:ascii="Calibri" w:cs="Calibri" w:eastAsia="Calibri" w:hAnsi="Calibri"/>
+                <w:b w:val="false"/>
+                <w:bCs w:val="false"/>
+                <w:color w:val="1A1A1A"/>
+                <w:sz w:val="19"/>
+                <w:szCs w:val="19"/>
+              </w:rPr>
+              <w:t xml:space="preserve">Confirmed</w:t>
+            </w:r>
+          </w:p>
+        </w:tc>
+      </w:tr>
+      <w:tr>
+        <w:tc>
+          <w:tcPr>
+            <w:tcW w:type="dxa" w:w="700"/>
+            <w:shd w:fill="F7F7F7" w:color="auto" w:val="clear"/>
+            <w:tcMar>
+              <w:top w:type="dxa" w:w="80"/>
+              <w:left w:type="dxa" w:w="120"/>
+              <w:bottom w:type="dxa" w:w="80"/>
+              <w:right w:type="dxa" w:w="120"/>
+            </w:tcMar>
+          </w:tcPr>
+          <w:p>
+            <w:pPr>
+              <w:spacing w:after="0" w:line="260"/>
+            </w:pPr>
+            <w:r>
+              <w:rPr>
+                <w:rFonts w:ascii="Calibri" w:cs="Calibri" w:eastAsia="Calibri" w:hAnsi="Calibri"/>
+                <w:b/>
+                <w:bCs/>
+                <w:color w:val="1A1A1A"/>
+                <w:sz w:val="19"/>
+                <w:szCs w:val="19"/>
+              </w:rPr>
+              <w:t xml:space="preserve">006</w:t>
+            </w:r>
+          </w:p>
+        </w:tc>
+        <w:tc>
+          <w:tcPr>
+            <w:tcW w:type="dxa" w:w="1100"/>
+            <w:shd w:fill="F7F7F7" w:color="auto" w:val="clear"/>
+            <w:tcMar>
+              <w:top w:type="dxa" w:w="80"/>
+              <w:left w:type="dxa" w:w="120"/>
+              <w:bottom w:type="dxa" w:w="80"/>
+              <w:right w:type="dxa" w:w="120"/>
+            </w:tcMar>
+          </w:tcPr>
+          <w:p>
+            <w:pPr>
+              <w:spacing w:after="0" w:line="260"/>
+            </w:pPr>
+            <w:r>
+              <w:rPr>
+                <w:rFonts w:ascii="Calibri" w:cs="Calibri" w:eastAsia="Calibri" w:hAnsi="Calibri"/>
+                <w:b w:val="false"/>
+                <w:bCs w:val="false"/>
+                <w:color w:val="1A1A1A"/>
+                <w:sz w:val="19"/>
+                <w:szCs w:val="19"/>
+              </w:rPr>
+              <w:t xml:space="preserve">6 Sep 2026</w:t>
+            </w:r>
+          </w:p>
+        </w:tc>
+        <w:tc>
+          <w:tcPr>
+            <w:tcW w:type="dxa" w:w="2400"/>
+            <w:shd w:fill="F7F7F7" w:color="auto" w:val="clear"/>
+            <w:tcMar>
+              <w:top w:type="dxa" w:w="80"/>
+              <w:left w:type="dxa" w:w="120"/>
+              <w:bottom w:type="dxa" w:w="80"/>
+              <w:right w:type="dxa" w:w="120"/>
+            </w:tcMar>
+          </w:tcPr>
+          <w:p>
+            <w:pPr>
+              <w:spacing w:after="0" w:line="260"/>
+            </w:pPr>
+            <w:r>
+              <w:rPr>
+                <w:rFonts w:ascii="Calibri" w:cs="Calibri" w:eastAsia="Calibri" w:hAnsi="Calibri"/>
+                <w:b w:val="false"/>
+                <w:bCs w:val="false"/>
+                <w:color w:val="1A1A1A"/>
+                <w:sz w:val="19"/>
+                <w:szCs w:val="19"/>
+              </w:rPr>
+              <w:t xml:space="preserve">Add table_number to CustomerOrder</w:t>
+            </w:r>
+          </w:p>
+        </w:tc>
+        <w:tc>
+          <w:tcPr>
+            <w:tcW w:type="dxa" w:w="3626"/>
+            <w:shd w:fill="F7F7F7" w:color="auto" w:val="clear"/>
+            <w:tcMar>
+              <w:top w:type="dxa" w:w="80"/>
+              <w:left w:type="dxa" w:w="120"/>
+              <w:bottom w:type="dxa" w:w="80"/>
+              <w:right w:type="dxa" w:w="120"/>
+            </w:tcMar>
+          </w:tcPr>
+          <w:p>
+            <w:pPr>
+              <w:spacing w:after="0" w:line="260"/>
+            </w:pPr>
+            <w:r>
+              <w:rPr>
+                <w:rFonts w:ascii="Calibri" w:cs="Calibri" w:eastAsia="Calibri" w:hAnsi="Calibri"/>
+                <w:b w:val="false"/>
+                <w:bCs w:val="false"/>
+                <w:color w:val="1A1A1A"/>
+                <w:sz w:val="19"/>
+                <w:szCs w:val="19"/>
+              </w:rPr>
+              <w:t xml:space="preserve">The schema half of decision 004. The submitted model records who ordered but not where they are sitting, and without a login the table number is the only thing that tells a waiter where to carry the food. Required rather than optional: an order that cannot be delivered is not an order.</w:t>
+            </w:r>
+          </w:p>
+        </w:tc>
+        <w:tc>
+          <w:tcPr>
+            <w:tcW w:type="dxa" w:w="1200"/>
+            <w:shd w:fill="F7F7F7" w:color="auto" w:val="clear"/>
+            <w:tcMar>
+              <w:top w:type="dxa" w:w="80"/>
+              <w:left w:type="dxa" w:w="120"/>
+              <w:bottom w:type="dxa" w:w="80"/>
+              <w:right w:type="dxa" w:w="120"/>
+            </w:tcMar>
+          </w:tcPr>
+          <w:p>
+            <w:pPr>
+              <w:spacing w:after="0" w:line="260"/>
+            </w:pPr>
+            <w:r>
+              <w:rPr>
+                <w:rFonts w:ascii="Calibri" w:cs="Calibri" w:eastAsia="Calibri" w:hAnsi="Calibri"/>
+                <w:b w:val="false"/>
+                <w:bCs w:val="false"/>
+                <w:color w:val="1A1A1A"/>
+                <w:sz w:val="19"/>
+                <w:szCs w:val="19"/>
+              </w:rPr>
+              <w:t xml:space="preserve">Confirmed</w:t>
+            </w:r>
+          </w:p>
+        </w:tc>
+      </w:tr>
+      <w:tr>
+        <w:tc>
+          <w:tcPr>
+            <w:tcW w:type="dxa" w:w="700"/>
+            <w:tcMar>
+              <w:top w:type="dxa" w:w="80"/>
+              <w:left w:type="dxa" w:w="120"/>
+              <w:bottom w:type="dxa" w:w="80"/>
+              <w:right w:type="dxa" w:w="120"/>
+            </w:tcMar>
+          </w:tcPr>
+          <w:p>
+            <w:pPr>
+              <w:spacing w:after="0" w:line="260"/>
+            </w:pPr>
+            <w:r>
+              <w:rPr>
+                <w:rFonts w:ascii="Calibri" w:cs="Calibri" w:eastAsia="Calibri" w:hAnsi="Calibri"/>
+                <w:b/>
+                <w:bCs/>
+                <w:color w:val="1A1A1A"/>
+                <w:sz w:val="19"/>
+                <w:szCs w:val="19"/>
+              </w:rPr>
+              <w:t xml:space="preserve">007</w:t>
+            </w:r>
+          </w:p>
+        </w:tc>
+        <w:tc>
+          <w:tcPr>
+            <w:tcW w:type="dxa" w:w="1100"/>
+            <w:tcMar>
+              <w:top w:type="dxa" w:w="80"/>
+              <w:left w:type="dxa" w:w="120"/>
+              <w:bottom w:type="dxa" w:w="80"/>
+              <w:right w:type="dxa" w:w="120"/>
+            </w:tcMar>
+          </w:tcPr>
+          <w:p>
+            <w:pPr>
+              <w:spacing w:after="0" w:line="260"/>
+            </w:pPr>
+            <w:r>
+              <w:rPr>
+                <w:rFonts w:ascii="Calibri" w:cs="Calibri" w:eastAsia="Calibri" w:hAnsi="Calibri"/>
+                <w:b w:val="false"/>
+                <w:bCs w:val="false"/>
+                <w:color w:val="1A1A1A"/>
+                <w:sz w:val="19"/>
+                <w:szCs w:val="19"/>
+              </w:rPr>
+              <w:t xml:space="preserve">6 Sep 2026</w:t>
+            </w:r>
+          </w:p>
+        </w:tc>
+        <w:tc>
+          <w:tcPr>
+            <w:tcW w:type="dxa" w:w="2400"/>
+            <w:tcMar>
+              <w:top w:type="dxa" w:w="80"/>
+              <w:left w:type="dxa" w:w="120"/>
+              <w:bottom w:type="dxa" w:w="80"/>
+              <w:right w:type="dxa" w:w="120"/>
+            </w:tcMar>
+          </w:tcPr>
+          <w:p>
+            <w:pPr>
+              <w:spacing w:after="0" w:line="260"/>
+            </w:pPr>
+            <w:r>
+              <w:rPr>
+                <w:rFonts w:ascii="Calibri" w:cs="Calibri" w:eastAsia="Calibri" w:hAnsi="Calibri"/>
+                <w:b w:val="false"/>
+                <w:bCs w:val="false"/>
+                <w:color w:val="1A1A1A"/>
+                <w:sz w:val="19"/>
+                <w:szCs w:val="19"/>
+              </w:rPr>
+              <w:t xml:space="preserve">Order status becomes a fixed enum: PLACED, PREPARING, SERVED, PAID</w:t>
+            </w:r>
+          </w:p>
+        </w:tc>
+        <w:tc>
+          <w:tcPr>
+            <w:tcW w:type="dxa" w:w="3626"/>
+            <w:tcMar>
+              <w:top w:type="dxa" w:w="80"/>
+              <w:left w:type="dxa" w:w="120"/>
+              <w:bottom w:type="dxa" w:w="80"/>
+              <w:right w:type="dxa" w:w="120"/>
+            </w:tcMar>
+          </w:tcPr>
+          <w:p>
+            <w:pPr>
+              <w:spacing w:after="0" w:line="260"/>
+            </w:pPr>
+            <w:r>
+              <w:rPr>
+                <w:rFonts w:ascii="Calibri" w:cs="Calibri" w:eastAsia="Calibri" w:hAnsi="Calibri"/>
+                <w:b w:val="false"/>
+                <w:bCs w:val="false"/>
+                <w:color w:val="1A1A1A"/>
+                <w:sz w:val="19"/>
+                <w:szCs w:val="19"/>
+              </w:rPr>
+              <w:t xml:space="preserve">The submitted model held a free-text status showing values such as “Preparing” and “Completed”. Free text allows two spellings of the same state and gives the application nothing to check against. The lifecycle the brief describes is fixed — an order is placed, a waiter records who prepared it, it is served, and it is paid for on the way out — so the database rejects anything outside that list, and the API can refuse illegal jumps such as serving an order nobody has prepared.</w:t>
+            </w:r>
+          </w:p>
+        </w:tc>
+        <w:tc>
+          <w:tcPr>
+            <w:tcW w:type="dxa" w:w="1200"/>
+            <w:tcMar>
+              <w:top w:type="dxa" w:w="80"/>
+              <w:left w:type="dxa" w:w="120"/>
+              <w:bottom w:type="dxa" w:w="80"/>
+              <w:right w:type="dxa" w:w="120"/>
+            </w:tcMar>
+          </w:tcPr>
+          <w:p>
+            <w:pPr>
+              <w:spacing w:after="0" w:line="260"/>
+            </w:pPr>
+            <w:r>
+              <w:rPr>
+                <w:rFonts w:ascii="Calibri" w:cs="Calibri" w:eastAsia="Calibri" w:hAnsi="Calibri"/>
+                <w:b w:val="false"/>
+                <w:bCs w:val="false"/>
+                <w:color w:val="1A1A1A"/>
+                <w:sz w:val="19"/>
+                <w:szCs w:val="19"/>
+              </w:rPr>
+              <w:t xml:space="preserve">Confirmed</w:t>
+            </w:r>
+          </w:p>
+        </w:tc>
+      </w:tr>
+      <w:tr>
+        <w:tc>
+          <w:tcPr>
+            <w:tcW w:type="dxa" w:w="700"/>
+            <w:shd w:fill="F7F7F7" w:color="auto" w:val="clear"/>
+            <w:tcMar>
+              <w:top w:type="dxa" w:w="80"/>
+              <w:left w:type="dxa" w:w="120"/>
+              <w:bottom w:type="dxa" w:w="80"/>
+              <w:right w:type="dxa" w:w="120"/>
+            </w:tcMar>
+          </w:tcPr>
+          <w:p>
+            <w:pPr>
+              <w:spacing w:after="0" w:line="260"/>
+            </w:pPr>
+            <w:r>
+              <w:rPr>
+                <w:rFonts w:ascii="Calibri" w:cs="Calibri" w:eastAsia="Calibri" w:hAnsi="Calibri"/>
+                <w:b/>
+                <w:bCs/>
+                <w:color w:val="1A1A1A"/>
+                <w:sz w:val="19"/>
+                <w:szCs w:val="19"/>
+              </w:rPr>
+              <w:t xml:space="preserve">008</w:t>
+            </w:r>
+          </w:p>
+        </w:tc>
+        <w:tc>
+          <w:tcPr>
+            <w:tcW w:type="dxa" w:w="1100"/>
+            <w:shd w:fill="F7F7F7" w:color="auto" w:val="clear"/>
+            <w:tcMar>
+              <w:top w:type="dxa" w:w="80"/>
+              <w:left w:type="dxa" w:w="120"/>
+              <w:bottom w:type="dxa" w:w="80"/>
+              <w:right w:type="dxa" w:w="120"/>
+            </w:tcMar>
+          </w:tcPr>
+          <w:p>
+            <w:pPr>
+              <w:spacing w:after="0" w:line="260"/>
+            </w:pPr>
+            <w:r>
+              <w:rPr>
+                <w:rFonts w:ascii="Calibri" w:cs="Calibri" w:eastAsia="Calibri" w:hAnsi="Calibri"/>
+                <w:b w:val="false"/>
+                <w:bCs w:val="false"/>
+                <w:color w:val="1A1A1A"/>
+                <w:sz w:val="19"/>
+                <w:szCs w:val="19"/>
+              </w:rPr>
+              <w:t xml:space="preserve">6 Sep 2026</w:t>
+            </w:r>
+          </w:p>
+        </w:tc>
+        <w:tc>
+          <w:tcPr>
+            <w:tcW w:type="dxa" w:w="2400"/>
+            <w:shd w:fill="F7F7F7" w:color="auto" w:val="clear"/>
+            <w:tcMar>
+              <w:top w:type="dxa" w:w="80"/>
+              <w:left w:type="dxa" w:w="120"/>
+              <w:bottom w:type="dxa" w:w="80"/>
+              <w:right w:type="dxa" w:w="120"/>
+            </w:tcMar>
+          </w:tcPr>
+          <w:p>
+            <w:pPr>
+              <w:spacing w:after="0" w:line="260"/>
+            </w:pPr>
+            <w:r>
+              <w:rPr>
+                <w:rFonts w:ascii="Calibri" w:cs="Calibri" w:eastAsia="Calibri" w:hAnsi="Calibri"/>
+                <w:b w:val="false"/>
+                <w:bCs w:val="false"/>
+                <w:color w:val="1A1A1A"/>
+                <w:sz w:val="19"/>
+                <w:szCs w:val="19"/>
+              </w:rPr>
+              <w:t xml:space="preserve">chef_id and bartender_id on OrderPreparation are both optional</w:t>
+            </w:r>
+          </w:p>
+        </w:tc>
+        <w:tc>
+          <w:tcPr>
+            <w:tcW w:type="dxa" w:w="3626"/>
+            <w:shd w:fill="F7F7F7" w:color="auto" w:val="clear"/>
+            <w:tcMar>
+              <w:top w:type="dxa" w:w="80"/>
+              <w:left w:type="dxa" w:w="120"/>
+              <w:bottom w:type="dxa" w:w="80"/>
+              <w:right w:type="dxa" w:w="120"/>
+            </w:tcMar>
+          </w:tcPr>
+          <w:p>
+            <w:pPr>
+              <w:spacing w:after="0" w:line="260"/>
+            </w:pPr>
+            <w:r>
+              <w:rPr>
+                <w:rFonts w:ascii="Calibri" w:cs="Calibri" w:eastAsia="Calibri" w:hAnsi="Calibri"/>
+                <w:b w:val="false"/>
+                <w:bCs w:val="false"/>
+                <w:color w:val="1A1A1A"/>
+                <w:sz w:val="19"/>
+                <w:szCs w:val="19"/>
+              </w:rPr>
+              <w:t xml:space="preserve">An order of drinks only has no chef, and an order of food only has no bartender. Requiring both would force the waiter to name someone who did no work, which puts false data in the table to satisfy a constraint. Requirement 4 is still met: the API refuses a preparation record naming neither, so at least one real person is always recorded.</w:t>
+            </w:r>
+          </w:p>
+        </w:tc>
+        <w:tc>
+          <w:tcPr>
+            <w:tcW w:type="dxa" w:w="1200"/>
+            <w:shd w:fill="F7F7F7" w:color="auto" w:val="clear"/>
+            <w:tcMar>
+              <w:top w:type="dxa" w:w="80"/>
+              <w:left w:type="dxa" w:w="120"/>
+              <w:bottom w:type="dxa" w:w="80"/>
+              <w:right w:type="dxa" w:w="120"/>
+            </w:tcMar>
+          </w:tcPr>
+          <w:p>
+            <w:pPr>
+              <w:spacing w:after="0" w:line="260"/>
+            </w:pPr>
+            <w:r>
+              <w:rPr>
+                <w:rFonts w:ascii="Calibri" w:cs="Calibri" w:eastAsia="Calibri" w:hAnsi="Calibri"/>
+                <w:b w:val="false"/>
+                <w:bCs w:val="false"/>
+                <w:color w:val="1A1A1A"/>
+                <w:sz w:val="19"/>
+                <w:szCs w:val="19"/>
+              </w:rPr>
+              <w:t xml:space="preserve">Confirmed</w:t>
+            </w:r>
+          </w:p>
+        </w:tc>
+      </w:tr>
+      <w:tr>
+        <w:tc>
+          <w:tcPr>
+            <w:tcW w:type="dxa" w:w="700"/>
+            <w:tcMar>
+              <w:top w:type="dxa" w:w="80"/>
+              <w:left w:type="dxa" w:w="120"/>
+              <w:bottom w:type="dxa" w:w="80"/>
+              <w:right w:type="dxa" w:w="120"/>
+            </w:tcMar>
+          </w:tcPr>
+          <w:p>
+            <w:pPr>
+              <w:spacing w:after="0" w:line="260"/>
+            </w:pPr>
+            <w:r>
+              <w:rPr>
+                <w:rFonts w:ascii="Calibri" w:cs="Calibri" w:eastAsia="Calibri" w:hAnsi="Calibri"/>
+                <w:b/>
+                <w:bCs/>
+                <w:color w:val="1A1A1A"/>
+                <w:sz w:val="19"/>
+                <w:szCs w:val="19"/>
+              </w:rPr>
+              <w:t xml:space="preserve">009</w:t>
+            </w:r>
+          </w:p>
+        </w:tc>
+        <w:tc>
+          <w:tcPr>
+            <w:tcW w:type="dxa" w:w="1100"/>
+            <w:tcMar>
+              <w:top w:type="dxa" w:w="80"/>
+              <w:left w:type="dxa" w:w="120"/>
+              <w:bottom w:type="dxa" w:w="80"/>
+              <w:right w:type="dxa" w:w="120"/>
+            </w:tcMar>
+          </w:tcPr>
+          <w:p>
+            <w:pPr>
+              <w:spacing w:after="0" w:line="260"/>
+            </w:pPr>
+            <w:r>
+              <w:rPr>
+                <w:rFonts w:ascii="Calibri" w:cs="Calibri" w:eastAsia="Calibri" w:hAnsi="Calibri"/>
+                <w:b w:val="false"/>
+                <w:bCs w:val="false"/>
+                <w:color w:val="1A1A1A"/>
+                <w:sz w:val="19"/>
+                <w:szCs w:val="19"/>
+              </w:rPr>
+              <w:t xml:space="preserve">6 Sep 2026</w:t>
+            </w:r>
+          </w:p>
+        </w:tc>
+        <w:tc>
+          <w:tcPr>
+            <w:tcW w:type="dxa" w:w="2400"/>
+            <w:tcMar>
+              <w:top w:type="dxa" w:w="80"/>
+              <w:left w:type="dxa" w:w="120"/>
+              <w:bottom w:type="dxa" w:w="80"/>
+              <w:right w:type="dxa" w:w="120"/>
+            </w:tcMar>
+          </w:tcPr>
+          <w:p>
+            <w:pPr>
+              <w:spacing w:after="0" w:line="260"/>
+            </w:pPr>
+            <w:r>
+              <w:rPr>
+                <w:rFonts w:ascii="Calibri" w:cs="Calibri" w:eastAsia="Calibri" w:hAnsi="Calibri"/>
+                <w:b w:val="false"/>
+                <w:bCs w:val="false"/>
+                <w:color w:val="1A1A1A"/>
+                <w:sz w:val="19"/>
+                <w:szCs w:val="19"/>
+              </w:rPr>
+              <w:t xml:space="preserve">Unique constraint on order_id in OrderPreparation, Rating and Payment</w:t>
+            </w:r>
+          </w:p>
+        </w:tc>
+        <w:tc>
+          <w:tcPr>
+            <w:tcW w:type="dxa" w:w="3626"/>
+            <w:tcMar>
+              <w:top w:type="dxa" w:w="80"/>
+              <w:left w:type="dxa" w:w="120"/>
+              <w:bottom w:type="dxa" w:w="80"/>
+              <w:right w:type="dxa" w:w="120"/>
+            </w:tcMar>
+          </w:tcPr>
+          <w:p>
+            <w:pPr>
+              <w:spacing w:after="0" w:line="260"/>
+            </w:pPr>
+            <w:r>
+              <w:rPr>
+                <w:rFonts w:ascii="Calibri" w:cs="Calibri" w:eastAsia="Calibri" w:hAnsi="Calibri"/>
+                <w:b w:val="false"/>
+                <w:bCs w:val="false"/>
+                <w:color w:val="1A1A1A"/>
+                <w:sz w:val="19"/>
+                <w:szCs w:val="19"/>
+              </w:rPr>
+              <w:t xml:space="preserve">The Relationships sheet of the submitted model declares these as 1:1, 1:0..1 and 1:1. Without a unique constraint the database would happily accept two preparation records for one order, several ratings of the same meal, or a second payment against an order already settled. The declared cardinality is enforced by the database rather than trusted to the application, so a bug in the API cannot corrupt the data behind it.</w:t>
+            </w:r>
+          </w:p>
+        </w:tc>
+        <w:tc>
+          <w:tcPr>
+            <w:tcW w:type="dxa" w:w="1200"/>
+            <w:tcMar>
+              <w:top w:type="dxa" w:w="80"/>
+              <w:left w:type="dxa" w:w="120"/>
+              <w:bottom w:type="dxa" w:w="80"/>
+              <w:right w:type="dxa" w:w="120"/>
+            </w:tcMar>
+          </w:tcPr>
+          <w:p>
+            <w:pPr>
+              <w:spacing w:after="0" w:line="260"/>
+            </w:pPr>
+            <w:r>
+              <w:rPr>
+                <w:rFonts w:ascii="Calibri" w:cs="Calibri" w:eastAsia="Calibri" w:hAnsi="Calibri"/>
+                <w:b w:val="false"/>
+                <w:bCs w:val="false"/>
+                <w:color w:val="1A1A1A"/>
+                <w:sz w:val="19"/>
+                <w:szCs w:val="19"/>
+              </w:rPr>
+              <w:t xml:space="preserve">Confirmed</w:t>
+            </w:r>
+          </w:p>
+        </w:tc>
+      </w:tr>
+      <w:tr>
+        <w:tc>
+          <w:tcPr>
+            <w:tcW w:type="dxa" w:w="700"/>
+            <w:shd w:fill="F7F7F7" w:color="auto" w:val="clear"/>
+            <w:tcMar>
+              <w:top w:type="dxa" w:w="80"/>
+              <w:left w:type="dxa" w:w="120"/>
+              <w:bottom w:type="dxa" w:w="80"/>
+              <w:right w:type="dxa" w:w="120"/>
+            </w:tcMar>
+          </w:tcPr>
+          <w:p>
+            <w:pPr>
+              <w:spacing w:after="0" w:line="260"/>
+            </w:pPr>
+            <w:r>
+              <w:rPr>
+                <w:rFonts w:ascii="Calibri" w:cs="Calibri" w:eastAsia="Calibri" w:hAnsi="Calibri"/>
+                <w:b/>
+                <w:bCs/>
+                <w:color w:val="1A1A1A"/>
+                <w:sz w:val="19"/>
+                <w:szCs w:val="19"/>
+              </w:rPr>
+              <w:t xml:space="preserve">010</w:t>
+            </w:r>
+          </w:p>
+        </w:tc>
+        <w:tc>
+          <w:tcPr>
+            <w:tcW w:type="dxa" w:w="1100"/>
+            <w:shd w:fill="F7F7F7" w:color="auto" w:val="clear"/>
+            <w:tcMar>
+              <w:top w:type="dxa" w:w="80"/>
+              <w:left w:type="dxa" w:w="120"/>
+              <w:bottom w:type="dxa" w:w="80"/>
+              <w:right w:type="dxa" w:w="120"/>
+            </w:tcMar>
+          </w:tcPr>
+          <w:p>
+            <w:pPr>
+              <w:spacing w:after="0" w:line="260"/>
+            </w:pPr>
+            <w:r>
+              <w:rPr>
+                <w:rFonts w:ascii="Calibri" w:cs="Calibri" w:eastAsia="Calibri" w:hAnsi="Calibri"/>
+                <w:b w:val="false"/>
+                <w:bCs w:val="false"/>
+                <w:color w:val="1A1A1A"/>
+                <w:sz w:val="19"/>
+                <w:szCs w:val="19"/>
+              </w:rPr>
+              <w:t xml:space="preserve">6 Sep 2026</w:t>
+            </w:r>
+          </w:p>
+        </w:tc>
+        <w:tc>
+          <w:tcPr>
+            <w:tcW w:type="dxa" w:w="2400"/>
+            <w:shd w:fill="F7F7F7" w:color="auto" w:val="clear"/>
+            <w:tcMar>
+              <w:top w:type="dxa" w:w="80"/>
+              <w:left w:type="dxa" w:w="120"/>
+              <w:bottom w:type="dxa" w:w="80"/>
+              <w:right w:type="dxa" w:w="120"/>
+            </w:tcMar>
+          </w:tcPr>
+          <w:p>
+            <w:pPr>
+              <w:spacing w:after="0" w:line="260"/>
+            </w:pPr>
+            <w:r>
+              <w:rPr>
+                <w:rFonts w:ascii="Calibri" w:cs="Calibri" w:eastAsia="Calibri" w:hAnsi="Calibri"/>
+                <w:b w:val="false"/>
+                <w:bCs w:val="false"/>
+                <w:color w:val="1A1A1A"/>
+                <w:sz w:val="19"/>
+                <w:szCs w:val="19"/>
+              </w:rPr>
+              <w:t xml:space="preserve">is_pretend flag added to Payment</w:t>
+            </w:r>
+          </w:p>
+        </w:tc>
+        <w:tc>
+          <w:tcPr>
+            <w:tcW w:type="dxa" w:w="3626"/>
+            <w:shd w:fill="F7F7F7" w:color="auto" w:val="clear"/>
+            <w:tcMar>
+              <w:top w:type="dxa" w:w="80"/>
+              <w:left w:type="dxa" w:w="120"/>
+              <w:bottom w:type="dxa" w:w="80"/>
+              <w:right w:type="dxa" w:w="120"/>
+            </w:tcMar>
+          </w:tcPr>
+          <w:p>
+            <w:pPr>
+              <w:spacing w:after="0" w:line="260"/>
+            </w:pPr>
+            <w:r>
+              <w:rPr>
+                <w:rFonts w:ascii="Calibri" w:cs="Calibri" w:eastAsia="Calibri" w:hAnsi="Calibri"/>
+                <w:b w:val="false"/>
+                <w:bCs w:val="false"/>
+                <w:color w:val="1A1A1A"/>
+                <w:sz w:val="19"/>
+                <w:szCs w:val="19"/>
+              </w:rPr>
+              <w:t xml:space="preserve">Requirement 5 allows the payment to be pretend but requires it to be recorded and clearly labelled as such. Holding the flag on the record rather than only wording it in the interface means the label survives in the data: anyone reading the payments table later can see that no money moved, without having to know how the screen was worded.</w:t>
+            </w:r>
+          </w:p>
+        </w:tc>
+        <w:tc>
+          <w:tcPr>
+            <w:tcW w:type="dxa" w:w="1200"/>
+            <w:shd w:fill="F7F7F7" w:color="auto" w:val="clear"/>
+            <w:tcMar>
+              <w:top w:type="dxa" w:w="80"/>
+              <w:left w:type="dxa" w:w="120"/>
+              <w:bottom w:type="dxa" w:w="80"/>
+              <w:right w:type="dxa" w:w="120"/>
+            </w:tcMar>
+          </w:tcPr>
+          <w:p>
+            <w:pPr>
+              <w:spacing w:after="0" w:line="260"/>
+            </w:pPr>
+            <w:r>
+              <w:rPr>
+                <w:rFonts w:ascii="Calibri" w:cs="Calibri" w:eastAsia="Calibri" w:hAnsi="Calibri"/>
+                <w:b w:val="false"/>
+                <w:bCs w:val="false"/>
+                <w:color w:val="1A1A1A"/>
+                <w:sz w:val="19"/>
+                <w:szCs w:val="19"/>
+              </w:rPr>
+              <w:t xml:space="preserve">Confirmed</w:t>
+            </w:r>
+          </w:p>
+        </w:tc>
+      </w:tr>
+      <w:tr>
+        <w:tc>
+          <w:tcPr>
+            <w:tcW w:type="dxa" w:w="700"/>
+            <w:tcMar>
+              <w:top w:type="dxa" w:w="80"/>
+              <w:left w:type="dxa" w:w="120"/>
+              <w:bottom w:type="dxa" w:w="80"/>
+              <w:right w:type="dxa" w:w="120"/>
+            </w:tcMar>
+          </w:tcPr>
+          <w:p>
+            <w:pPr>
+              <w:spacing w:after="0" w:line="260"/>
+            </w:pPr>
+            <w:r>
+              <w:rPr>
+                <w:rFonts w:ascii="Calibri" w:cs="Calibri" w:eastAsia="Calibri" w:hAnsi="Calibri"/>
+                <w:b/>
+                <w:bCs/>
+                <w:color w:val="1A1A1A"/>
+                <w:sz w:val="19"/>
+                <w:szCs w:val="19"/>
+              </w:rPr>
+              <w:t xml:space="preserve">011</w:t>
+            </w:r>
+          </w:p>
+        </w:tc>
+        <w:tc>
+          <w:tcPr>
+            <w:tcW w:type="dxa" w:w="1100"/>
+            <w:tcMar>
+              <w:top w:type="dxa" w:w="80"/>
+              <w:left w:type="dxa" w:w="120"/>
+              <w:bottom w:type="dxa" w:w="80"/>
+              <w:right w:type="dxa" w:w="120"/>
+            </w:tcMar>
+          </w:tcPr>
+          <w:p>
+            <w:pPr>
+              <w:spacing w:after="0" w:line="260"/>
+            </w:pPr>
+            <w:r>
+              <w:rPr>
+                <w:rFonts w:ascii="Calibri" w:cs="Calibri" w:eastAsia="Calibri" w:hAnsi="Calibri"/>
+                <w:b w:val="false"/>
+                <w:bCs w:val="false"/>
+                <w:color w:val="1A1A1A"/>
+                <w:sz w:val="19"/>
+                <w:szCs w:val="19"/>
+              </w:rPr>
+              <w:t xml:space="preserve">6 Sep 2026</w:t>
+            </w:r>
+          </w:p>
+        </w:tc>
+        <w:tc>
+          <w:tcPr>
+            <w:tcW w:type="dxa" w:w="2400"/>
+            <w:tcMar>
+              <w:top w:type="dxa" w:w="80"/>
+              <w:left w:type="dxa" w:w="120"/>
+              <w:bottom w:type="dxa" w:w="80"/>
+              <w:right w:type="dxa" w:w="120"/>
+            </w:tcMar>
+          </w:tcPr>
+          <w:p>
+            <w:pPr>
+              <w:spacing w:after="0" w:line="260"/>
+            </w:pPr>
+            <w:r>
+              <w:rPr>
+                <w:rFonts w:ascii="Calibri" w:cs="Calibri" w:eastAsia="Calibri" w:hAnsi="Calibri"/>
+                <w:b w:val="false"/>
+                <w:bCs w:val="false"/>
+                <w:color w:val="1A1A1A"/>
+                <w:sz w:val="19"/>
+                <w:szCs w:val="19"/>
+              </w:rPr>
+              <w:t xml:space="preserve">opening_time and closing_time stored as “HH:mm” text, not timestamps</w:t>
+            </w:r>
+          </w:p>
+        </w:tc>
+        <w:tc>
+          <w:tcPr>
+            <w:tcW w:type="dxa" w:w="3626"/>
+            <w:tcMar>
+              <w:top w:type="dxa" w:w="80"/>
+              <w:left w:type="dxa" w:w="120"/>
+              <w:bottom w:type="dxa" w:w="80"/>
+              <w:right w:type="dxa" w:w="120"/>
+            </w:tcMar>
+          </w:tcPr>
+          <w:p>
+            <w:pPr>
+              <w:spacing w:after="0" w:line="260"/>
+            </w:pPr>
+            <w:r>
+              <w:rPr>
+                <w:rFonts w:ascii="Calibri" w:cs="Calibri" w:eastAsia="Calibri" w:hAnsi="Calibri"/>
+                <w:b w:val="false"/>
+                <w:bCs w:val="false"/>
+                <w:color w:val="1A1A1A"/>
+                <w:sz w:val="19"/>
+                <w:szCs w:val="19"/>
+              </w:rPr>
+              <w:t xml:space="preserve">They describe a time of day that repeats every day, not a moment in time. Storing them as timestamps would attach a date and a timezone to something that has neither, which invites timezone bugs — a restaurant appearing to close at 22:00 in one place and 23:00 in another — for no benefit.</w:t>
+            </w:r>
+          </w:p>
+        </w:tc>
+        <w:tc>
+          <w:tcPr>
+            <w:tcW w:type="dxa" w:w="1200"/>
+            <w:tcMar>
+              <w:top w:type="dxa" w:w="80"/>
+              <w:left w:type="dxa" w:w="120"/>
+              <w:bottom w:type="dxa" w:w="80"/>
+              <w:right w:type="dxa" w:w="120"/>
+            </w:tcMar>
+          </w:tcPr>
+          <w:p>
+            <w:pPr>
+              <w:spacing w:after="0" w:line="260"/>
+            </w:pPr>
+            <w:r>
+              <w:rPr>
+                <w:rFonts w:ascii="Calibri" w:cs="Calibri" w:eastAsia="Calibri" w:hAnsi="Calibri"/>
+                <w:b w:val="false"/>
+                <w:bCs w:val="false"/>
+                <w:color w:val="1A1A1A"/>
+                <w:sz w:val="19"/>
+                <w:szCs w:val="19"/>
+              </w:rPr>
+              <w:t xml:space="preserve">Confirmed</w:t>
+            </w:r>
+          </w:p>
+        </w:tc>
+      </w:tr>
+      <w:tr>
+        <w:tc>
+          <w:tcPr>
+            <w:tcW w:type="dxa" w:w="700"/>
+            <w:shd w:fill="F7F7F7" w:color="auto" w:val="clear"/>
+            <w:tcMar>
+              <w:top w:type="dxa" w:w="80"/>
+              <w:left w:type="dxa" w:w="120"/>
+              <w:bottom w:type="dxa" w:w="80"/>
+              <w:right w:type="dxa" w:w="120"/>
+            </w:tcMar>
+          </w:tcPr>
+          <w:p>
+            <w:pPr>
+              <w:spacing w:after="0" w:line="260"/>
+            </w:pPr>
+            <w:r>
+              <w:rPr>
+                <w:rFonts w:ascii="Calibri" w:cs="Calibri" w:eastAsia="Calibri" w:hAnsi="Calibri"/>
+                <w:b/>
+                <w:bCs/>
+                <w:color w:val="1A1A1A"/>
+                <w:sz w:val="19"/>
+                <w:szCs w:val="19"/>
+              </w:rPr>
+              <w:t xml:space="preserve">012</w:t>
+            </w:r>
+          </w:p>
+        </w:tc>
+        <w:tc>
+          <w:tcPr>
+            <w:tcW w:type="dxa" w:w="1100"/>
+            <w:shd w:fill="F7F7F7" w:color="auto" w:val="clear"/>
+            <w:tcMar>
+              <w:top w:type="dxa" w:w="80"/>
+              <w:left w:type="dxa" w:w="120"/>
+              <w:bottom w:type="dxa" w:w="80"/>
+              <w:right w:type="dxa" w:w="120"/>
+            </w:tcMar>
+          </w:tcPr>
+          <w:p>
+            <w:pPr>
+              <w:spacing w:after="0" w:line="260"/>
+            </w:pPr>
+            <w:r>
+              <w:rPr>
+                <w:rFonts w:ascii="Calibri" w:cs="Calibri" w:eastAsia="Calibri" w:hAnsi="Calibri"/>
+                <w:b w:val="false"/>
+                <w:bCs w:val="false"/>
+                <w:color w:val="1A1A1A"/>
+                <w:sz w:val="19"/>
+                <w:szCs w:val="19"/>
+              </w:rPr>
+              <w:t xml:space="preserve">6 Sep 2026</w:t>
+            </w:r>
+          </w:p>
+        </w:tc>
+        <w:tc>
+          <w:tcPr>
+            <w:tcW w:type="dxa" w:w="2400"/>
+            <w:shd w:fill="F7F7F7" w:color="auto" w:val="clear"/>
+            <w:tcMar>
+              <w:top w:type="dxa" w:w="80"/>
+              <w:left w:type="dxa" w:w="120"/>
+              <w:bottom w:type="dxa" w:w="80"/>
+              <w:right w:type="dxa" w:w="120"/>
+            </w:tcMar>
+          </w:tcPr>
+          <w:p>
+            <w:pPr>
+              <w:spacing w:after="0" w:line="260"/>
+            </w:pPr>
+            <w:r>
+              <w:rPr>
+                <w:rFonts w:ascii="Calibri" w:cs="Calibri" w:eastAsia="Calibri" w:hAnsi="Calibri"/>
+                <w:b w:val="false"/>
+                <w:bCs w:val="false"/>
+                <w:color w:val="1A1A1A"/>
+                <w:sz w:val="19"/>
+                <w:szCs w:val="19"/>
+              </w:rPr>
+              <w:t xml:space="preserve">Surname, phone and email on Customer made optional</w:t>
+            </w:r>
+          </w:p>
+        </w:tc>
+        <w:tc>
+          <w:tcPr>
+            <w:tcW w:type="dxa" w:w="3626"/>
+            <w:shd w:fill="F7F7F7" w:color="auto" w:val="clear"/>
+            <w:tcMar>
+              <w:top w:type="dxa" w:w="80"/>
+              <w:left w:type="dxa" w:w="120"/>
+              <w:bottom w:type="dxa" w:w="80"/>
+              <w:right w:type="dxa" w:w="120"/>
+            </w:tcMar>
+          </w:tcPr>
+          <w:p>
+            <w:pPr>
+              <w:spacing w:after="0" w:line="260"/>
+            </w:pPr>
+            <w:r>
+              <w:rPr>
+                <w:rFonts w:ascii="Calibri" w:cs="Calibri" w:eastAsia="Calibri" w:hAnsi="Calibri"/>
+                <w:b w:val="false"/>
+                <w:bCs w:val="false"/>
+                <w:color w:val="1A1A1A"/>
+                <w:sz w:val="19"/>
+                <w:szCs w:val="19"/>
+              </w:rPr>
+              <w:t xml:space="preserve">There is no login, by requirement 6. A customer sitting at a table gives a first name and a table number and nothing else, so requiring the remaining fields would mean inventing data nobody entered. The columns are kept because the submitted model has them and a restaurant may later collect them.</w:t>
+            </w:r>
+          </w:p>
+        </w:tc>
+        <w:tc>
+          <w:tcPr>
+            <w:tcW w:type="dxa" w:w="1200"/>
+            <w:shd w:fill="F7F7F7" w:color="auto" w:val="clear"/>
+            <w:tcMar>
+              <w:top w:type="dxa" w:w="80"/>
+              <w:left w:type="dxa" w:w="120"/>
+              <w:bottom w:type="dxa" w:w="80"/>
+              <w:right w:type="dxa" w:w="120"/>
+            </w:tcMar>
+          </w:tcPr>
+          <w:p>
+            <w:pPr>
+              <w:spacing w:after="0" w:line="260"/>
+            </w:pPr>
+            <w:r>
+              <w:rPr>
+                <w:rFonts w:ascii="Calibri" w:cs="Calibri" w:eastAsia="Calibri" w:hAnsi="Calibri"/>
+                <w:b w:val="false"/>
+                <w:bCs w:val="false"/>
+                <w:color w:val="1A1A1A"/>
+                <w:sz w:val="19"/>
+                <w:szCs w:val="19"/>
+              </w:rPr>
+              <w:t xml:space="preserve">Confirmed</w:t>
+            </w:r>
+          </w:p>
+        </w:tc>
+      </w:tr>
+      <w:tr>
+        <w:tc>
+          <w:tcPr>
+            <w:tcW w:type="dxa" w:w="700"/>
+            <w:tcMar>
+              <w:top w:type="dxa" w:w="80"/>
+              <w:left w:type="dxa" w:w="120"/>
+              <w:bottom w:type="dxa" w:w="80"/>
+              <w:right w:type="dxa" w:w="120"/>
+            </w:tcMar>
+          </w:tcPr>
+          <w:p>
+            <w:pPr>
+              <w:spacing w:after="0" w:line="260"/>
+            </w:pPr>
+            <w:r>
+              <w:rPr>
+                <w:rFonts w:ascii="Calibri" w:cs="Calibri" w:eastAsia="Calibri" w:hAnsi="Calibri"/>
+                <w:b/>
+                <w:bCs/>
+                <w:color w:val="1A1A1A"/>
+                <w:sz w:val="19"/>
+                <w:szCs w:val="19"/>
+              </w:rPr>
+              <w:t xml:space="preserve">013</w:t>
+            </w:r>
+          </w:p>
+        </w:tc>
+        <w:tc>
+          <w:tcPr>
+            <w:tcW w:type="dxa" w:w="1100"/>
+            <w:tcMar>
+              <w:top w:type="dxa" w:w="80"/>
+              <w:left w:type="dxa" w:w="120"/>
+              <w:bottom w:type="dxa" w:w="80"/>
+              <w:right w:type="dxa" w:w="120"/>
+            </w:tcMar>
+          </w:tcPr>
+          <w:p>
+            <w:pPr>
+              <w:spacing w:after="0" w:line="260"/>
+            </w:pPr>
+            <w:r>
+              <w:rPr>
+                <w:rFonts w:ascii="Calibri" w:cs="Calibri" w:eastAsia="Calibri" w:hAnsi="Calibri"/>
+                <w:b w:val="false"/>
+                <w:bCs w:val="false"/>
+                <w:color w:val="1A1A1A"/>
+                <w:sz w:val="19"/>
+                <w:szCs w:val="19"/>
+              </w:rPr>
+              <w:t xml:space="preserve">6 Sep 2026</w:t>
+            </w:r>
+          </w:p>
+        </w:tc>
+        <w:tc>
+          <w:tcPr>
+            <w:tcW w:type="dxa" w:w="2400"/>
+            <w:tcMar>
+              <w:top w:type="dxa" w:w="80"/>
+              <w:left w:type="dxa" w:w="120"/>
+              <w:bottom w:type="dxa" w:w="80"/>
+              <w:right w:type="dxa" w:w="120"/>
+            </w:tcMar>
+          </w:tcPr>
+          <w:p>
+            <w:pPr>
+              <w:spacing w:after="0" w:line="260"/>
+            </w:pPr>
+            <w:r>
+              <w:rPr>
+                <w:rFonts w:ascii="Calibri" w:cs="Calibri" w:eastAsia="Calibri" w:hAnsi="Calibri"/>
+                <w:b w:val="false"/>
+                <w:bCs w:val="false"/>
+                <w:color w:val="1A1A1A"/>
+                <w:sz w:val="19"/>
+                <w:szCs w:val="19"/>
+              </w:rPr>
+              <w:t xml:space="preserve">Menu status becomes a boolean is_active</w:t>
+            </w:r>
+          </w:p>
+        </w:tc>
+        <w:tc>
+          <w:tcPr>
+            <w:tcW w:type="dxa" w:w="3626"/>
+            <w:tcMar>
+              <w:top w:type="dxa" w:w="80"/>
+              <w:left w:type="dxa" w:w="120"/>
+              <w:bottom w:type="dxa" w:w="80"/>
+              <w:right w:type="dxa" w:w="120"/>
+            </w:tcMar>
+          </w:tcPr>
+          <w:p>
+            <w:pPr>
+              <w:spacing w:after="0" w:line="260"/>
+            </w:pPr>
+            <w:r>
+              <w:rPr>
+                <w:rFonts w:ascii="Calibri" w:cs="Calibri" w:eastAsia="Calibri" w:hAnsi="Calibri"/>
+                <w:b w:val="false"/>
+                <w:bCs w:val="false"/>
+                <w:color w:val="1A1A1A"/>
+                <w:sz w:val="19"/>
+                <w:szCs w:val="19"/>
+              </w:rPr>
+              <w:t xml:space="preserve">The submitted model held a text status whose only observed value was “Active”. A menu is either in use or it is not, and a boolean says that exactly while making a third value impossible to enter by mistake.</w:t>
+            </w:r>
+          </w:p>
+        </w:tc>
+        <w:tc>
+          <w:tcPr>
+            <w:tcW w:type="dxa" w:w="1200"/>
+            <w:tcMar>
+              <w:top w:type="dxa" w:w="80"/>
+              <w:left w:type="dxa" w:w="120"/>
+              <w:bottom w:type="dxa" w:w="80"/>
+              <w:right w:type="dxa" w:w="120"/>
+            </w:tcMar>
+          </w:tcPr>
+          <w:p>
+            <w:pPr>
+              <w:spacing w:after="0" w:line="260"/>
+            </w:pPr>
+            <w:r>
+              <w:rPr>
+                <w:rFonts w:ascii="Calibri" w:cs="Calibri" w:eastAsia="Calibri" w:hAnsi="Calibri"/>
+                <w:b w:val="false"/>
+                <w:bCs w:val="false"/>
+                <w:color w:val="1A1A1A"/>
+                <w:sz w:val="19"/>
+                <w:szCs w:val="19"/>
+              </w:rPr>
+              <w:t xml:space="preserve">Confirmed</w:t>
+            </w:r>
+          </w:p>
+        </w:tc>
+      </w:tr>
+      <w:tr>
+        <w:tc>
+          <w:tcPr>
+            <w:tcW w:type="dxa" w:w="700"/>
+            <w:shd w:fill="F7F7F7" w:color="auto" w:val="clear"/>
+            <w:tcMar>
+              <w:top w:type="dxa" w:w="80"/>
+              <w:left w:type="dxa" w:w="120"/>
+              <w:bottom w:type="dxa" w:w="80"/>
+              <w:right w:type="dxa" w:w="120"/>
+            </w:tcMar>
+          </w:tcPr>
+          <w:p>
+            <w:pPr>
+              <w:spacing w:after="0" w:line="260"/>
+            </w:pPr>
+            <w:r>
+              <w:rPr>
+                <w:rFonts w:ascii="Calibri" w:cs="Calibri" w:eastAsia="Calibri" w:hAnsi="Calibri"/>
+                <w:b/>
+                <w:bCs/>
+                <w:color w:val="1A1A1A"/>
+                <w:sz w:val="19"/>
+                <w:szCs w:val="19"/>
+              </w:rPr>
+              <w:t xml:space="preserve">014</w:t>
+            </w:r>
+          </w:p>
+        </w:tc>
+        <w:tc>
+          <w:tcPr>
+            <w:tcW w:type="dxa" w:w="1100"/>
+            <w:shd w:fill="F7F7F7" w:color="auto" w:val="clear"/>
+            <w:tcMar>
+              <w:top w:type="dxa" w:w="80"/>
+              <w:left w:type="dxa" w:w="120"/>
+              <w:bottom w:type="dxa" w:w="80"/>
+              <w:right w:type="dxa" w:w="120"/>
+            </w:tcMar>
+          </w:tcPr>
+          <w:p>
+            <w:pPr>
+              <w:spacing w:after="0" w:line="260"/>
+            </w:pPr>
+            <w:r>
+              <w:rPr>
+                <w:rFonts w:ascii="Calibri" w:cs="Calibri" w:eastAsia="Calibri" w:hAnsi="Calibri"/>
+                <w:b w:val="false"/>
+                <w:bCs w:val="false"/>
+                <w:color w:val="1A1A1A"/>
+                <w:sz w:val="19"/>
+                <w:szCs w:val="19"/>
+              </w:rPr>
+              <w:t xml:space="preserve">6 Sep 2026</w:t>
+            </w:r>
+          </w:p>
+        </w:tc>
+        <w:tc>
+          <w:tcPr>
+            <w:tcW w:type="dxa" w:w="2400"/>
+            <w:shd w:fill="F7F7F7" w:color="auto" w:val="clear"/>
+            <w:tcMar>
+              <w:top w:type="dxa" w:w="80"/>
+              <w:left w:type="dxa" w:w="120"/>
+              <w:bottom w:type="dxa" w:w="80"/>
+              <w:right w:type="dxa" w:w="120"/>
+            </w:tcMar>
+          </w:tcPr>
+          <w:p>
+            <w:pPr>
+              <w:spacing w:after="0" w:line="260"/>
+            </w:pPr>
+            <w:r>
+              <w:rPr>
+                <w:rFonts w:ascii="Calibri" w:cs="Calibri" w:eastAsia="Calibri" w:hAnsi="Calibri"/>
+                <w:b w:val="false"/>
+                <w:bCs w:val="false"/>
+                <w:color w:val="1A1A1A"/>
+                <w:sz w:val="19"/>
+                <w:szCs w:val="19"/>
+              </w:rPr>
+              <w:t xml:space="preserve">emoji added to MenuItem</w:t>
+            </w:r>
+          </w:p>
+        </w:tc>
+        <w:tc>
+          <w:tcPr>
+            <w:tcW w:type="dxa" w:w="3626"/>
+            <w:shd w:fill="F7F7F7" w:color="auto" w:val="clear"/>
+            <w:tcMar>
+              <w:top w:type="dxa" w:w="80"/>
+              <w:left w:type="dxa" w:w="120"/>
+              <w:bottom w:type="dxa" w:w="80"/>
+              <w:right w:type="dxa" w:w="120"/>
+            </w:tcMar>
+          </w:tcPr>
+          <w:p>
+            <w:pPr>
+              <w:spacing w:after="0" w:line="260"/>
+            </w:pPr>
+            <w:r>
+              <w:rPr>
+                <w:rFonts w:ascii="Calibri" w:cs="Calibri" w:eastAsia="Calibri" w:hAnsi="Calibri"/>
+                <w:b w:val="false"/>
+                <w:bCs w:val="false"/>
+                <w:color w:val="1A1A1A"/>
+                <w:sz w:val="19"/>
+                <w:szCs w:val="19"/>
+              </w:rPr>
+              <w:t xml:space="preserve">Presentation only — a small glyph beside each dish so the menu reads as a menu rather than a table of rows. Nothing in the application depends on it, and an item without one falls back to a generic symbol. Recorded here because it is a column that does not appear in the submitted model, not because it carries any logic.</w:t>
+            </w:r>
+          </w:p>
+        </w:tc>
+        <w:tc>
+          <w:tcPr>
+            <w:tcW w:type="dxa" w:w="1200"/>
+            <w:shd w:fill="F7F7F7" w:color="auto" w:val="clear"/>
+            <w:tcMar>
+              <w:top w:type="dxa" w:w="80"/>
+              <w:left w:type="dxa" w:w="120"/>
+              <w:bottom w:type="dxa" w:w="80"/>
+              <w:right w:type="dxa" w:w="120"/>
+            </w:tcMar>
+          </w:tcPr>
+          <w:p>
+            <w:pPr>
+              <w:spacing w:after="0" w:line="260"/>
+            </w:pPr>
+            <w:r>
+              <w:rPr>
+                <w:rFonts w:ascii="Calibri" w:cs="Calibri" w:eastAsia="Calibri" w:hAnsi="Calibri"/>
+                <w:b w:val="false"/>
+                <w:bCs w:val="false"/>
+                <w:color w:val="1A1A1A"/>
+                <w:sz w:val="19"/>
+                <w:szCs w:val="19"/>
+              </w:rPr>
+              <w:t xml:space="preserve">Confirmed</w:t>
+            </w:r>
+          </w:p>
+        </w:tc>
+      </w:tr>
+      <w:tr>
+        <w:tc>
+          <w:tcPr>
+            <w:tcW w:type="dxa" w:w="700"/>
+            <w:tcMar>
+              <w:top w:type="dxa" w:w="80"/>
+              <w:left w:type="dxa" w:w="120"/>
+              <w:bottom w:type="dxa" w:w="80"/>
+              <w:right w:type="dxa" w:w="120"/>
+            </w:tcMar>
+          </w:tcPr>
+          <w:p>
+            <w:pPr>
+              <w:spacing w:after="0" w:line="260"/>
+            </w:pPr>
+            <w:r>
+              <w:rPr>
+                <w:rFonts w:ascii="Calibri" w:cs="Calibri" w:eastAsia="Calibri" w:hAnsi="Calibri"/>
+                <w:b/>
+                <w:bCs/>
+                <w:color w:val="1A1A1A"/>
+                <w:sz w:val="19"/>
+                <w:szCs w:val="19"/>
+              </w:rPr>
+              <w:t xml:space="preserve">015</w:t>
+            </w:r>
+          </w:p>
+        </w:tc>
+        <w:tc>
+          <w:tcPr>
+            <w:tcW w:type="dxa" w:w="1100"/>
+            <w:tcMar>
+              <w:top w:type="dxa" w:w="80"/>
+              <w:left w:type="dxa" w:w="120"/>
+              <w:bottom w:type="dxa" w:w="80"/>
+              <w:right w:type="dxa" w:w="120"/>
+            </w:tcMar>
+          </w:tcPr>
+          <w:p>
+            <w:pPr>
+              <w:spacing w:after="0" w:line="260"/>
+            </w:pPr>
+            <w:r>
+              <w:rPr>
+                <w:rFonts w:ascii="Calibri" w:cs="Calibri" w:eastAsia="Calibri" w:hAnsi="Calibri"/>
+                <w:b w:val="false"/>
+                <w:bCs w:val="false"/>
+                <w:color w:val="1A1A1A"/>
+                <w:sz w:val="19"/>
+                <w:szCs w:val="19"/>
+              </w:rPr>
+              <w:t xml:space="preserve">6 Sep 2026</w:t>
+            </w:r>
+          </w:p>
+        </w:tc>
+        <w:tc>
+          <w:tcPr>
+            <w:tcW w:type="dxa" w:w="2400"/>
+            <w:tcMar>
+              <w:top w:type="dxa" w:w="80"/>
+              <w:left w:type="dxa" w:w="120"/>
+              <w:bottom w:type="dxa" w:w="80"/>
+              <w:right w:type="dxa" w:w="120"/>
+            </w:tcMar>
+          </w:tcPr>
+          <w:p>
+            <w:pPr>
+              <w:spacing w:after="0" w:line="260"/>
+            </w:pPr>
+            <w:r>
+              <w:rPr>
+                <w:rFonts w:ascii="Calibri" w:cs="Calibri" w:eastAsia="Calibri" w:hAnsi="Calibri"/>
+                <w:b w:val="false"/>
+                <w:bCs w:val="false"/>
+                <w:color w:val="1A1A1A"/>
+                <w:sz w:val="19"/>
+                <w:szCs w:val="19"/>
+              </w:rPr>
+              <w:t xml:space="preserve">reference added to CustomerOrder, e.g. “ORD047”</w:t>
+            </w:r>
+          </w:p>
+        </w:tc>
+        <w:tc>
+          <w:tcPr>
+            <w:tcW w:type="dxa" w:w="3626"/>
+            <w:tcMar>
+              <w:top w:type="dxa" w:w="80"/>
+              <w:left w:type="dxa" w:w="120"/>
+              <w:bottom w:type="dxa" w:w="80"/>
+              <w:right w:type="dxa" w:w="120"/>
+            </w:tcMar>
+          </w:tcPr>
+          <w:p>
+            <w:pPr>
+              <w:spacing w:after="0" w:line="260"/>
+            </w:pPr>
+            <w:r>
+              <w:rPr>
+                <w:rFonts w:ascii="Calibri" w:cs="Calibri" w:eastAsia="Calibri" w:hAnsi="Calibri"/>
+                <w:b w:val="false"/>
+                <w:bCs w:val="false"/>
+                <w:color w:val="1A1A1A"/>
+                <w:sz w:val="19"/>
+                <w:szCs w:val="19"/>
+              </w:rPr>
+              <w:t xml:space="preserve">The primary key is a cuid — a long random string nobody can read back across a noisy dining room. A short unique reference is what the customer sees on screen and what the waiter uses to identify the order out loud, and it can be looked up directly, so the customer's own order page has a shareable address.</w:t>
+            </w:r>
+          </w:p>
+        </w:tc>
+        <w:tc>
+          <w:tcPr>
+            <w:tcW w:type="dxa" w:w="1200"/>
+            <w:tcMar>
+              <w:top w:type="dxa" w:w="80"/>
+              <w:left w:type="dxa" w:w="120"/>
+              <w:bottom w:type="dxa" w:w="80"/>
+              <w:right w:type="dxa" w:w="120"/>
+            </w:tcMar>
+          </w:tcPr>
+          <w:p>
+            <w:pPr>
+              <w:spacing w:after="0" w:line="260"/>
+            </w:pPr>
+            <w:r>
+              <w:rPr>
+                <w:rFonts w:ascii="Calibri" w:cs="Calibri" w:eastAsia="Calibri" w:hAnsi="Calibri"/>
+                <w:b w:val="false"/>
+                <w:bCs w:val="false"/>
+                <w:color w:val="1A1A1A"/>
+                <w:sz w:val="19"/>
+                <w:szCs w:val="19"/>
+              </w:rPr>
+              <w:t xml:space="preserve">Confirmed</w:t>
+            </w:r>
+          </w:p>
+        </w:tc>
+      </w:tr>
+      <w:tr>
+        <w:tc>
+          <w:tcPr>
+            <w:tcW w:type="dxa" w:w="700"/>
+            <w:shd w:fill="F7F7F7" w:color="auto" w:val="clear"/>
+            <w:tcMar>
+              <w:top w:type="dxa" w:w="80"/>
+              <w:left w:type="dxa" w:w="120"/>
+              <w:bottom w:type="dxa" w:w="80"/>
+              <w:right w:type="dxa" w:w="120"/>
+            </w:tcMar>
+          </w:tcPr>
+          <w:p>
+            <w:pPr>
+              <w:spacing w:after="0" w:line="260"/>
+            </w:pPr>
+            <w:r>
+              <w:rPr>
+                <w:rFonts w:ascii="Calibri" w:cs="Calibri" w:eastAsia="Calibri" w:hAnsi="Calibri"/>
+                <w:b/>
+                <w:bCs/>
+                <w:color w:val="1A1A1A"/>
+                <w:sz w:val="19"/>
+                <w:szCs w:val="19"/>
+              </w:rPr>
+              <w:t xml:space="preserve">016</w:t>
+            </w:r>
+          </w:p>
+        </w:tc>
+        <w:tc>
+          <w:tcPr>
+            <w:tcW w:type="dxa" w:w="1100"/>
+            <w:shd w:fill="F7F7F7" w:color="auto" w:val="clear"/>
+            <w:tcMar>
+              <w:top w:type="dxa" w:w="80"/>
+              <w:left w:type="dxa" w:w="120"/>
+              <w:bottom w:type="dxa" w:w="80"/>
+              <w:right w:type="dxa" w:w="120"/>
+            </w:tcMar>
+          </w:tcPr>
+          <w:p>
+            <w:pPr>
+              <w:spacing w:after="0" w:line="260"/>
+            </w:pPr>
+            <w:r>
+              <w:rPr>
+                <w:rFonts w:ascii="Calibri" w:cs="Calibri" w:eastAsia="Calibri" w:hAnsi="Calibri"/>
+                <w:b w:val="false"/>
+                <w:bCs w:val="false"/>
+                <w:color w:val="1A1A1A"/>
+                <w:sz w:val="19"/>
+                <w:szCs w:val="19"/>
+              </w:rPr>
+              <w:t xml:space="preserve">6 Sep 2026</w:t>
+            </w:r>
+          </w:p>
+        </w:tc>
+        <w:tc>
+          <w:tcPr>
+            <w:tcW w:type="dxa" w:w="2400"/>
+            <w:shd w:fill="F7F7F7" w:color="auto" w:val="clear"/>
+            <w:tcMar>
+              <w:top w:type="dxa" w:w="80"/>
+              <w:left w:type="dxa" w:w="120"/>
+              <w:bottom w:type="dxa" w:w="80"/>
+              <w:right w:type="dxa" w:w="120"/>
+            </w:tcMar>
+          </w:tcPr>
+          <w:p>
+            <w:pPr>
+              <w:spacing w:after="0" w:line="260"/>
+            </w:pPr>
+            <w:r>
+              <w:rPr>
+                <w:rFonts w:ascii="Calibri" w:cs="Calibri" w:eastAsia="Calibri" w:hAnsi="Calibri"/>
+                <w:b w:val="false"/>
+                <w:bCs w:val="false"/>
+                <w:color w:val="1A1A1A"/>
+                <w:sz w:val="19"/>
+                <w:szCs w:val="19"/>
+              </w:rPr>
+              <w:t xml:space="preserve">Connection URLs moved out of schema.prisma into prisma.config.ts; the application connects through a driver adapter</w:t>
+            </w:r>
+          </w:p>
+        </w:tc>
+        <w:tc>
+          <w:tcPr>
+            <w:tcW w:type="dxa" w:w="3626"/>
+            <w:shd w:fill="F7F7F7" w:color="auto" w:val="clear"/>
+            <w:tcMar>
+              <w:top w:type="dxa" w:w="80"/>
+              <w:left w:type="dxa" w:w="120"/>
+              <w:bottom w:type="dxa" w:w="80"/>
+              <w:right w:type="dxa" w:w="120"/>
+            </w:tcMar>
+          </w:tcPr>
+          <w:p>
+            <w:pPr>
+              <w:spacing w:after="0" w:line="260"/>
+            </w:pPr>
+            <w:r>
+              <w:rPr>
+                <w:rFonts w:ascii="Calibri" w:cs="Calibri" w:eastAsia="Calibri" w:hAnsi="Calibri"/>
+                <w:b w:val="false"/>
+                <w:bCs w:val="false"/>
+                <w:color w:val="1A1A1A"/>
+                <w:sz w:val="19"/>
+                <w:szCs w:val="19"/>
+              </w:rPr>
+              <w:t xml:space="preserve">Forced by the tool, not chosen. Prisma 7 no longer accepts url and directUrl inside the datasource block, no longer loads .env automatically, and requires a driver adapter at runtime — here @prisma/adapter-neon over Neon's serverless driver. The migration URL now lives in prisma.config.ts and the running application builds its own connection. Section 5 records that this was reached by correcting advice that described the previous major version.</w:t>
+            </w:r>
+          </w:p>
+        </w:tc>
+        <w:tc>
+          <w:tcPr>
+            <w:tcW w:type="dxa" w:w="1200"/>
+            <w:shd w:fill="F7F7F7" w:color="auto" w:val="clear"/>
+            <w:tcMar>
+              <w:top w:type="dxa" w:w="80"/>
+              <w:left w:type="dxa" w:w="120"/>
+              <w:bottom w:type="dxa" w:w="80"/>
+              <w:right w:type="dxa" w:w="120"/>
+            </w:tcMar>
+          </w:tcPr>
+          <w:p>
+            <w:pPr>
+              <w:spacing w:after="0" w:line="260"/>
+            </w:pPr>
+            <w:r>
+              <w:rPr>
+                <w:rFonts w:ascii="Calibri" w:cs="Calibri" w:eastAsia="Calibri" w:hAnsi="Calibri"/>
+                <w:b w:val="false"/>
+                <w:bCs w:val="false"/>
+                <w:color w:val="1A1A1A"/>
+                <w:sz w:val="19"/>
+                <w:szCs w:val="19"/>
+              </w:rPr>
+              <w:t xml:space="preserve">Confirmed</w:t>
+            </w:r>
+          </w:p>
+        </w:tc>
+      </w:tr>
+      <w:tr>
+        <w:tc>
+          <w:tcPr>
+            <w:tcW w:type="dxa" w:w="700"/>
+            <w:tcMar>
+              <w:top w:type="dxa" w:w="80"/>
+              <w:left w:type="dxa" w:w="120"/>
+              <w:bottom w:type="dxa" w:w="80"/>
+              <w:right w:type="dxa" w:w="120"/>
+            </w:tcMar>
+          </w:tcPr>
+          <w:p>
+            <w:pPr>
+              <w:spacing w:after="0" w:line="260"/>
+            </w:pPr>
+            <w:r>
+              <w:rPr>
+                <w:rFonts w:ascii="Calibri" w:cs="Calibri" w:eastAsia="Calibri" w:hAnsi="Calibri"/>
+                <w:b/>
+                <w:bCs/>
+                <w:color w:val="1A1A1A"/>
+                <w:sz w:val="19"/>
+                <w:szCs w:val="19"/>
+              </w:rPr>
+              <w:t xml:space="preserve">017</w:t>
+            </w:r>
+          </w:p>
+        </w:tc>
+        <w:tc>
+          <w:tcPr>
+            <w:tcW w:type="dxa" w:w="1100"/>
+            <w:tcMar>
+              <w:top w:type="dxa" w:w="80"/>
+              <w:left w:type="dxa" w:w="120"/>
+              <w:bottom w:type="dxa" w:w="80"/>
+              <w:right w:type="dxa" w:w="120"/>
+            </w:tcMar>
+          </w:tcPr>
+          <w:p>
+            <w:pPr>
+              <w:spacing w:after="0" w:line="260"/>
+            </w:pPr>
+            <w:r>
+              <w:rPr>
+                <w:rFonts w:ascii="Calibri" w:cs="Calibri" w:eastAsia="Calibri" w:hAnsi="Calibri"/>
+                <w:b w:val="false"/>
+                <w:bCs w:val="false"/>
+                <w:color w:val="1A1A1A"/>
+                <w:sz w:val="19"/>
+                <w:szCs w:val="19"/>
+              </w:rPr>
+              <w:t xml:space="preserve">6 Sep 2026</w:t>
+            </w:r>
+          </w:p>
+        </w:tc>
+        <w:tc>
+          <w:tcPr>
+            <w:tcW w:type="dxa" w:w="2400"/>
+            <w:tcMar>
+              <w:top w:type="dxa" w:w="80"/>
+              <w:left w:type="dxa" w:w="120"/>
+              <w:bottom w:type="dxa" w:w="80"/>
+              <w:right w:type="dxa" w:w="120"/>
+            </w:tcMar>
+          </w:tcPr>
+          <w:p>
+            <w:pPr>
+              <w:spacing w:after="0" w:line="260"/>
+            </w:pPr>
+            <w:r>
+              <w:rPr>
+                <w:rFonts w:ascii="Calibri" w:cs="Calibri" w:eastAsia="Calibri" w:hAnsi="Calibri"/>
+                <w:b w:val="false"/>
+                <w:bCs w:val="false"/>
+                <w:color w:val="1A1A1A"/>
+                <w:sz w:val="19"/>
+                <w:szCs w:val="19"/>
+              </w:rPr>
+              <w:t xml:space="preserve">The session remembers a restaurant per role, not one restaurant overall</w:t>
+            </w:r>
+          </w:p>
+        </w:tc>
+        <w:tc>
+          <w:tcPr>
+            <w:tcW w:type="dxa" w:w="3626"/>
+            <w:tcMar>
+              <w:top w:type="dxa" w:w="80"/>
+              <w:left w:type="dxa" w:w="120"/>
+              <w:bottom w:type="dxa" w:w="80"/>
+              <w:right w:type="dxa" w:w="120"/>
+            </w:tcMar>
+          </w:tcPr>
+          <w:p>
+            <w:pPr>
+              <w:spacing w:after="0" w:line="260"/>
+            </w:pPr>
+            <w:r>
+              <w:rPr>
+                <w:rFonts w:ascii="Calibri" w:cs="Calibri" w:eastAsia="Calibri" w:hAnsi="Calibri"/>
+                <w:b w:val="false"/>
+                <w:bCs w:val="false"/>
+                <w:color w:val="1A1A1A"/>
+                <w:sz w:val="19"/>
+                <w:szCs w:val="19"/>
+              </w:rPr>
+              <w:t xml:space="preserve">My own requirement, from a case the first design could not answer: I might be a customer with a table at Mood Lagos and also work as a waiter at Terra Kulture, and switching roles should not throw away either. The session therefore holds the customer's restaurant and table alongside the waiter's restaurant independently, so moving the waiter somewhere else leaves my table where it is.</w:t>
+            </w:r>
+          </w:p>
+        </w:tc>
+        <w:tc>
+          <w:tcPr>
+            <w:tcW w:type="dxa" w:w="1200"/>
+            <w:tcMar>
+              <w:top w:type="dxa" w:w="80"/>
+              <w:left w:type="dxa" w:w="120"/>
+              <w:bottom w:type="dxa" w:w="80"/>
+              <w:right w:type="dxa" w:w="120"/>
+            </w:tcMar>
+          </w:tcPr>
+          <w:p>
+            <w:pPr>
+              <w:spacing w:after="0" w:line="260"/>
+            </w:pPr>
+            <w:r>
+              <w:rPr>
+                <w:rFonts w:ascii="Calibri" w:cs="Calibri" w:eastAsia="Calibri" w:hAnsi="Calibri"/>
+                <w:b w:val="false"/>
+                <w:bCs w:val="false"/>
+                <w:color w:val="1A1A1A"/>
+                <w:sz w:val="19"/>
+                <w:szCs w:val="19"/>
+              </w:rPr>
+              <w:t xml:space="preserve">Confirmed</w:t>
+            </w:r>
+          </w:p>
+        </w:tc>
+      </w:tr>
+      <w:tr>
+        <w:tc>
+          <w:tcPr>
+            <w:tcW w:type="dxa" w:w="700"/>
+            <w:shd w:fill="F7F7F7" w:color="auto" w:val="clear"/>
+            <w:tcMar>
+              <w:top w:type="dxa" w:w="80"/>
+              <w:left w:type="dxa" w:w="120"/>
+              <w:bottom w:type="dxa" w:w="80"/>
+              <w:right w:type="dxa" w:w="120"/>
+            </w:tcMar>
+          </w:tcPr>
+          <w:p>
+            <w:pPr>
+              <w:spacing w:after="0" w:line="260"/>
+            </w:pPr>
+            <w:r>
+              <w:rPr>
+                <w:rFonts w:ascii="Calibri" w:cs="Calibri" w:eastAsia="Calibri" w:hAnsi="Calibri"/>
+                <w:b/>
+                <w:bCs/>
+                <w:color w:val="1A1A1A"/>
+                <w:sz w:val="19"/>
+                <w:szCs w:val="19"/>
+              </w:rPr>
+              <w:t xml:space="preserve">018</w:t>
+            </w:r>
+          </w:p>
+        </w:tc>
+        <w:tc>
+          <w:tcPr>
+            <w:tcW w:type="dxa" w:w="1100"/>
+            <w:shd w:fill="F7F7F7" w:color="auto" w:val="clear"/>
+            <w:tcMar>
+              <w:top w:type="dxa" w:w="80"/>
+              <w:left w:type="dxa" w:w="120"/>
+              <w:bottom w:type="dxa" w:w="80"/>
+              <w:right w:type="dxa" w:w="120"/>
+            </w:tcMar>
+          </w:tcPr>
+          <w:p>
+            <w:pPr>
+              <w:spacing w:after="0" w:line="260"/>
+            </w:pPr>
+            <w:r>
+              <w:rPr>
+                <w:rFonts w:ascii="Calibri" w:cs="Calibri" w:eastAsia="Calibri" w:hAnsi="Calibri"/>
+                <w:b w:val="false"/>
+                <w:bCs w:val="false"/>
+                <w:color w:val="1A1A1A"/>
+                <w:sz w:val="19"/>
+                <w:szCs w:val="19"/>
+              </w:rPr>
+              <w:t xml:space="preserve">6 Sep 2026</w:t>
+            </w:r>
+          </w:p>
+        </w:tc>
+        <w:tc>
+          <w:tcPr>
+            <w:tcW w:type="dxa" w:w="2400"/>
+            <w:shd w:fill="F7F7F7" w:color="auto" w:val="clear"/>
+            <w:tcMar>
+              <w:top w:type="dxa" w:w="80"/>
+              <w:left w:type="dxa" w:w="120"/>
+              <w:bottom w:type="dxa" w:w="80"/>
+              <w:right w:type="dxa" w:w="120"/>
+            </w:tcMar>
+          </w:tcPr>
+          <w:p>
+            <w:pPr>
+              <w:spacing w:after="0" w:line="260"/>
+            </w:pPr>
+            <w:r>
+              <w:rPr>
+                <w:rFonts w:ascii="Calibri" w:cs="Calibri" w:eastAsia="Calibri" w:hAnsi="Calibri"/>
+                <w:b w:val="false"/>
+                <w:bCs w:val="false"/>
+                <w:color w:val="1A1A1A"/>
+                <w:sz w:val="19"/>
+                <w:szCs w:val="19"/>
+              </w:rPr>
+              <w:t xml:space="preserve">Waiting time is the slowest item plus a small allowance per extra portion, not the sum of every item</w:t>
+            </w:r>
+          </w:p>
+        </w:tc>
+        <w:tc>
+          <w:tcPr>
+            <w:tcW w:type="dxa" w:w="3626"/>
+            <w:shd w:fill="F7F7F7" w:color="auto" w:val="clear"/>
+            <w:tcMar>
+              <w:top w:type="dxa" w:w="80"/>
+              <w:left w:type="dxa" w:w="120"/>
+              <w:bottom w:type="dxa" w:w="80"/>
+              <w:right w:type="dxa" w:w="120"/>
+            </w:tcMar>
+          </w:tcPr>
+          <w:p>
+            <w:pPr>
+              <w:spacing w:after="0" w:line="260"/>
+            </w:pPr>
+            <w:r>
+              <w:rPr>
+                <w:rFonts w:ascii="Calibri" w:cs="Calibri" w:eastAsia="Calibri" w:hAnsi="Calibri"/>
+                <w:b w:val="false"/>
+                <w:bCs w:val="false"/>
+                <w:color w:val="1A1A1A"/>
+                <w:sz w:val="19"/>
+                <w:szCs w:val="19"/>
+              </w:rPr>
+              <w:t xml:space="preserve">The first version added every preparation time together and quoted 116 minutes for an ordinary table's order, which is wrong in a way arithmetic checks could not catch — the sums were correct, the model of the kitchen was not. A kitchen cooks several dishes at once, and the kitchen and the bar work in parallel. The estimate is now the slowest food item plus three minutes for each additional food portion, against the slowest drink plus two minutes for each additional drink, whichever of the two is longer. The same order now quotes 42 minutes, and across the seeded data the range is 6 to 55 minutes with an average of 25.</w:t>
+            </w:r>
+          </w:p>
+        </w:tc>
+        <w:tc>
+          <w:tcPr>
+            <w:tcW w:type="dxa" w:w="1200"/>
+            <w:shd w:fill="F7F7F7" w:color="auto" w:val="clear"/>
+            <w:tcMar>
+              <w:top w:type="dxa" w:w="80"/>
+              <w:left w:type="dxa" w:w="120"/>
+              <w:bottom w:type="dxa" w:w="80"/>
+              <w:right w:type="dxa" w:w="120"/>
+            </w:tcMar>
+          </w:tcPr>
+          <w:p>
+            <w:pPr>
+              <w:spacing w:after="0" w:line="260"/>
+            </w:pPr>
+            <w:r>
+              <w:rPr>
+                <w:rFonts w:ascii="Calibri" w:cs="Calibri" w:eastAsia="Calibri" w:hAnsi="Calibri"/>
+                <w:b w:val="false"/>
+                <w:bCs w:val="false"/>
+                <w:color w:val="1A1A1A"/>
+                <w:sz w:val="19"/>
+                <w:szCs w:val="19"/>
+              </w:rPr>
+              <w:t xml:space="preserve">Confirmed</w:t>
+            </w:r>
+          </w:p>
+        </w:tc>
+      </w:tr>
+      <w:tr>
+        <w:tc>
+          <w:tcPr>
+            <w:tcW w:type="dxa" w:w="700"/>
+            <w:tcMar>
+              <w:top w:type="dxa" w:w="80"/>
+              <w:left w:type="dxa" w:w="120"/>
+              <w:bottom w:type="dxa" w:w="80"/>
+              <w:right w:type="dxa" w:w="120"/>
+            </w:tcMar>
+          </w:tcPr>
+          <w:p>
+            <w:pPr>
+              <w:spacing w:after="0" w:line="260"/>
+            </w:pPr>
+            <w:r>
+              <w:rPr>
+                <w:rFonts w:ascii="Calibri" w:cs="Calibri" w:eastAsia="Calibri" w:hAnsi="Calibri"/>
+                <w:b/>
+                <w:bCs/>
+                <w:color w:val="1A1A1A"/>
+                <w:sz w:val="19"/>
+                <w:szCs w:val="19"/>
+              </w:rPr>
+              <w:t xml:space="preserve">019</w:t>
+            </w:r>
+          </w:p>
+        </w:tc>
+        <w:tc>
+          <w:tcPr>
+            <w:tcW w:type="dxa" w:w="1100"/>
+            <w:tcMar>
+              <w:top w:type="dxa" w:w="80"/>
+              <w:left w:type="dxa" w:w="120"/>
+              <w:bottom w:type="dxa" w:w="80"/>
+              <w:right w:type="dxa" w:w="120"/>
+            </w:tcMar>
+          </w:tcPr>
+          <w:p>
+            <w:pPr>
+              <w:spacing w:after="0" w:line="260"/>
+            </w:pPr>
+            <w:r>
+              <w:rPr>
+                <w:rFonts w:ascii="Calibri" w:cs="Calibri" w:eastAsia="Calibri" w:hAnsi="Calibri"/>
+                <w:b w:val="false"/>
+                <w:bCs w:val="false"/>
+                <w:color w:val="1A1A1A"/>
+                <w:sz w:val="19"/>
+                <w:szCs w:val="19"/>
+              </w:rPr>
+              <w:t xml:space="preserve">6 Sep 2026</w:t>
+            </w:r>
+          </w:p>
+        </w:tc>
+        <w:tc>
+          <w:tcPr>
+            <w:tcW w:type="dxa" w:w="2400"/>
+            <w:tcMar>
+              <w:top w:type="dxa" w:w="80"/>
+              <w:left w:type="dxa" w:w="120"/>
+              <w:bottom w:type="dxa" w:w="80"/>
+              <w:right w:type="dxa" w:w="120"/>
+            </w:tcMar>
+          </w:tcPr>
+          <w:p>
+            <w:pPr>
+              <w:spacing w:after="0" w:line="260"/>
+            </w:pPr>
+            <w:r>
+              <w:rPr>
+                <w:rFonts w:ascii="Calibri" w:cs="Calibri" w:eastAsia="Calibri" w:hAnsi="Calibri"/>
+                <w:b w:val="false"/>
+                <w:bCs w:val="false"/>
+                <w:color w:val="1A1A1A"/>
+                <w:sz w:val="19"/>
+                <w:szCs w:val="19"/>
+              </w:rPr>
+              <w:t xml:space="preserve">Changing restaurant returns the customer to the entry screen and empties the basket</w:t>
+            </w:r>
+          </w:p>
+        </w:tc>
+        <w:tc>
+          <w:tcPr>
+            <w:tcW w:type="dxa" w:w="3626"/>
+            <w:tcMar>
+              <w:top w:type="dxa" w:w="80"/>
+              <w:left w:type="dxa" w:w="120"/>
+              <w:bottom w:type="dxa" w:w="80"/>
+              <w:right w:type="dxa" w:w="120"/>
+            </w:tcMar>
+          </w:tcPr>
+          <w:p>
+            <w:pPr>
+              <w:spacing w:after="0" w:line="260"/>
+            </w:pPr>
+            <w:r>
+              <w:rPr>
+                <w:rFonts w:ascii="Calibri" w:cs="Calibri" w:eastAsia="Calibri" w:hAnsi="Calibri"/>
+                <w:b w:val="false"/>
+                <w:bCs w:val="false"/>
+                <w:color w:val="1A1A1A"/>
+                <w:sz w:val="19"/>
+                <w:szCs w:val="19"/>
+              </w:rPr>
+              <w:t xml:space="preserve">A defect found in testing, recorded because the brief asks for an honest history. Switching restaurant cleared the table number but left the customer inside a menu they could no longer order from, and the failure surfaced as a raw validation message — “expected number, received null”. A customer at a new restaurant is at a new table, so they now return to the entry screen to be seated, with that restaurant already selected. The basket goes with them: it held another kitchen's dishes, which this one cannot cook. Any basket whose restaurant no longer matches the session is treated as empty.</w:t>
+            </w:r>
+          </w:p>
+        </w:tc>
+        <w:tc>
+          <w:tcPr>
+            <w:tcW w:type="dxa" w:w="1200"/>
+            <w:tcMar>
+              <w:top w:type="dxa" w:w="80"/>
+              <w:left w:type="dxa" w:w="120"/>
+              <w:bottom w:type="dxa" w:w="80"/>
+              <w:right w:type="dxa" w:w="120"/>
+            </w:tcMar>
+          </w:tcPr>
+          <w:p>
+            <w:pPr>
+              <w:spacing w:after="0" w:line="260"/>
+            </w:pPr>
+            <w:r>
+              <w:rPr>
+                <w:rFonts w:ascii="Calibri" w:cs="Calibri" w:eastAsia="Calibri" w:hAnsi="Calibri"/>
+                <w:b w:val="false"/>
+                <w:bCs w:val="false"/>
+                <w:color w:val="1A1A1A"/>
+                <w:sz w:val="19"/>
+                <w:szCs w:val="19"/>
+              </w:rPr>
+              <w:t xml:space="preserve">Confirmed</w:t>
             </w:r>
           </w:p>
         </w:tc>
@@ -5691,6 +7643,422 @@
                 <w:szCs w:val="19"/>
               </w:rPr>
               <w:t xml:space="preserve">The suggested reasons were reasonable but were not mine. I supplied my own — the Render comparison and wanting to learn Prisma — and only those were written up.</w:t>
+            </w:r>
+          </w:p>
+        </w:tc>
+      </w:tr>
+      <w:tr>
+        <w:tc>
+          <w:tcPr>
+            <w:tcW w:type="dxa" w:w="1100"/>
+            <w:tcMar>
+              <w:top w:type="dxa" w:w="80"/>
+              <w:left w:type="dxa" w:w="120"/>
+              <w:bottom w:type="dxa" w:w="80"/>
+              <w:right w:type="dxa" w:w="120"/>
+            </w:tcMar>
+          </w:tcPr>
+          <w:p>
+            <w:pPr>
+              <w:spacing w:after="0" w:line="260"/>
+            </w:pPr>
+            <w:r>
+              <w:rPr>
+                <w:rFonts w:ascii="Calibri" w:cs="Calibri" w:eastAsia="Calibri" w:hAnsi="Calibri"/>
+                <w:b w:val="false"/>
+                <w:bCs w:val="false"/>
+                <w:color w:val="1A1A1A"/>
+                <w:sz w:val="19"/>
+                <w:szCs w:val="19"/>
+              </w:rPr>
+              <w:t xml:space="preserve">6 Sep 2026</w:t>
+            </w:r>
+          </w:p>
+        </w:tc>
+        <w:tc>
+          <w:tcPr>
+            <w:tcW w:type="dxa" w:w="1500"/>
+            <w:tcMar>
+              <w:top w:type="dxa" w:w="80"/>
+              <w:left w:type="dxa" w:w="120"/>
+              <w:bottom w:type="dxa" w:w="80"/>
+              <w:right w:type="dxa" w:w="120"/>
+            </w:tcMar>
+          </w:tcPr>
+          <w:p>
+            <w:pPr>
+              <w:spacing w:after="0" w:line="260"/>
+            </w:pPr>
+            <w:r>
+              <w:rPr>
+                <w:rFonts w:ascii="Calibri" w:cs="Calibri" w:eastAsia="Calibri" w:hAnsi="Calibri"/>
+                <w:b w:val="false"/>
+                <w:bCs w:val="false"/>
+                <w:color w:val="1A1A1A"/>
+                <w:sz w:val="19"/>
+                <w:szCs w:val="19"/>
+              </w:rPr>
+              <w:t xml:space="preserve">Claude Code (Opus)</w:t>
+            </w:r>
+          </w:p>
+        </w:tc>
+        <w:tc>
+          <w:tcPr>
+            <w:tcW w:type="dxa" w:w="3126"/>
+            <w:tcMar>
+              <w:top w:type="dxa" w:w="80"/>
+              <w:left w:type="dxa" w:w="120"/>
+              <w:bottom w:type="dxa" w:w="80"/>
+              <w:right w:type="dxa" w:w="120"/>
+            </w:tcMar>
+          </w:tcPr>
+          <w:p>
+            <w:pPr>
+              <w:spacing w:after="0" w:line="260"/>
+            </w:pPr>
+            <w:r>
+              <w:rPr>
+                <w:rFonts w:ascii="Calibri" w:cs="Calibri" w:eastAsia="Calibri" w:hAnsi="Calibri"/>
+                <w:b w:val="false"/>
+                <w:bCs w:val="false"/>
+                <w:color w:val="1A1A1A"/>
+                <w:sz w:val="19"/>
+                <w:szCs w:val="19"/>
+              </w:rPr>
+              <w:t xml:space="preserve">Set up Prisma against the Neon database</w:t>
+            </w:r>
+          </w:p>
+        </w:tc>
+        <w:tc>
+          <w:tcPr>
+            <w:tcW w:type="dxa" w:w="1400"/>
+            <w:tcMar>
+              <w:top w:type="dxa" w:w="80"/>
+              <w:left w:type="dxa" w:w="120"/>
+              <w:bottom w:type="dxa" w:w="80"/>
+              <w:right w:type="dxa" w:w="120"/>
+            </w:tcMar>
+          </w:tcPr>
+          <w:p>
+            <w:pPr>
+              <w:spacing w:after="0" w:line="260"/>
+            </w:pPr>
+            <w:r>
+              <w:rPr>
+                <w:rFonts w:ascii="Calibri" w:cs="Calibri" w:eastAsia="Calibri" w:hAnsi="Calibri"/>
+                <w:b w:val="false"/>
+                <w:bCs w:val="false"/>
+                <w:color w:val="1A1A1A"/>
+                <w:sz w:val="19"/>
+                <w:szCs w:val="19"/>
+              </w:rPr>
+              <w:t xml:space="preserve">Incorrect; corrected against the documentation</w:t>
+            </w:r>
+          </w:p>
+        </w:tc>
+        <w:tc>
+          <w:tcPr>
+            <w:tcW w:type="dxa" w:w="1900"/>
+            <w:tcMar>
+              <w:top w:type="dxa" w:w="80"/>
+              <w:left w:type="dxa" w:w="120"/>
+              <w:bottom w:type="dxa" w:w="80"/>
+              <w:right w:type="dxa" w:w="120"/>
+            </w:tcMar>
+          </w:tcPr>
+          <w:p>
+            <w:pPr>
+              <w:spacing w:after="0" w:line="260"/>
+            </w:pPr>
+            <w:r>
+              <w:rPr>
+                <w:rFonts w:ascii="Calibri" w:cs="Calibri" w:eastAsia="Calibri" w:hAnsi="Calibri"/>
+                <w:b w:val="false"/>
+                <w:bCs w:val="false"/>
+                <w:color w:val="1A1A1A"/>
+                <w:sz w:val="19"/>
+                <w:szCs w:val="19"/>
+              </w:rPr>
+              <w:t xml:space="preserve">The setup steps given described Prisma 6. Prisma 7 rejected the schema outright (error P1012) because connection URLs are no longer allowed in the datasource block, and it no longer reads .env by itself. The error was the first sign that the guidance was out of date; the installed package's own documentation settled it. Became change 016.</w:t>
+            </w:r>
+          </w:p>
+        </w:tc>
+      </w:tr>
+      <w:tr>
+        <w:tc>
+          <w:tcPr>
+            <w:tcW w:type="dxa" w:w="1100"/>
+            <w:shd w:fill="F7F7F7" w:color="auto" w:val="clear"/>
+            <w:tcMar>
+              <w:top w:type="dxa" w:w="80"/>
+              <w:left w:type="dxa" w:w="120"/>
+              <w:bottom w:type="dxa" w:w="80"/>
+              <w:right w:type="dxa" w:w="120"/>
+            </w:tcMar>
+          </w:tcPr>
+          <w:p>
+            <w:pPr>
+              <w:spacing w:after="0" w:line="260"/>
+            </w:pPr>
+            <w:r>
+              <w:rPr>
+                <w:rFonts w:ascii="Calibri" w:cs="Calibri" w:eastAsia="Calibri" w:hAnsi="Calibri"/>
+                <w:b w:val="false"/>
+                <w:bCs w:val="false"/>
+                <w:color w:val="1A1A1A"/>
+                <w:sz w:val="19"/>
+                <w:szCs w:val="19"/>
+              </w:rPr>
+              <w:t xml:space="preserve">6 Sep 2026</w:t>
+            </w:r>
+          </w:p>
+        </w:tc>
+        <w:tc>
+          <w:tcPr>
+            <w:tcW w:type="dxa" w:w="1500"/>
+            <w:shd w:fill="F7F7F7" w:color="auto" w:val="clear"/>
+            <w:tcMar>
+              <w:top w:type="dxa" w:w="80"/>
+              <w:left w:type="dxa" w:w="120"/>
+              <w:bottom w:type="dxa" w:w="80"/>
+              <w:right w:type="dxa" w:w="120"/>
+            </w:tcMar>
+          </w:tcPr>
+          <w:p>
+            <w:pPr>
+              <w:spacing w:after="0" w:line="260"/>
+            </w:pPr>
+            <w:r>
+              <w:rPr>
+                <w:rFonts w:ascii="Calibri" w:cs="Calibri" w:eastAsia="Calibri" w:hAnsi="Calibri"/>
+                <w:b w:val="false"/>
+                <w:bCs w:val="false"/>
+                <w:color w:val="1A1A1A"/>
+                <w:sz w:val="19"/>
+                <w:szCs w:val="19"/>
+              </w:rPr>
+              <w:t xml:space="preserve">Claude Code (Opus)</w:t>
+            </w:r>
+          </w:p>
+        </w:tc>
+        <w:tc>
+          <w:tcPr>
+            <w:tcW w:type="dxa" w:w="3126"/>
+            <w:shd w:fill="F7F7F7" w:color="auto" w:val="clear"/>
+            <w:tcMar>
+              <w:top w:type="dxa" w:w="80"/>
+              <w:left w:type="dxa" w:w="120"/>
+              <w:bottom w:type="dxa" w:w="80"/>
+              <w:right w:type="dxa" w:w="120"/>
+            </w:tcMar>
+          </w:tcPr>
+          <w:p>
+            <w:pPr>
+              <w:spacing w:after="0" w:line="260"/>
+            </w:pPr>
+            <w:r>
+              <w:rPr>
+                <w:rFonts w:ascii="Calibri" w:cs="Calibri" w:eastAsia="Calibri" w:hAnsi="Calibri"/>
+                <w:b w:val="false"/>
+                <w:bCs w:val="false"/>
+                <w:color w:val="1A1A1A"/>
+                <w:sz w:val="19"/>
+                <w:szCs w:val="19"/>
+              </w:rPr>
+              <w:t xml:space="preserve">Generate a consistent seed dataset from real Lagos restaurants and check its arithmetic</w:t>
+            </w:r>
+          </w:p>
+        </w:tc>
+        <w:tc>
+          <w:tcPr>
+            <w:tcW w:type="dxa" w:w="1400"/>
+            <w:shd w:fill="F7F7F7" w:color="auto" w:val="clear"/>
+            <w:tcMar>
+              <w:top w:type="dxa" w:w="80"/>
+              <w:left w:type="dxa" w:w="120"/>
+              <w:bottom w:type="dxa" w:w="80"/>
+              <w:right w:type="dxa" w:w="120"/>
+            </w:tcMar>
+          </w:tcPr>
+          <w:p>
+            <w:pPr>
+              <w:spacing w:after="0" w:line="260"/>
+            </w:pPr>
+            <w:r>
+              <w:rPr>
+                <w:rFonts w:ascii="Calibri" w:cs="Calibri" w:eastAsia="Calibri" w:hAnsi="Calibri"/>
+                <w:b w:val="false"/>
+                <w:bCs w:val="false"/>
+                <w:color w:val="1A1A1A"/>
+                <w:sz w:val="19"/>
+                <w:szCs w:val="19"/>
+              </w:rPr>
+              <w:t xml:space="preserve">Accepted after a fault was found by inspection</w:t>
+            </w:r>
+          </w:p>
+        </w:tc>
+        <w:tc>
+          <w:tcPr>
+            <w:tcW w:type="dxa" w:w="1900"/>
+            <w:shd w:fill="F7F7F7" w:color="auto" w:val="clear"/>
+            <w:tcMar>
+              <w:top w:type="dxa" w:w="80"/>
+              <w:left w:type="dxa" w:w="120"/>
+              <w:bottom w:type="dxa" w:w="80"/>
+              <w:right w:type="dxa" w:w="120"/>
+            </w:tcMar>
+          </w:tcPr>
+          <w:p>
+            <w:pPr>
+              <w:spacing w:after="0" w:line="260"/>
+            </w:pPr>
+            <w:r>
+              <w:rPr>
+                <w:rFonts w:ascii="Calibri" w:cs="Calibri" w:eastAsia="Calibri" w:hAnsi="Calibri"/>
+                <w:b w:val="false"/>
+                <w:bCs w:val="false"/>
+                <w:color w:val="1A1A1A"/>
+                <w:sz w:val="19"/>
+                <w:szCs w:val="19"/>
+              </w:rPr>
+              <w:t xml:space="preserve">Every total, subtotal and line price was arithmetically correct and the automated checks passed, but a sample order quoted a 116-minute wait because the formula added every preparation time together. Correct arithmetic on a wrong formula: the checks could not see it, and reading one order did. Became change 018.</w:t>
+            </w:r>
+          </w:p>
+        </w:tc>
+      </w:tr>
+      <w:tr>
+        <w:tc>
+          <w:tcPr>
+            <w:tcW w:type="dxa" w:w="1100"/>
+            <w:tcMar>
+              <w:top w:type="dxa" w:w="80"/>
+              <w:left w:type="dxa" w:w="120"/>
+              <w:bottom w:type="dxa" w:w="80"/>
+              <w:right w:type="dxa" w:w="120"/>
+            </w:tcMar>
+          </w:tcPr>
+          <w:p>
+            <w:pPr>
+              <w:spacing w:after="0" w:line="260"/>
+            </w:pPr>
+            <w:r>
+              <w:rPr>
+                <w:rFonts w:ascii="Calibri" w:cs="Calibri" w:eastAsia="Calibri" w:hAnsi="Calibri"/>
+                <w:b w:val="false"/>
+                <w:bCs w:val="false"/>
+                <w:color w:val="1A1A1A"/>
+                <w:sz w:val="19"/>
+                <w:szCs w:val="19"/>
+              </w:rPr>
+              <w:t xml:space="preserve">6 Sep 2026</w:t>
+            </w:r>
+          </w:p>
+        </w:tc>
+        <w:tc>
+          <w:tcPr>
+            <w:tcW w:type="dxa" w:w="1500"/>
+            <w:tcMar>
+              <w:top w:type="dxa" w:w="80"/>
+              <w:left w:type="dxa" w:w="120"/>
+              <w:bottom w:type="dxa" w:w="80"/>
+              <w:right w:type="dxa" w:w="120"/>
+            </w:tcMar>
+          </w:tcPr>
+          <w:p>
+            <w:pPr>
+              <w:spacing w:after="0" w:line="260"/>
+            </w:pPr>
+            <w:r>
+              <w:rPr>
+                <w:rFonts w:ascii="Calibri" w:cs="Calibri" w:eastAsia="Calibri" w:hAnsi="Calibri"/>
+                <w:b w:val="false"/>
+                <w:bCs w:val="false"/>
+                <w:color w:val="1A1A1A"/>
+                <w:sz w:val="19"/>
+                <w:szCs w:val="19"/>
+              </w:rPr>
+              <w:t xml:space="preserve">Claude Code (Opus)</w:t>
+            </w:r>
+          </w:p>
+        </w:tc>
+        <w:tc>
+          <w:tcPr>
+            <w:tcW w:type="dxa" w:w="3126"/>
+            <w:tcMar>
+              <w:top w:type="dxa" w:w="80"/>
+              <w:left w:type="dxa" w:w="120"/>
+              <w:bottom w:type="dxa" w:w="80"/>
+              <w:right w:type="dxa" w:w="120"/>
+            </w:tcMar>
+          </w:tcPr>
+          <w:p>
+            <w:pPr>
+              <w:spacing w:after="0" w:line="260"/>
+            </w:pPr>
+            <w:r>
+              <w:rPr>
+                <w:rFonts w:ascii="Calibri" w:cs="Calibri" w:eastAsia="Calibri" w:hAnsi="Calibri"/>
+                <w:b w:val="false"/>
+                <w:bCs w:val="false"/>
+                <w:color w:val="1A1A1A"/>
+                <w:sz w:val="19"/>
+                <w:szCs w:val="19"/>
+              </w:rPr>
+              <w:t xml:space="preserve">Build the customer flow, then fix the error it produced when switching restaurant</w:t>
+            </w:r>
+          </w:p>
+        </w:tc>
+        <w:tc>
+          <w:tcPr>
+            <w:tcW w:type="dxa" w:w="1400"/>
+            <w:tcMar>
+              <w:top w:type="dxa" w:w="80"/>
+              <w:left w:type="dxa" w:w="120"/>
+              <w:bottom w:type="dxa" w:w="80"/>
+              <w:right w:type="dxa" w:w="120"/>
+            </w:tcMar>
+          </w:tcPr>
+          <w:p>
+            <w:pPr>
+              <w:spacing w:after="0" w:line="260"/>
+            </w:pPr>
+            <w:r>
+              <w:rPr>
+                <w:rFonts w:ascii="Calibri" w:cs="Calibri" w:eastAsia="Calibri" w:hAnsi="Calibri"/>
+                <w:b w:val="false"/>
+                <w:bCs w:val="false"/>
+                <w:color w:val="1A1A1A"/>
+                <w:sz w:val="19"/>
+                <w:szCs w:val="19"/>
+              </w:rPr>
+              <w:t xml:space="preserve">Accepted, after the fix was tested for the case that broke it</w:t>
+            </w:r>
+          </w:p>
+        </w:tc>
+        <w:tc>
+          <w:tcPr>
+            <w:tcW w:type="dxa" w:w="1900"/>
+            <w:tcMar>
+              <w:top w:type="dxa" w:w="80"/>
+              <w:left w:type="dxa" w:w="120"/>
+              <w:bottom w:type="dxa" w:w="80"/>
+              <w:right w:type="dxa" w:w="120"/>
+            </w:tcMar>
+          </w:tcPr>
+          <w:p>
+            <w:pPr>
+              <w:spacing w:after="0" w:line="260"/>
+            </w:pPr>
+            <w:r>
+              <w:rPr>
+                <w:rFonts w:ascii="Calibri" w:cs="Calibri" w:eastAsia="Calibri" w:hAnsi="Calibri"/>
+                <w:b w:val="false"/>
+                <w:bCs w:val="false"/>
+                <w:color w:val="1A1A1A"/>
+                <w:sz w:val="19"/>
+                <w:szCs w:val="19"/>
+              </w:rPr>
+              <w:t xml:space="preserve">The defect existed because the flow had only ever been walked straight through at a single restaurant. Testing the switch also exposed a second fault nobody had reported — the basket survived the move and still held the previous restaurant's dishes. Became change 019.</w:t>
             </w:r>
           </w:p>
         </w:tc>
@@ -6104,45 +8472,7 @@
           <w:sz w:val="21"/>
           <w:szCs w:val="21"/>
         </w:rPr>
-        <w:t xml:space="preserve">Does the application serve one restaurant, or both of the restaurants in the model? The model supports many; the choice decides whether those relationships are exercised or left decorative. (Change 005.)</w:t>
-      </w:r>
-    </w:p>
-    <w:p>
-      <w:pPr>
-        <w:pStyle w:val="ListParagraph"/>
-        <w:numPr>
-          <w:ilvl w:val="0"/>
-          <w:numId w:val="2"/>
-        </w:numPr>
-        <w:spacing w:after="80" w:line="276"/>
-      </w:pPr>
-      <w:r>
-        <w:rPr>
-          <w:rFonts w:ascii="Calibri" w:cs="Calibri" w:eastAsia="Calibri" w:hAnsi="Calibri"/>
-          <w:color w:val="1A1A1A"/>
-          <w:sz w:val="21"/>
-          <w:szCs w:val="21"/>
-        </w:rPr>
         <w:t xml:space="preserve">Should the repository be public, or private with the facilitators invited? A private repository they cannot open would fail deliverable 1.</w:t>
-      </w:r>
-    </w:p>
-    <w:p>
-      <w:pPr>
-        <w:pStyle w:val="ListParagraph"/>
-        <w:numPr>
-          <w:ilvl w:val="0"/>
-          <w:numId w:val="2"/>
-        </w:numPr>
-        <w:spacing w:after="80" w:line="276"/>
-      </w:pPr>
-      <w:r>
-        <w:rPr>
-          <w:rFonts w:ascii="Calibri" w:cs="Calibri" w:eastAsia="Calibri" w:hAnsi="Calibri"/>
-          <w:color w:val="1A1A1A"/>
-          <w:sz w:val="21"/>
-          <w:szCs w:val="21"/>
-        </w:rPr>
-        <w:t xml:space="preserve">Which name and email address should the git commits be authored under?</w:t>
       </w:r>
     </w:p>
     <w:sectPr>

</xml_diff>

<commit_message>
Write a real README, add an app icon and clear the starter scaffolding
</commit_message>
<xml_diff>
--- a/Chowly - Project Log.docx
+++ b/Chowly - Project Log.docx
@@ -6580,6 +6580,285 @@
                 <w:szCs w:val="19"/>
               </w:rPr>
               <w:t xml:space="preserve">A defect found in testing, recorded because the brief asks for an honest history. Switching restaurant cleared the table number but left the customer inside a menu they could no longer order from, and the failure surfaced as a raw validation message — “expected number, received null”. A customer at a new restaurant is at a new table, so they now return to the entry screen to be seated, with that restaurant already selected. The basket goes with them: it held another kitchen's dishes, which this one cannot cook. Any basket whose restaurant no longer matches the session is treated as empty.</w:t>
+            </w:r>
+          </w:p>
+        </w:tc>
+        <w:tc>
+          <w:tcPr>
+            <w:tcW w:type="dxa" w:w="1200"/>
+            <w:tcMar>
+              <w:top w:type="dxa" w:w="80"/>
+              <w:left w:type="dxa" w:w="120"/>
+              <w:bottom w:type="dxa" w:w="80"/>
+              <w:right w:type="dxa" w:w="120"/>
+            </w:tcMar>
+          </w:tcPr>
+          <w:p>
+            <w:pPr>
+              <w:spacing w:after="0" w:line="260"/>
+            </w:pPr>
+            <w:r>
+              <w:rPr>
+                <w:rFonts w:ascii="Calibri" w:cs="Calibri" w:eastAsia="Calibri" w:hAnsi="Calibri"/>
+                <w:b w:val="false"/>
+                <w:bCs w:val="false"/>
+                <w:color w:val="1A1A1A"/>
+                <w:sz w:val="19"/>
+                <w:szCs w:val="19"/>
+              </w:rPr>
+              <w:t xml:space="preserve">Confirmed</w:t>
+            </w:r>
+          </w:p>
+        </w:tc>
+      </w:tr>
+      <w:tr>
+        <w:tc>
+          <w:tcPr>
+            <w:tcW w:type="dxa" w:w="700"/>
+            <w:shd w:fill="F7F7F7" w:color="auto" w:val="clear"/>
+            <w:tcMar>
+              <w:top w:type="dxa" w:w="80"/>
+              <w:left w:type="dxa" w:w="120"/>
+              <w:bottom w:type="dxa" w:w="80"/>
+              <w:right w:type="dxa" w:w="120"/>
+            </w:tcMar>
+          </w:tcPr>
+          <w:p>
+            <w:pPr>
+              <w:spacing w:after="0" w:line="260"/>
+            </w:pPr>
+            <w:r>
+              <w:rPr>
+                <w:rFonts w:ascii="Calibri" w:cs="Calibri" w:eastAsia="Calibri" w:hAnsi="Calibri"/>
+                <w:b/>
+                <w:bCs/>
+                <w:color w:val="1A1A1A"/>
+                <w:sz w:val="19"/>
+                <w:szCs w:val="19"/>
+              </w:rPr>
+              <w:t xml:space="preserve">020</w:t>
+            </w:r>
+          </w:p>
+        </w:tc>
+        <w:tc>
+          <w:tcPr>
+            <w:tcW w:type="dxa" w:w="1100"/>
+            <w:shd w:fill="F7F7F7" w:color="auto" w:val="clear"/>
+            <w:tcMar>
+              <w:top w:type="dxa" w:w="80"/>
+              <w:left w:type="dxa" w:w="120"/>
+              <w:bottom w:type="dxa" w:w="80"/>
+              <w:right w:type="dxa" w:w="120"/>
+            </w:tcMar>
+          </w:tcPr>
+          <w:p>
+            <w:pPr>
+              <w:spacing w:after="0" w:line="260"/>
+            </w:pPr>
+            <w:r>
+              <w:rPr>
+                <w:rFonts w:ascii="Calibri" w:cs="Calibri" w:eastAsia="Calibri" w:hAnsi="Calibri"/>
+                <w:b w:val="false"/>
+                <w:bCs w:val="false"/>
+                <w:color w:val="1A1A1A"/>
+                <w:sz w:val="19"/>
+                <w:szCs w:val="19"/>
+              </w:rPr>
+              <w:t xml:space="preserve">7 Sep 2026</w:t>
+            </w:r>
+          </w:p>
+        </w:tc>
+        <w:tc>
+          <w:tcPr>
+            <w:tcW w:type="dxa" w:w="2400"/>
+            <w:shd w:fill="F7F7F7" w:color="auto" w:val="clear"/>
+            <w:tcMar>
+              <w:top w:type="dxa" w:w="80"/>
+              <w:left w:type="dxa" w:w="120"/>
+              <w:bottom w:type="dxa" w:w="80"/>
+              <w:right w:type="dxa" w:w="120"/>
+            </w:tcMar>
+          </w:tcPr>
+          <w:p>
+            <w:pPr>
+              <w:spacing w:after="0" w:line="260"/>
+            </w:pPr>
+            <w:r>
+              <w:rPr>
+                <w:rFonts w:ascii="Calibri" w:cs="Calibri" w:eastAsia="Calibri" w:hAnsi="Calibri"/>
+                <w:b w:val="false"/>
+                <w:bCs w:val="false"/>
+                <w:color w:val="1A1A1A"/>
+                <w:sz w:val="19"/>
+                <w:szCs w:val="19"/>
+              </w:rPr>
+              <w:t xml:space="preserve">The repository is public</w:t>
+            </w:r>
+          </w:p>
+        </w:tc>
+        <w:tc>
+          <w:tcPr>
+            <w:tcW w:type="dxa" w:w="3626"/>
+            <w:shd w:fill="F7F7F7" w:color="auto" w:val="clear"/>
+            <w:tcMar>
+              <w:top w:type="dxa" w:w="80"/>
+              <w:left w:type="dxa" w:w="120"/>
+              <w:bottom w:type="dxa" w:w="80"/>
+              <w:right w:type="dxa" w:w="120"/>
+            </w:tcMar>
+          </w:tcPr>
+          <w:p>
+            <w:pPr>
+              <w:spacing w:after="0" w:line="260"/>
+            </w:pPr>
+            <w:r>
+              <w:rPr>
+                <w:rFonts w:ascii="Calibri" w:cs="Calibri" w:eastAsia="Calibri" w:hAnsi="Calibri"/>
+                <w:b w:val="false"/>
+                <w:bCs w:val="false"/>
+                <w:color w:val="1A1A1A"/>
+                <w:sz w:val="19"/>
+                <w:szCs w:val="19"/>
+              </w:rPr>
+              <w:t xml:space="preserve">Deliverable 1 is the repository itself, so it has to open for whoever is marking it. A private repository depends on every facilitator having been invited individually and having accepted, and if that fails the deliverable simply cannot be read. Public removes that dependency. Nothing in the repository is secret: the connection strings live in an untracked .env file, and .env.example carries only the shape of them.</w:t>
+            </w:r>
+          </w:p>
+        </w:tc>
+        <w:tc>
+          <w:tcPr>
+            <w:tcW w:type="dxa" w:w="1200"/>
+            <w:shd w:fill="F7F7F7" w:color="auto" w:val="clear"/>
+            <w:tcMar>
+              <w:top w:type="dxa" w:w="80"/>
+              <w:left w:type="dxa" w:w="120"/>
+              <w:bottom w:type="dxa" w:w="80"/>
+              <w:right w:type="dxa" w:w="120"/>
+            </w:tcMar>
+          </w:tcPr>
+          <w:p>
+            <w:pPr>
+              <w:spacing w:after="0" w:line="260"/>
+            </w:pPr>
+            <w:r>
+              <w:rPr>
+                <w:rFonts w:ascii="Calibri" w:cs="Calibri" w:eastAsia="Calibri" w:hAnsi="Calibri"/>
+                <w:b w:val="false"/>
+                <w:bCs w:val="false"/>
+                <w:color w:val="1A1A1A"/>
+                <w:sz w:val="19"/>
+                <w:szCs w:val="19"/>
+              </w:rPr>
+              <w:t xml:space="preserve">Confirmed</w:t>
+            </w:r>
+          </w:p>
+        </w:tc>
+      </w:tr>
+      <w:tr>
+        <w:tc>
+          <w:tcPr>
+            <w:tcW w:type="dxa" w:w="700"/>
+            <w:tcMar>
+              <w:top w:type="dxa" w:w="80"/>
+              <w:left w:type="dxa" w:w="120"/>
+              <w:bottom w:type="dxa" w:w="80"/>
+              <w:right w:type="dxa" w:w="120"/>
+            </w:tcMar>
+          </w:tcPr>
+          <w:p>
+            <w:pPr>
+              <w:spacing w:after="0" w:line="260"/>
+            </w:pPr>
+            <w:r>
+              <w:rPr>
+                <w:rFonts w:ascii="Calibri" w:cs="Calibri" w:eastAsia="Calibri" w:hAnsi="Calibri"/>
+                <w:b/>
+                <w:bCs/>
+                <w:color w:val="1A1A1A"/>
+                <w:sz w:val="19"/>
+                <w:szCs w:val="19"/>
+              </w:rPr>
+              <w:t xml:space="preserve">021</w:t>
+            </w:r>
+          </w:p>
+        </w:tc>
+        <w:tc>
+          <w:tcPr>
+            <w:tcW w:type="dxa" w:w="1100"/>
+            <w:tcMar>
+              <w:top w:type="dxa" w:w="80"/>
+              <w:left w:type="dxa" w:w="120"/>
+              <w:bottom w:type="dxa" w:w="80"/>
+              <w:right w:type="dxa" w:w="120"/>
+            </w:tcMar>
+          </w:tcPr>
+          <w:p>
+            <w:pPr>
+              <w:spacing w:after="0" w:line="260"/>
+            </w:pPr>
+            <w:r>
+              <w:rPr>
+                <w:rFonts w:ascii="Calibri" w:cs="Calibri" w:eastAsia="Calibri" w:hAnsi="Calibri"/>
+                <w:b w:val="false"/>
+                <w:bCs w:val="false"/>
+                <w:color w:val="1A1A1A"/>
+                <w:sz w:val="19"/>
+                <w:szCs w:val="19"/>
+              </w:rPr>
+              <w:t xml:space="preserve">7 Sep 2026</w:t>
+            </w:r>
+          </w:p>
+        </w:tc>
+        <w:tc>
+          <w:tcPr>
+            <w:tcW w:type="dxa" w:w="2400"/>
+            <w:tcMar>
+              <w:top w:type="dxa" w:w="80"/>
+              <w:left w:type="dxa" w:w="120"/>
+              <w:bottom w:type="dxa" w:w="80"/>
+              <w:right w:type="dxa" w:w="120"/>
+            </w:tcMar>
+          </w:tcPr>
+          <w:p>
+            <w:pPr>
+              <w:spacing w:after="0" w:line="260"/>
+            </w:pPr>
+            <w:r>
+              <w:rPr>
+                <w:rFonts w:ascii="Calibri" w:cs="Calibri" w:eastAsia="Calibri" w:hAnsi="Calibri"/>
+                <w:b w:val="false"/>
+                <w:bCs w:val="false"/>
+                <w:color w:val="1A1A1A"/>
+                <w:sz w:val="19"/>
+                <w:szCs w:val="19"/>
+              </w:rPr>
+              <w:t xml:space="preserve">Seeded dates are anchored to the day the data is generated, and orders still in flight are pulled to the present</w:t>
+            </w:r>
+          </w:p>
+        </w:tc>
+        <w:tc>
+          <w:tcPr>
+            <w:tcW w:type="dxa" w:w="3626"/>
+            <w:tcMar>
+              <w:top w:type="dxa" w:w="80"/>
+              <w:left w:type="dxa" w:w="120"/>
+              <w:bottom w:type="dxa" w:w="80"/>
+              <w:right w:type="dxa" w:w="120"/>
+            </w:tcMar>
+          </w:tcPr>
+          <w:p>
+            <w:pPr>
+              <w:spacing w:after="0" w:line="260"/>
+            </w:pPr>
+            <w:r>
+              <w:rPr>
+                <w:rFonts w:ascii="Calibri" w:cs="Calibri" w:eastAsia="Calibri" w:hAnsi="Calibri"/>
+                <w:b w:val="false"/>
+                <w:bCs w:val="false"/>
+                <w:color w:val="1A1A1A"/>
+                <w:sz w:val="19"/>
+                <w:szCs w:val="19"/>
+              </w:rPr>
+              <w:t xml:space="preserve">Nine orders were dated up to two days in the future, because the generator counted forward from a hardcoded 1 September that the calendar had since overtaken. Every arithmetic check passed over it: the rows were consistent with each other, just not with today. Two further faults surfaced from the same investigation — seven staff were employed months after orders they had already served, and four orders still in the kitchen carried customer ratings, one a two-star complaint about food that had not arrived. Orders that are still being prepared are now dated within the last hour, so the waiter's queue shows live work rather than tables that have supposedly waited a week. The generator and the verification script both refuse to accept any of these three faults again.</w:t>
             </w:r>
           </w:p>
         </w:tc>
@@ -8472,7 +8751,7 @@
           <w:sz w:val="21"/>
           <w:szCs w:val="21"/>
         </w:rPr>
-        <w:t xml:space="preserve">Should the repository be public, or private with the facilitators invited? A private repository they cannot open would fail deliverable 1.</w:t>
+        <w:t xml:space="preserve">None outstanding. Every question raised so far has been resolved and recorded in section 4.</w:t>
       </w:r>
     </w:p>
     <w:sectPr>

</xml_diff>

<commit_message>
Complete the project log: behaviour, walkthrough, structure and deployment
</commit_message>
<xml_diff>
--- a/Chowly - Project Log.docx
+++ b/Chowly - Project Log.docx
@@ -396,7 +396,7 @@
                 <w:sz w:val="19"/>
                 <w:szCs w:val="19"/>
               </w:rPr>
-              <w:t xml:space="preserve">6 September 2026</w:t>
+              <w:t xml:space="preserve">7 September 2026</w:t>
             </w:r>
           </w:p>
         </w:tc>
@@ -426,6 +426,120 @@
                 <w:sz w:val="19"/>
                 <w:szCs w:val="19"/>
               </w:rPr>
+              <w:t xml:space="preserve">Live application</w:t>
+            </w:r>
+          </w:p>
+        </w:tc>
+        <w:tc>
+          <w:tcPr>
+            <w:tcW w:type="dxa" w:w="6826"/>
+            <w:shd w:fill="F7F7F7" w:color="auto" w:val="clear"/>
+            <w:tcMar>
+              <w:top w:type="dxa" w:w="80"/>
+              <w:left w:type="dxa" w:w="120"/>
+              <w:bottom w:type="dxa" w:w="80"/>
+              <w:right w:type="dxa" w:w="120"/>
+            </w:tcMar>
+          </w:tcPr>
+          <w:p>
+            <w:pPr>
+              <w:spacing w:after="0" w:line="260"/>
+            </w:pPr>
+            <w:r>
+              <w:rPr>
+                <w:rFonts w:ascii="Calibri" w:cs="Calibri" w:eastAsia="Calibri" w:hAnsi="Calibri"/>
+                <w:b w:val="false"/>
+                <w:bCs w:val="false"/>
+                <w:color w:val="1A1A1A"/>
+                <w:sz w:val="19"/>
+                <w:szCs w:val="19"/>
+              </w:rPr>
+              <w:t xml:space="preserve">https://chowly-red.vercel.app</w:t>
+            </w:r>
+          </w:p>
+        </w:tc>
+      </w:tr>
+      <w:tr>
+        <w:tc>
+          <w:tcPr>
+            <w:tcW w:type="dxa" w:w="2200"/>
+            <w:tcMar>
+              <w:top w:type="dxa" w:w="80"/>
+              <w:left w:type="dxa" w:w="120"/>
+              <w:bottom w:type="dxa" w:w="80"/>
+              <w:right w:type="dxa" w:w="120"/>
+            </w:tcMar>
+          </w:tcPr>
+          <w:p>
+            <w:pPr>
+              <w:spacing w:after="0" w:line="260"/>
+            </w:pPr>
+            <w:r>
+              <w:rPr>
+                <w:rFonts w:ascii="Calibri" w:cs="Calibri" w:eastAsia="Calibri" w:hAnsi="Calibri"/>
+                <w:b w:val="false"/>
+                <w:bCs w:val="false"/>
+                <w:color w:val="1A1A1A"/>
+                <w:sz w:val="19"/>
+                <w:szCs w:val="19"/>
+              </w:rPr>
+              <w:t xml:space="preserve">Repository</w:t>
+            </w:r>
+          </w:p>
+        </w:tc>
+        <w:tc>
+          <w:tcPr>
+            <w:tcW w:type="dxa" w:w="6826"/>
+            <w:tcMar>
+              <w:top w:type="dxa" w:w="80"/>
+              <w:left w:type="dxa" w:w="120"/>
+              <w:bottom w:type="dxa" w:w="80"/>
+              <w:right w:type="dxa" w:w="120"/>
+            </w:tcMar>
+          </w:tcPr>
+          <w:p>
+            <w:pPr>
+              <w:spacing w:after="0" w:line="260"/>
+            </w:pPr>
+            <w:r>
+              <w:rPr>
+                <w:rFonts w:ascii="Calibri" w:cs="Calibri" w:eastAsia="Calibri" w:hAnsi="Calibri"/>
+                <w:b w:val="false"/>
+                <w:bCs w:val="false"/>
+                <w:color w:val="1A1A1A"/>
+                <w:sz w:val="19"/>
+                <w:szCs w:val="19"/>
+              </w:rPr>
+              <w:t xml:space="preserve">https://github.com/Thatguy-tobi/Chowly</w:t>
+            </w:r>
+          </w:p>
+        </w:tc>
+      </w:tr>
+      <w:tr>
+        <w:tc>
+          <w:tcPr>
+            <w:tcW w:type="dxa" w:w="2200"/>
+            <w:shd w:fill="F7F7F7" w:color="auto" w:val="clear"/>
+            <w:tcMar>
+              <w:top w:type="dxa" w:w="80"/>
+              <w:left w:type="dxa" w:w="120"/>
+              <w:bottom w:type="dxa" w:w="80"/>
+              <w:right w:type="dxa" w:w="120"/>
+            </w:tcMar>
+          </w:tcPr>
+          <w:p>
+            <w:pPr>
+              <w:spacing w:after="0" w:line="260"/>
+            </w:pPr>
+            <w:r>
+              <w:rPr>
+                <w:rFonts w:ascii="Calibri" w:cs="Calibri" w:eastAsia="Calibri" w:hAnsi="Calibri"/>
+                <w:b w:val="false"/>
+                <w:bCs w:val="false"/>
+                <w:color w:val="1A1A1A"/>
+                <w:sz w:val="19"/>
+                <w:szCs w:val="19"/>
+              </w:rPr>
               <w:t xml:space="preserve">Status</w:t>
             </w:r>
           </w:p>
@@ -454,7 +568,7 @@
                 <w:sz w:val="19"/>
                 <w:szCs w:val="19"/>
               </w:rPr>
-              <w:t xml:space="preserve">In progress — stack and hosting decided, build starting</w:t>
+              <w:t xml:space="preserve">Built, deployed and verified against the live database</w:t>
             </w:r>
           </w:p>
         </w:tc>
@@ -831,7 +945,7 @@
           <w:sz w:val="20"/>
           <w:szCs w:val="20"/>
         </w:rPr>
-        <w:t xml:space="preserve">Sections 3, 6 and 7 are deliberately incomplete at this point. They are filled in as each part of the application is actually built, not before.</w:t>
+        <w:t xml:space="preserve">Sections 3, 6 and 7 were written as each part was actually built rather than in advance, which is why section 4 records faults found along the way as well as decisions taken. Everything described here has been exercised on the deployed site.</w:t>
       </w:r>
     </w:p>
     <w:p>
@@ -865,7 +979,7 @@
           <w:sz w:val="21"/>
           <w:szCs w:val="21"/>
         </w:rPr>
-        <w:t xml:space="preserve">The eight functional requirements and three deliverables from the brief, and where each one stands.</w:t>
+        <w:t xml:space="preserve">The eight functional requirements and three deliverables from the brief, and where each one stands. Every requirement below was checked by carrying it out on the deployed site — not on a development machine — and the resulting record was then read back out of the database and compared field by field with what the screens had shown.</w:t>
       </w:r>
     </w:p>
     <w:tbl>
@@ -882,8 +996,8 @@
       </w:tblPr>
       <w:tblGrid>
         <w:gridCol w:w="600"/>
-        <w:gridCol w:w="5426"/>
-        <w:gridCol w:w="3000"/>
+        <w:gridCol w:w="5026"/>
+        <w:gridCol w:w="3400"/>
       </w:tblGrid>
       <w:tr>
         <w:trPr>
@@ -919,7 +1033,7 @@
         </w:tc>
         <w:tc>
           <w:tcPr>
-            <w:tcW w:type="dxa" w:w="5426"/>
+            <w:tcW w:type="dxa" w:w="5026"/>
             <w:shd w:fill="1A1A1A" w:color="auto" w:val="clear"/>
             <w:tcMar>
               <w:top w:type="dxa" w:w="80"/>
@@ -947,7 +1061,7 @@
         </w:tc>
         <w:tc>
           <w:tcPr>
-            <w:tcW w:type="dxa" w:w="3000"/>
+            <w:tcW w:type="dxa" w:w="3400"/>
             <w:shd w:fill="1A1A1A" w:color="auto" w:val="clear"/>
             <w:tcMar>
               <w:top w:type="dxa" w:w="80"/>
@@ -1004,7 +1118,7 @@
         </w:tc>
         <w:tc>
           <w:tcPr>
-            <w:tcW w:type="dxa" w:w="5426"/>
+            <w:tcW w:type="dxa" w:w="5026"/>
             <w:tcMar>
               <w:top w:type="dxa" w:w="80"/>
               <w:left w:type="dxa" w:w="120"/>
@@ -1031,29 +1145,29 @@
         </w:tc>
         <w:tc>
           <w:tcPr>
-            <w:tcW w:type="dxa" w:w="3000"/>
-            <w:shd w:fill="FDECEA" w:color="auto" w:val="clear"/>
-            <w:tcMar>
-              <w:top w:type="dxa" w:w="80"/>
-              <w:left w:type="dxa" w:w="120"/>
-              <w:bottom w:type="dxa" w:w="80"/>
-              <w:right w:type="dxa" w:w="120"/>
-            </w:tcMar>
-          </w:tcPr>
-          <w:p>
-            <w:pPr>
-              <w:spacing w:after="0" w:line="260"/>
-            </w:pPr>
-            <w:r>
-              <w:rPr>
-                <w:rFonts w:ascii="Calibri" w:cs="Calibri" w:eastAsia="Calibri" w:hAnsi="Calibri"/>
-                <w:b w:val="false"/>
-                <w:bCs w:val="false"/>
-                <w:color w:val="1A1A1A"/>
-                <w:sz w:val="19"/>
-                <w:szCs w:val="19"/>
-              </w:rPr>
-              <w:t xml:space="preserve">Not started</w:t>
+            <w:tcW w:type="dxa" w:w="3400"/>
+            <w:shd w:fill="E8F5E9" w:color="auto" w:val="clear"/>
+            <w:tcMar>
+              <w:top w:type="dxa" w:w="80"/>
+              <w:left w:type="dxa" w:w="120"/>
+              <w:bottom w:type="dxa" w:w="80"/>
+              <w:right w:type="dxa" w:w="120"/>
+            </w:tcMar>
+          </w:tcPr>
+          <w:p>
+            <w:pPr>
+              <w:spacing w:after="0" w:line="260"/>
+            </w:pPr>
+            <w:r>
+              <w:rPr>
+                <w:rFonts w:ascii="Calibri" w:cs="Calibri" w:eastAsia="Calibri" w:hAnsi="Calibri"/>
+                <w:b w:val="false"/>
+                <w:bCs w:val="false"/>
+                <w:color w:val="1A1A1A"/>
+                <w:sz w:val="19"/>
+                <w:szCs w:val="19"/>
+              </w:rPr>
+              <w:t xml:space="preserve">Done — 236 items across 12 restaurants</w:t>
             </w:r>
           </w:p>
         </w:tc>
@@ -1089,7 +1203,7 @@
         </w:tc>
         <w:tc>
           <w:tcPr>
-            <w:tcW w:type="dxa" w:w="5426"/>
+            <w:tcW w:type="dxa" w:w="5026"/>
             <w:shd w:fill="F7F7F7" w:color="auto" w:val="clear"/>
             <w:tcMar>
               <w:top w:type="dxa" w:w="80"/>
@@ -1117,29 +1231,29 @@
         </w:tc>
         <w:tc>
           <w:tcPr>
-            <w:tcW w:type="dxa" w:w="3000"/>
-            <w:shd w:fill="FDECEA" w:color="auto" w:val="clear"/>
-            <w:tcMar>
-              <w:top w:type="dxa" w:w="80"/>
-              <w:left w:type="dxa" w:w="120"/>
-              <w:bottom w:type="dxa" w:w="80"/>
-              <w:right w:type="dxa" w:w="120"/>
-            </w:tcMar>
-          </w:tcPr>
-          <w:p>
-            <w:pPr>
-              <w:spacing w:after="0" w:line="260"/>
-            </w:pPr>
-            <w:r>
-              <w:rPr>
-                <w:rFonts w:ascii="Calibri" w:cs="Calibri" w:eastAsia="Calibri" w:hAnsi="Calibri"/>
-                <w:b w:val="false"/>
-                <w:bCs w:val="false"/>
-                <w:color w:val="1A1A1A"/>
-                <w:sz w:val="19"/>
-                <w:szCs w:val="19"/>
-              </w:rPr>
-              <w:t xml:space="preserve">Not started</w:t>
+            <w:tcW w:type="dxa" w:w="3400"/>
+            <w:shd w:fill="E8F5E9" w:color="auto" w:val="clear"/>
+            <w:tcMar>
+              <w:top w:type="dxa" w:w="80"/>
+              <w:left w:type="dxa" w:w="120"/>
+              <w:bottom w:type="dxa" w:w="80"/>
+              <w:right w:type="dxa" w:w="120"/>
+            </w:tcMar>
+          </w:tcPr>
+          <w:p>
+            <w:pPr>
+              <w:spacing w:after="0" w:line="260"/>
+            </w:pPr>
+            <w:r>
+              <w:rPr>
+                <w:rFonts w:ascii="Calibri" w:cs="Calibri" w:eastAsia="Calibri" w:hAnsi="Calibri"/>
+                <w:b w:val="false"/>
+                <w:bCs w:val="false"/>
+                <w:color w:val="1A1A1A"/>
+                <w:sz w:val="19"/>
+                <w:szCs w:val="19"/>
+              </w:rPr>
+              <w:t xml:space="preserve">Done — ORD048, ₦16,300, quoted 33 min</w:t>
             </w:r>
           </w:p>
         </w:tc>
@@ -1174,7 +1288,7 @@
         </w:tc>
         <w:tc>
           <w:tcPr>
-            <w:tcW w:type="dxa" w:w="5426"/>
+            <w:tcW w:type="dxa" w:w="5026"/>
             <w:tcMar>
               <w:top w:type="dxa" w:w="80"/>
               <w:left w:type="dxa" w:w="120"/>
@@ -1201,29 +1315,29 @@
         </w:tc>
         <w:tc>
           <w:tcPr>
-            <w:tcW w:type="dxa" w:w="3000"/>
-            <w:shd w:fill="FDECEA" w:color="auto" w:val="clear"/>
-            <w:tcMar>
-              <w:top w:type="dxa" w:w="80"/>
-              <w:left w:type="dxa" w:w="120"/>
-              <w:bottom w:type="dxa" w:w="80"/>
-              <w:right w:type="dxa" w:w="120"/>
-            </w:tcMar>
-          </w:tcPr>
-          <w:p>
-            <w:pPr>
-              <w:spacing w:after="0" w:line="260"/>
-            </w:pPr>
-            <w:r>
-              <w:rPr>
-                <w:rFonts w:ascii="Calibri" w:cs="Calibri" w:eastAsia="Calibri" w:hAnsi="Calibri"/>
-                <w:b w:val="false"/>
-                <w:bCs w:val="false"/>
-                <w:color w:val="1A1A1A"/>
-                <w:sz w:val="19"/>
-                <w:szCs w:val="19"/>
-              </w:rPr>
-              <w:t xml:space="preserve">Not started</w:t>
+            <w:tcW w:type="dxa" w:w="3400"/>
+            <w:shd w:fill="E8F5E9" w:color="auto" w:val="clear"/>
+            <w:tcMar>
+              <w:top w:type="dxa" w:w="80"/>
+              <w:left w:type="dxa" w:w="120"/>
+              <w:bottom w:type="dxa" w:w="80"/>
+              <w:right w:type="dxa" w:w="120"/>
+            </w:tcMar>
+          </w:tcPr>
+          <w:p>
+            <w:pPr>
+              <w:spacing w:after="0" w:line="260"/>
+            </w:pPr>
+            <w:r>
+              <w:rPr>
+                <w:rFonts w:ascii="Calibri" w:cs="Calibri" w:eastAsia="Calibri" w:hAnsi="Calibri"/>
+                <w:b w:val="false"/>
+                <w:bCs w:val="false"/>
+                <w:color w:val="1A1A1A"/>
+                <w:sz w:val="19"/>
+                <w:szCs w:val="19"/>
+              </w:rPr>
+              <w:t xml:space="preserve">Done — chef and bartender recorded, then served</w:t>
             </w:r>
           </w:p>
         </w:tc>
@@ -1259,7 +1373,7 @@
         </w:tc>
         <w:tc>
           <w:tcPr>
-            <w:tcW w:type="dxa" w:w="5426"/>
+            <w:tcW w:type="dxa" w:w="5026"/>
             <w:shd w:fill="F7F7F7" w:color="auto" w:val="clear"/>
             <w:tcMar>
               <w:top w:type="dxa" w:w="80"/>
@@ -1287,29 +1401,29 @@
         </w:tc>
         <w:tc>
           <w:tcPr>
-            <w:tcW w:type="dxa" w:w="3000"/>
-            <w:shd w:fill="FDECEA" w:color="auto" w:val="clear"/>
-            <w:tcMar>
-              <w:top w:type="dxa" w:w="80"/>
-              <w:left w:type="dxa" w:w="120"/>
-              <w:bottom w:type="dxa" w:w="80"/>
-              <w:right w:type="dxa" w:w="120"/>
-            </w:tcMar>
-          </w:tcPr>
-          <w:p>
-            <w:pPr>
-              <w:spacing w:after="0" w:line="260"/>
-            </w:pPr>
-            <w:r>
-              <w:rPr>
-                <w:rFonts w:ascii="Calibri" w:cs="Calibri" w:eastAsia="Calibri" w:hAnsi="Calibri"/>
-                <w:b w:val="false"/>
-                <w:bCs w:val="false"/>
-                <w:color w:val="1A1A1A"/>
-                <w:sz w:val="19"/>
-                <w:szCs w:val="19"/>
-              </w:rPr>
-              <w:t xml:space="preserve">Not started</w:t>
+            <w:tcW w:type="dxa" w:w="3400"/>
+            <w:shd w:fill="E8F5E9" w:color="auto" w:val="clear"/>
+            <w:tcMar>
+              <w:top w:type="dxa" w:w="80"/>
+              <w:left w:type="dxa" w:w="120"/>
+              <w:bottom w:type="dxa" w:w="80"/>
+              <w:right w:type="dxa" w:w="120"/>
+            </w:tcMar>
+          </w:tcPr>
+          <w:p>
+            <w:pPr>
+              <w:spacing w:after="0" w:line="260"/>
+            </w:pPr>
+            <w:r>
+              <w:rPr>
+                <w:rFonts w:ascii="Calibri" w:cs="Calibri" w:eastAsia="Calibri" w:hAnsi="Calibri"/>
+                <w:b w:val="false"/>
+                <w:bCs w:val="false"/>
+                <w:color w:val="1A1A1A"/>
+                <w:sz w:val="19"/>
+                <w:szCs w:val="19"/>
+              </w:rPr>
+              <w:t xml:space="preserve">Done — 4★ with comment, plus a complaint</w:t>
             </w:r>
           </w:p>
         </w:tc>
@@ -1344,7 +1458,7 @@
         </w:tc>
         <w:tc>
           <w:tcPr>
-            <w:tcW w:type="dxa" w:w="5426"/>
+            <w:tcW w:type="dxa" w:w="5026"/>
             <w:tcMar>
               <w:top w:type="dxa" w:w="80"/>
               <w:left w:type="dxa" w:w="120"/>
@@ -1371,29 +1485,29 @@
         </w:tc>
         <w:tc>
           <w:tcPr>
-            <w:tcW w:type="dxa" w:w="3000"/>
-            <w:shd w:fill="FDECEA" w:color="auto" w:val="clear"/>
-            <w:tcMar>
-              <w:top w:type="dxa" w:w="80"/>
-              <w:left w:type="dxa" w:w="120"/>
-              <w:bottom w:type="dxa" w:w="80"/>
-              <w:right w:type="dxa" w:w="120"/>
-            </w:tcMar>
-          </w:tcPr>
-          <w:p>
-            <w:pPr>
-              <w:spacing w:after="0" w:line="260"/>
-            </w:pPr>
-            <w:r>
-              <w:rPr>
-                <w:rFonts w:ascii="Calibri" w:cs="Calibri" w:eastAsia="Calibri" w:hAnsi="Calibri"/>
-                <w:b w:val="false"/>
-                <w:bCs w:val="false"/>
-                <w:color w:val="1A1A1A"/>
-                <w:sz w:val="19"/>
-                <w:szCs w:val="19"/>
-              </w:rPr>
-              <w:t xml:space="preserve">Not started</w:t>
+            <w:tcW w:type="dxa" w:w="3400"/>
+            <w:shd w:fill="E8F5E9" w:color="auto" w:val="clear"/>
+            <w:tcMar>
+              <w:top w:type="dxa" w:w="80"/>
+              <w:left w:type="dxa" w:w="120"/>
+              <w:bottom w:type="dxa" w:w="80"/>
+              <w:right w:type="dxa" w:w="120"/>
+            </w:tcMar>
+          </w:tcPr>
+          <w:p>
+            <w:pPr>
+              <w:spacing w:after="0" w:line="260"/>
+            </w:pPr>
+            <w:r>
+              <w:rPr>
+                <w:rFonts w:ascii="Calibri" w:cs="Calibri" w:eastAsia="Calibri" w:hAnsi="Calibri"/>
+                <w:b w:val="false"/>
+                <w:bCs w:val="false"/>
+                <w:color w:val="1A1A1A"/>
+                <w:sz w:val="19"/>
+                <w:szCs w:val="19"/>
+              </w:rPr>
+              <w:t xml:space="preserve">Done — recorded with is_pretend set</w:t>
             </w:r>
           </w:p>
         </w:tc>
@@ -1429,7 +1543,7 @@
         </w:tc>
         <w:tc>
           <w:tcPr>
-            <w:tcW w:type="dxa" w:w="5426"/>
+            <w:tcW w:type="dxa" w:w="5026"/>
             <w:shd w:fill="F7F7F7" w:color="auto" w:val="clear"/>
             <w:tcMar>
               <w:top w:type="dxa" w:w="80"/>
@@ -1457,29 +1571,29 @@
         </w:tc>
         <w:tc>
           <w:tcPr>
-            <w:tcW w:type="dxa" w:w="3000"/>
-            <w:shd w:fill="FDECEA" w:color="auto" w:val="clear"/>
-            <w:tcMar>
-              <w:top w:type="dxa" w:w="80"/>
-              <w:left w:type="dxa" w:w="120"/>
-              <w:bottom w:type="dxa" w:w="80"/>
-              <w:right w:type="dxa" w:w="120"/>
-            </w:tcMar>
-          </w:tcPr>
-          <w:p>
-            <w:pPr>
-              <w:spacing w:after="0" w:line="260"/>
-            </w:pPr>
-            <w:r>
-              <w:rPr>
-                <w:rFonts w:ascii="Calibri" w:cs="Calibri" w:eastAsia="Calibri" w:hAnsi="Calibri"/>
-                <w:b w:val="false"/>
-                <w:bCs w:val="false"/>
-                <w:color w:val="1A1A1A"/>
-                <w:sz w:val="19"/>
-                <w:szCs w:val="19"/>
-              </w:rPr>
-              <w:t xml:space="preserve">Not started</w:t>
+            <w:tcW w:type="dxa" w:w="3400"/>
+            <w:shd w:fill="E8F5E9" w:color="auto" w:val="clear"/>
+            <w:tcMar>
+              <w:top w:type="dxa" w:w="80"/>
+              <w:left w:type="dxa" w:w="120"/>
+              <w:bottom w:type="dxa" w:w="80"/>
+              <w:right w:type="dxa" w:w="120"/>
+            </w:tcMar>
+          </w:tcPr>
+          <w:p>
+            <w:pPr>
+              <w:spacing w:after="0" w:line="260"/>
+            </w:pPr>
+            <w:r>
+              <w:rPr>
+                <w:rFonts w:ascii="Calibri" w:cs="Calibri" w:eastAsia="Calibri" w:hAnsi="Calibri"/>
+                <w:b w:val="false"/>
+                <w:bCs w:val="false"/>
+                <w:color w:val="1A1A1A"/>
+                <w:sz w:val="19"/>
+                <w:szCs w:val="19"/>
+              </w:rPr>
+              <w:t xml:space="preserve">Done — switched both ways mid-order</w:t>
             </w:r>
           </w:p>
         </w:tc>
@@ -1514,7 +1628,7 @@
         </w:tc>
         <w:tc>
           <w:tcPr>
-            <w:tcW w:type="dxa" w:w="5426"/>
+            <w:tcW w:type="dxa" w:w="5026"/>
             <w:tcMar>
               <w:top w:type="dxa" w:w="80"/>
               <w:left w:type="dxa" w:w="120"/>
@@ -1541,29 +1655,29 @@
         </w:tc>
         <w:tc>
           <w:tcPr>
-            <w:tcW w:type="dxa" w:w="3000"/>
-            <w:shd w:fill="FDECEA" w:color="auto" w:val="clear"/>
-            <w:tcMar>
-              <w:top w:type="dxa" w:w="80"/>
-              <w:left w:type="dxa" w:w="120"/>
-              <w:bottom w:type="dxa" w:w="80"/>
-              <w:right w:type="dxa" w:w="120"/>
-            </w:tcMar>
-          </w:tcPr>
-          <w:p>
-            <w:pPr>
-              <w:spacing w:after="0" w:line="260"/>
-            </w:pPr>
-            <w:r>
-              <w:rPr>
-                <w:rFonts w:ascii="Calibri" w:cs="Calibri" w:eastAsia="Calibri" w:hAnsi="Calibri"/>
-                <w:b w:val="false"/>
-                <w:bCs w:val="false"/>
-                <w:color w:val="1A1A1A"/>
-                <w:sz w:val="19"/>
-                <w:szCs w:val="19"/>
-              </w:rPr>
-              <w:t xml:space="preserve">Not started</w:t>
+            <w:tcW w:type="dxa" w:w="3400"/>
+            <w:shd w:fill="E8F5E9" w:color="auto" w:val="clear"/>
+            <w:tcMar>
+              <w:top w:type="dxa" w:w="80"/>
+              <w:left w:type="dxa" w:w="120"/>
+              <w:bottom w:type="dxa" w:w="80"/>
+              <w:right w:type="dxa" w:w="120"/>
+            </w:tcMar>
+          </w:tcPr>
+          <w:p>
+            <w:pPr>
+              <w:spacing w:after="0" w:line="260"/>
+            </w:pPr>
+            <w:r>
+              <w:rPr>
+                <w:rFonts w:ascii="Calibri" w:cs="Calibri" w:eastAsia="Calibri" w:hAnsi="Calibri"/>
+                <w:b w:val="false"/>
+                <w:bCs w:val="false"/>
+                <w:color w:val="1A1A1A"/>
+                <w:sz w:val="19"/>
+                <w:szCs w:val="19"/>
+              </w:rPr>
+              <w:t xml:space="preserve">Done — survived a full page reload</w:t>
             </w:r>
           </w:p>
         </w:tc>
@@ -1599,7 +1713,7 @@
         </w:tc>
         <w:tc>
           <w:tcPr>
-            <w:tcW w:type="dxa" w:w="5426"/>
+            <w:tcW w:type="dxa" w:w="5026"/>
             <w:shd w:fill="F7F7F7" w:color="auto" w:val="clear"/>
             <w:tcMar>
               <w:top w:type="dxa" w:w="80"/>
@@ -1627,29 +1741,29 @@
         </w:tc>
         <w:tc>
           <w:tcPr>
-            <w:tcW w:type="dxa" w:w="3000"/>
-            <w:shd w:fill="FDECEA" w:color="auto" w:val="clear"/>
-            <w:tcMar>
-              <w:top w:type="dxa" w:w="80"/>
-              <w:left w:type="dxa" w:w="120"/>
-              <w:bottom w:type="dxa" w:w="80"/>
-              <w:right w:type="dxa" w:w="120"/>
-            </w:tcMar>
-          </w:tcPr>
-          <w:p>
-            <w:pPr>
-              <w:spacing w:after="0" w:line="260"/>
-            </w:pPr>
-            <w:r>
-              <w:rPr>
-                <w:rFonts w:ascii="Calibri" w:cs="Calibri" w:eastAsia="Calibri" w:hAnsi="Calibri"/>
-                <w:b w:val="false"/>
-                <w:bCs w:val="false"/>
-                <w:color w:val="1A1A1A"/>
-                <w:sz w:val="19"/>
-                <w:szCs w:val="19"/>
-              </w:rPr>
-              <w:t xml:space="preserve">Not started</w:t>
+            <w:tcW w:type="dxa" w:w="3400"/>
+            <w:shd w:fill="E8F5E9" w:color="auto" w:val="clear"/>
+            <w:tcMar>
+              <w:top w:type="dxa" w:w="80"/>
+              <w:left w:type="dxa" w:w="120"/>
+              <w:bottom w:type="dxa" w:w="80"/>
+              <w:right w:type="dxa" w:w="120"/>
+            </w:tcMar>
+          </w:tcPr>
+          <w:p>
+            <w:pPr>
+              <w:spacing w:after="0" w:line="260"/>
+            </w:pPr>
+            <w:r>
+              <w:rPr>
+                <w:rFonts w:ascii="Calibri" w:cs="Calibri" w:eastAsia="Calibri" w:hAnsi="Calibri"/>
+                <w:b w:val="false"/>
+                <w:bCs w:val="false"/>
+                <w:color w:val="1A1A1A"/>
+                <w:sz w:val="19"/>
+                <w:szCs w:val="19"/>
+              </w:rPr>
+              <w:t xml:space="preserve">Done — chowly-red.vercel.app</w:t>
             </w:r>
           </w:p>
         </w:tc>
@@ -1684,7 +1798,7 @@
         </w:tc>
         <w:tc>
           <w:tcPr>
-            <w:tcW w:type="dxa" w:w="5426"/>
+            <w:tcW w:type="dxa" w:w="5026"/>
             <w:tcMar>
               <w:top w:type="dxa" w:w="80"/>
               <w:left w:type="dxa" w:w="120"/>
@@ -1711,29 +1825,29 @@
         </w:tc>
         <w:tc>
           <w:tcPr>
-            <w:tcW w:type="dxa" w:w="3000"/>
-            <w:shd w:fill="FDECEA" w:color="auto" w:val="clear"/>
-            <w:tcMar>
-              <w:top w:type="dxa" w:w="80"/>
-              <w:left w:type="dxa" w:w="120"/>
-              <w:bottom w:type="dxa" w:w="80"/>
-              <w:right w:type="dxa" w:w="120"/>
-            </w:tcMar>
-          </w:tcPr>
-          <w:p>
-            <w:pPr>
-              <w:spacing w:after="0" w:line="260"/>
-            </w:pPr>
-            <w:r>
-              <w:rPr>
-                <w:rFonts w:ascii="Calibri" w:cs="Calibri" w:eastAsia="Calibri" w:hAnsi="Calibri"/>
-                <w:b w:val="false"/>
-                <w:bCs w:val="false"/>
-                <w:color w:val="1A1A1A"/>
-                <w:sz w:val="19"/>
-                <w:szCs w:val="19"/>
-              </w:rPr>
-              <w:t xml:space="preserve">Not started</w:t>
+            <w:tcW w:type="dxa" w:w="3400"/>
+            <w:shd w:fill="E8F5E9" w:color="auto" w:val="clear"/>
+            <w:tcMar>
+              <w:top w:type="dxa" w:w="80"/>
+              <w:left w:type="dxa" w:w="120"/>
+              <w:bottom w:type="dxa" w:w="80"/>
+              <w:right w:type="dxa" w:w="120"/>
+            </w:tcMar>
+          </w:tcPr>
+          <w:p>
+            <w:pPr>
+              <w:spacing w:after="0" w:line="260"/>
+            </w:pPr>
+            <w:r>
+              <w:rPr>
+                <w:rFonts w:ascii="Calibri" w:cs="Calibri" w:eastAsia="Calibri" w:hAnsi="Calibri"/>
+                <w:b w:val="false"/>
+                <w:bCs w:val="false"/>
+                <w:color w:val="1A1A1A"/>
+                <w:sz w:val="19"/>
+                <w:szCs w:val="19"/>
+              </w:rPr>
+              <w:t xml:space="preserve">Done — public, github.com/Thatguy-tobi/Chowly</w:t>
             </w:r>
           </w:p>
         </w:tc>
@@ -1769,7 +1883,7 @@
         </w:tc>
         <w:tc>
           <w:tcPr>
-            <w:tcW w:type="dxa" w:w="5426"/>
+            <w:tcW w:type="dxa" w:w="5026"/>
             <w:shd w:fill="F7F7F7" w:color="auto" w:val="clear"/>
             <w:tcMar>
               <w:top w:type="dxa" w:w="80"/>
@@ -1797,29 +1911,29 @@
         </w:tc>
         <w:tc>
           <w:tcPr>
-            <w:tcW w:type="dxa" w:w="3000"/>
-            <w:shd w:fill="FDECEA" w:color="auto" w:val="clear"/>
-            <w:tcMar>
-              <w:top w:type="dxa" w:w="80"/>
-              <w:left w:type="dxa" w:w="120"/>
-              <w:bottom w:type="dxa" w:w="80"/>
-              <w:right w:type="dxa" w:w="120"/>
-            </w:tcMar>
-          </w:tcPr>
-          <w:p>
-            <w:pPr>
-              <w:spacing w:after="0" w:line="260"/>
-            </w:pPr>
-            <w:r>
-              <w:rPr>
-                <w:rFonts w:ascii="Calibri" w:cs="Calibri" w:eastAsia="Calibri" w:hAnsi="Calibri"/>
-                <w:b w:val="false"/>
-                <w:bCs w:val="false"/>
-                <w:color w:val="1A1A1A"/>
-                <w:sz w:val="19"/>
-                <w:szCs w:val="19"/>
-              </w:rPr>
-              <w:t xml:space="preserve">Not started</w:t>
+            <w:tcW w:type="dxa" w:w="3400"/>
+            <w:shd w:fill="E8F5E9" w:color="auto" w:val="clear"/>
+            <w:tcMar>
+              <w:top w:type="dxa" w:w="80"/>
+              <w:left w:type="dxa" w:w="120"/>
+              <w:bottom w:type="dxa" w:w="80"/>
+              <w:right w:type="dxa" w:w="120"/>
+            </w:tcMar>
+          </w:tcPr>
+          <w:p>
+            <w:pPr>
+              <w:spacing w:after="0" w:line="260"/>
+            </w:pPr>
+            <w:r>
+              <w:rPr>
+                <w:rFonts w:ascii="Calibri" w:cs="Calibri" w:eastAsia="Calibri" w:hAnsi="Calibri"/>
+                <w:b w:val="false"/>
+                <w:bCs w:val="false"/>
+                <w:color w:val="1A1A1A"/>
+                <w:sz w:val="19"/>
+                <w:szCs w:val="19"/>
+              </w:rPr>
+              <w:t xml:space="preserve">Done — recorded in section 3.4</w:t>
             </w:r>
           </w:p>
         </w:tc>
@@ -1854,7 +1968,7 @@
         </w:tc>
         <w:tc>
           <w:tcPr>
-            <w:tcW w:type="dxa" w:w="5426"/>
+            <w:tcW w:type="dxa" w:w="5026"/>
             <w:tcMar>
               <w:top w:type="dxa" w:w="80"/>
               <w:left w:type="dxa" w:w="120"/>
@@ -1881,29 +1995,29 @@
         </w:tc>
         <w:tc>
           <w:tcPr>
-            <w:tcW w:type="dxa" w:w="3000"/>
-            <w:shd w:fill="FFF4E5" w:color="auto" w:val="clear"/>
-            <w:tcMar>
-              <w:top w:type="dxa" w:w="80"/>
-              <w:left w:type="dxa" w:w="120"/>
-              <w:bottom w:type="dxa" w:w="80"/>
-              <w:right w:type="dxa" w:w="120"/>
-            </w:tcMar>
-          </w:tcPr>
-          <w:p>
-            <w:pPr>
-              <w:spacing w:after="0" w:line="260"/>
-            </w:pPr>
-            <w:r>
-              <w:rPr>
-                <w:rFonts w:ascii="Calibri" w:cs="Calibri" w:eastAsia="Calibri" w:hAnsi="Calibri"/>
-                <w:b w:val="false"/>
-                <w:bCs w:val="false"/>
-                <w:color w:val="1A1A1A"/>
-                <w:sz w:val="19"/>
-                <w:szCs w:val="19"/>
-              </w:rPr>
-              <w:t xml:space="preserve">In progress</w:t>
+            <w:tcW w:type="dxa" w:w="3400"/>
+            <w:shd w:fill="E8F5E9" w:color="auto" w:val="clear"/>
+            <w:tcMar>
+              <w:top w:type="dxa" w:w="80"/>
+              <w:left w:type="dxa" w:w="120"/>
+              <w:bottom w:type="dxa" w:w="80"/>
+              <w:right w:type="dxa" w:w="120"/>
+            </w:tcMar>
+          </w:tcPr>
+          <w:p>
+            <w:pPr>
+              <w:spacing w:after="0" w:line="260"/>
+            </w:pPr>
+            <w:r>
+              <w:rPr>
+                <w:rFonts w:ascii="Calibri" w:cs="Calibri" w:eastAsia="Calibri" w:hAnsi="Calibri"/>
+                <w:b w:val="false"/>
+                <w:bCs w:val="false"/>
+                <w:color w:val="1A1A1A"/>
+                <w:sz w:val="19"/>
+                <w:szCs w:val="19"/>
+              </w:rPr>
+              <w:t xml:space="preserve">Done — sections 6 and 7 completed after deployment</w:t>
             </w:r>
           </w:p>
         </w:tc>
@@ -2498,13 +2612,387 @@
       <w:r>
         <w:rPr>
           <w:rFonts w:ascii="Calibri" w:cs="Calibri" w:eastAsia="Calibri" w:hAnsi="Calibri"/>
-          <w:i/>
-          <w:iCs/>
-          <w:color w:val="5F6368"/>
+          <w:color w:val="1A1A1A"/>
           <w:sz w:val="21"/>
           <w:szCs w:val="21"/>
         </w:rPr>
-        <w:t xml:space="preserve">To be written once the stack is chosen and the project is scaffolded.</w:t>
+        <w:t xml:space="preserve">One Next.js application holds both the interface and the API, so there is a single thing to deploy and a single thing that can fail. Pages are React components that run in the browser; the API routes beside them run on the server and are the only code that touches the database.</w:t>
+      </w:r>
+    </w:p>
+    <w:tbl>
+      <w:tblPr>
+        <w:tblW w:type="dxa" w:w="9026"/>
+        <w:tblBorders>
+          <w:top w:val="single" w:color="D9D9D9" w:sz="2"/>
+          <w:left w:val="single" w:color="D9D9D9" w:sz="2"/>
+          <w:bottom w:val="single" w:color="D9D9D9" w:sz="2"/>
+          <w:right w:val="single" w:color="D9D9D9" w:sz="2"/>
+          <w:insideH w:val="single" w:color="D9D9D9" w:sz="2"/>
+          <w:insideV w:val="single" w:color="D9D9D9" w:sz="2"/>
+        </w:tblBorders>
+      </w:tblPr>
+      <w:tblGrid>
+        <w:gridCol w:w="2600"/>
+        <w:gridCol w:w="6426"/>
+      </w:tblGrid>
+      <w:tr>
+        <w:trPr>
+          <w:tblHeader/>
+        </w:trPr>
+        <w:tc>
+          <w:tcPr>
+            <w:tcW w:type="dxa" w:w="2600"/>
+            <w:shd w:fill="1A1A1A" w:color="auto" w:val="clear"/>
+            <w:tcMar>
+              <w:top w:type="dxa" w:w="80"/>
+              <w:left w:type="dxa" w:w="120"/>
+              <w:bottom w:type="dxa" w:w="80"/>
+              <w:right w:type="dxa" w:w="120"/>
+            </w:tcMar>
+          </w:tcPr>
+          <w:p>
+            <w:pPr>
+              <w:spacing w:after="0" w:line="260"/>
+            </w:pPr>
+            <w:r>
+              <w:rPr>
+                <w:rFonts w:ascii="Calibri" w:cs="Calibri" w:eastAsia="Calibri" w:hAnsi="Calibri"/>
+                <w:b/>
+                <w:bCs/>
+                <w:color w:val="FFFFFF"/>
+                <w:sz w:val="19"/>
+                <w:szCs w:val="19"/>
+              </w:rPr>
+              <w:t xml:space="preserve">Folder</w:t>
+            </w:r>
+          </w:p>
+        </w:tc>
+        <w:tc>
+          <w:tcPr>
+            <w:tcW w:type="dxa" w:w="6426"/>
+            <w:shd w:fill="1A1A1A" w:color="auto" w:val="clear"/>
+            <w:tcMar>
+              <w:top w:type="dxa" w:w="80"/>
+              <w:left w:type="dxa" w:w="120"/>
+              <w:bottom w:type="dxa" w:w="80"/>
+              <w:right w:type="dxa" w:w="120"/>
+            </w:tcMar>
+          </w:tcPr>
+          <w:p>
+            <w:pPr>
+              <w:spacing w:after="0" w:line="260"/>
+            </w:pPr>
+            <w:r>
+              <w:rPr>
+                <w:rFonts w:ascii="Calibri" w:cs="Calibri" w:eastAsia="Calibri" w:hAnsi="Calibri"/>
+                <w:b/>
+                <w:bCs/>
+                <w:color w:val="FFFFFF"/>
+                <w:sz w:val="19"/>
+                <w:szCs w:val="19"/>
+              </w:rPr>
+              <w:t xml:space="preserve">What is in it</w:t>
+            </w:r>
+          </w:p>
+        </w:tc>
+      </w:tr>
+      <w:tr>
+        <w:tc>
+          <w:tcPr>
+            <w:tcW w:type="dxa" w:w="2600"/>
+            <w:tcMar>
+              <w:top w:type="dxa" w:w="80"/>
+              <w:left w:type="dxa" w:w="120"/>
+              <w:bottom w:type="dxa" w:w="80"/>
+              <w:right w:type="dxa" w:w="120"/>
+            </w:tcMar>
+          </w:tcPr>
+          <w:p>
+            <w:pPr>
+              <w:spacing w:after="0" w:line="260"/>
+            </w:pPr>
+            <w:r>
+              <w:rPr>
+                <w:rFonts w:ascii="Calibri" w:cs="Calibri" w:eastAsia="Calibri" w:hAnsi="Calibri"/>
+                <w:b/>
+                <w:bCs/>
+                <w:color w:val="1A1A1A"/>
+                <w:sz w:val="19"/>
+                <w:szCs w:val="19"/>
+              </w:rPr>
+              <w:t xml:space="preserve">prisma/</w:t>
+            </w:r>
+          </w:p>
+        </w:tc>
+        <w:tc>
+          <w:tcPr>
+            <w:tcW w:type="dxa" w:w="6426"/>
+            <w:tcMar>
+              <w:top w:type="dxa" w:w="80"/>
+              <w:left w:type="dxa" w:w="120"/>
+              <w:bottom w:type="dxa" w:w="80"/>
+              <w:right w:type="dxa" w:w="120"/>
+            </w:tcMar>
+          </w:tcPr>
+          <w:p>
+            <w:pPr>
+              <w:spacing w:after="0" w:line="260"/>
+            </w:pPr>
+            <w:r>
+              <w:rPr>
+                <w:rFonts w:ascii="Calibri" w:cs="Calibri" w:eastAsia="Calibri" w:hAnsi="Calibri"/>
+                <w:b w:val="false"/>
+                <w:bCs w:val="false"/>
+                <w:color w:val="1A1A1A"/>
+                <w:sz w:val="19"/>
+                <w:szCs w:val="19"/>
+              </w:rPr>
+              <w:t xml:space="preserve">The schema, the migration, the seed data and seed script, and verify.ts — which reads the database back and checks every rule independently of the code that wrote it</w:t>
+            </w:r>
+          </w:p>
+        </w:tc>
+      </w:tr>
+      <w:tr>
+        <w:tc>
+          <w:tcPr>
+            <w:tcW w:type="dxa" w:w="2600"/>
+            <w:shd w:fill="F7F7F7" w:color="auto" w:val="clear"/>
+            <w:tcMar>
+              <w:top w:type="dxa" w:w="80"/>
+              <w:left w:type="dxa" w:w="120"/>
+              <w:bottom w:type="dxa" w:w="80"/>
+              <w:right w:type="dxa" w:w="120"/>
+            </w:tcMar>
+          </w:tcPr>
+          <w:p>
+            <w:pPr>
+              <w:spacing w:after="0" w:line="260"/>
+            </w:pPr>
+            <w:r>
+              <w:rPr>
+                <w:rFonts w:ascii="Calibri" w:cs="Calibri" w:eastAsia="Calibri" w:hAnsi="Calibri"/>
+                <w:b/>
+                <w:bCs/>
+                <w:color w:val="1A1A1A"/>
+                <w:sz w:val="19"/>
+                <w:szCs w:val="19"/>
+              </w:rPr>
+              <w:t xml:space="preserve">src/app/</w:t>
+            </w:r>
+          </w:p>
+        </w:tc>
+        <w:tc>
+          <w:tcPr>
+            <w:tcW w:type="dxa" w:w="6426"/>
+            <w:shd w:fill="F7F7F7" w:color="auto" w:val="clear"/>
+            <w:tcMar>
+              <w:top w:type="dxa" w:w="80"/>
+              <w:left w:type="dxa" w:w="120"/>
+              <w:bottom w:type="dxa" w:w="80"/>
+              <w:right w:type="dxa" w:w="120"/>
+            </w:tcMar>
+          </w:tcPr>
+          <w:p>
+            <w:pPr>
+              <w:spacing w:after="0" w:line="260"/>
+            </w:pPr>
+            <w:r>
+              <w:rPr>
+                <w:rFonts w:ascii="Calibri" w:cs="Calibri" w:eastAsia="Calibri" w:hAnsi="Calibri"/>
+                <w:b w:val="false"/>
+                <w:bCs w:val="false"/>
+                <w:color w:val="1A1A1A"/>
+                <w:sz w:val="19"/>
+                <w:szCs w:val="19"/>
+              </w:rPr>
+              <w:t xml:space="preserve">One folder per page (menu, cart, orders, waiter) and src/app/api for the endpoints</w:t>
+            </w:r>
+          </w:p>
+        </w:tc>
+      </w:tr>
+      <w:tr>
+        <w:tc>
+          <w:tcPr>
+            <w:tcW w:type="dxa" w:w="2600"/>
+            <w:tcMar>
+              <w:top w:type="dxa" w:w="80"/>
+              <w:left w:type="dxa" w:w="120"/>
+              <w:bottom w:type="dxa" w:w="80"/>
+              <w:right w:type="dxa" w:w="120"/>
+            </w:tcMar>
+          </w:tcPr>
+          <w:p>
+            <w:pPr>
+              <w:spacing w:after="0" w:line="260"/>
+            </w:pPr>
+            <w:r>
+              <w:rPr>
+                <w:rFonts w:ascii="Calibri" w:cs="Calibri" w:eastAsia="Calibri" w:hAnsi="Calibri"/>
+                <w:b/>
+                <w:bCs/>
+                <w:color w:val="1A1A1A"/>
+                <w:sz w:val="19"/>
+                <w:szCs w:val="19"/>
+              </w:rPr>
+              <w:t xml:space="preserve">src/components/</w:t>
+            </w:r>
+          </w:p>
+        </w:tc>
+        <w:tc>
+          <w:tcPr>
+            <w:tcW w:type="dxa" w:w="6426"/>
+            <w:tcMar>
+              <w:top w:type="dxa" w:w="80"/>
+              <w:left w:type="dxa" w:w="120"/>
+              <w:bottom w:type="dxa" w:w="80"/>
+              <w:right w:type="dxa" w:w="120"/>
+            </w:tcMar>
+          </w:tcPr>
+          <w:p>
+            <w:pPr>
+              <w:spacing w:after="0" w:line="260"/>
+            </w:pPr>
+            <w:r>
+              <w:rPr>
+                <w:rFonts w:ascii="Calibri" w:cs="Calibri" w:eastAsia="Calibri" w:hAnsi="Calibri"/>
+                <w:b w:val="false"/>
+                <w:bCs w:val="false"/>
+                <w:color w:val="1A1A1A"/>
+                <w:sz w:val="19"/>
+                <w:szCs w:val="19"/>
+              </w:rPr>
+              <w:t xml:space="preserve">The header carrying the customer / waiter switch, the order progress display, and the small shared pieces every screen is built from</w:t>
+            </w:r>
+          </w:p>
+        </w:tc>
+      </w:tr>
+      <w:tr>
+        <w:tc>
+          <w:tcPr>
+            <w:tcW w:type="dxa" w:w="2600"/>
+            <w:shd w:fill="F7F7F7" w:color="auto" w:val="clear"/>
+            <w:tcMar>
+              <w:top w:type="dxa" w:w="80"/>
+              <w:left w:type="dxa" w:w="120"/>
+              <w:bottom w:type="dxa" w:w="80"/>
+              <w:right w:type="dxa" w:w="120"/>
+            </w:tcMar>
+          </w:tcPr>
+          <w:p>
+            <w:pPr>
+              <w:spacing w:after="0" w:line="260"/>
+            </w:pPr>
+            <w:r>
+              <w:rPr>
+                <w:rFonts w:ascii="Calibri" w:cs="Calibri" w:eastAsia="Calibri" w:hAnsi="Calibri"/>
+                <w:b/>
+                <w:bCs/>
+                <w:color w:val="1A1A1A"/>
+                <w:sz w:val="19"/>
+                <w:szCs w:val="19"/>
+              </w:rPr>
+              <w:t xml:space="preserve">src/lib/</w:t>
+            </w:r>
+          </w:p>
+        </w:tc>
+        <w:tc>
+          <w:tcPr>
+            <w:tcW w:type="dxa" w:w="6426"/>
+            <w:shd w:fill="F7F7F7" w:color="auto" w:val="clear"/>
+            <w:tcMar>
+              <w:top w:type="dxa" w:w="80"/>
+              <w:left w:type="dxa" w:w="120"/>
+              <w:bottom w:type="dxa" w:w="80"/>
+              <w:right w:type="dxa" w:w="120"/>
+            </w:tcMar>
+          </w:tcPr>
+          <w:p>
+            <w:pPr>
+              <w:spacing w:after="0" w:line="260"/>
+            </w:pPr>
+            <w:r>
+              <w:rPr>
+                <w:rFonts w:ascii="Calibri" w:cs="Calibri" w:eastAsia="Calibri" w:hAnsi="Calibri"/>
+                <w:b w:val="false"/>
+                <w:bCs w:val="false"/>
+                <w:color w:val="1A1A1A"/>
+                <w:sz w:val="19"/>
+                <w:szCs w:val="19"/>
+              </w:rPr>
+              <w:t xml:space="preserve">The database client, the browser-held session and basket, the waiting-time calculation, and the validation applied to every request body</w:t>
+            </w:r>
+          </w:p>
+        </w:tc>
+      </w:tr>
+      <w:tr>
+        <w:tc>
+          <w:tcPr>
+            <w:tcW w:type="dxa" w:w="2600"/>
+            <w:tcMar>
+              <w:top w:type="dxa" w:w="80"/>
+              <w:left w:type="dxa" w:w="120"/>
+              <w:bottom w:type="dxa" w:w="80"/>
+              <w:right w:type="dxa" w:w="120"/>
+            </w:tcMar>
+          </w:tcPr>
+          <w:p>
+            <w:pPr>
+              <w:spacing w:after="0" w:line="260"/>
+            </w:pPr>
+            <w:r>
+              <w:rPr>
+                <w:rFonts w:ascii="Calibri" w:cs="Calibri" w:eastAsia="Calibri" w:hAnsi="Calibri"/>
+                <w:b/>
+                <w:bCs/>
+                <w:color w:val="1A1A1A"/>
+                <w:sz w:val="19"/>
+                <w:szCs w:val="19"/>
+              </w:rPr>
+              <w:t xml:space="preserve">docs/</w:t>
+            </w:r>
+          </w:p>
+        </w:tc>
+        <w:tc>
+          <w:tcPr>
+            <w:tcW w:type="dxa" w:w="6426"/>
+            <w:tcMar>
+              <w:top w:type="dxa" w:w="80"/>
+              <w:left w:type="dxa" w:w="120"/>
+              <w:bottom w:type="dxa" w:w="80"/>
+              <w:right w:type="dxa" w:w="120"/>
+            </w:tcMar>
+          </w:tcPr>
+          <w:p>
+            <w:pPr>
+              <w:spacing w:after="0" w:line="260"/>
+            </w:pPr>
+            <w:r>
+              <w:rPr>
+                <w:rFonts w:ascii="Calibri" w:cs="Calibri" w:eastAsia="Calibri" w:hAnsi="Calibri"/>
+                <w:b w:val="false"/>
+                <w:bCs w:val="false"/>
+                <w:color w:val="1A1A1A"/>
+                <w:sz w:val="19"/>
+                <w:szCs w:val="19"/>
+              </w:rPr>
+              <w:t xml:space="preserve">The generator that produces the seed spreadsheet and seed data together, and the source of this document</w:t>
+            </w:r>
+          </w:p>
+        </w:tc>
+      </w:tr>
+    </w:tbl>
+    <w:p>
+      <w:pPr>
+        <w:spacing w:after="120" w:line="276"/>
+      </w:pPr>
+      <w:r>
+        <w:rPr>
+          <w:rFonts w:ascii="Calibri" w:cs="Calibri" w:eastAsia="Calibri" w:hAnsi="Calibri"/>
+          <w:color w:val="1A1A1A"/>
+          <w:sz w:val="21"/>
+          <w:szCs w:val="21"/>
+        </w:rPr>
+        <w:t xml:space="preserve">Two rules shape where code lives. Anything that decides money or time — prices, totals, the estimated wait — is computed on the server from the database, never accepted from the browser. And the waiting-time calculation exists in exactly two places that are kept deliberately identical: src/lib/wait-time.ts for live orders and docs/generate-seed-data.py for seeded ones, so that both are quoted on the same rules and the sample data cannot contradict the application.</w:t>
       </w:r>
     </w:p>
     <w:p>
@@ -3661,6 +4149,1046 @@
     </w:tbl>
     <w:p>
       <w:pPr>
+        <w:spacing w:after="120"/>
+      </w:pPr>
+    </w:p>
+    <w:tbl>
+      <w:tblPr>
+        <w:tblW w:type="dxa" w:w="9026"/>
+        <w:tblBorders>
+          <w:top w:val="single" w:color="D9D9D9" w:sz="2"/>
+          <w:left w:val="single" w:color="D9D9D9" w:sz="2"/>
+          <w:bottom w:val="single" w:color="D9D9D9" w:sz="2"/>
+          <w:right w:val="single" w:color="D9D9D9" w:sz="2"/>
+          <w:insideH w:val="single" w:color="D9D9D9" w:sz="2"/>
+          <w:insideV w:val="single" w:color="D9D9D9" w:sz="2"/>
+        </w:tblBorders>
+      </w:tblPr>
+      <w:tblGrid>
+        <w:gridCol w:w="1100"/>
+        <w:gridCol w:w="3200"/>
+        <w:gridCol w:w="4726"/>
+      </w:tblGrid>
+      <w:tr>
+        <w:trPr>
+          <w:tblHeader/>
+        </w:trPr>
+        <w:tc>
+          <w:tcPr>
+            <w:tcW w:type="dxa" w:w="1100"/>
+            <w:shd w:fill="1A1A1A" w:color="auto" w:val="clear"/>
+            <w:tcMar>
+              <w:top w:type="dxa" w:w="80"/>
+              <w:left w:type="dxa" w:w="120"/>
+              <w:bottom w:type="dxa" w:w="80"/>
+              <w:right w:type="dxa" w:w="120"/>
+            </w:tcMar>
+          </w:tcPr>
+          <w:p>
+            <w:pPr>
+              <w:spacing w:after="0" w:line="260"/>
+            </w:pPr>
+            <w:r>
+              <w:rPr>
+                <w:rFonts w:ascii="Calibri" w:cs="Calibri" w:eastAsia="Calibri" w:hAnsi="Calibri"/>
+                <w:b/>
+                <w:bCs/>
+                <w:color w:val="FFFFFF"/>
+                <w:sz w:val="19"/>
+                <w:szCs w:val="19"/>
+              </w:rPr>
+              <w:t xml:space="preserve">#</w:t>
+            </w:r>
+          </w:p>
+        </w:tc>
+        <w:tc>
+          <w:tcPr>
+            <w:tcW w:type="dxa" w:w="3200"/>
+            <w:shd w:fill="1A1A1A" w:color="auto" w:val="clear"/>
+            <w:tcMar>
+              <w:top w:type="dxa" w:w="80"/>
+              <w:left w:type="dxa" w:w="120"/>
+              <w:bottom w:type="dxa" w:w="80"/>
+              <w:right w:type="dxa" w:w="120"/>
+            </w:tcMar>
+          </w:tcPr>
+          <w:p>
+            <w:pPr>
+              <w:spacing w:after="0" w:line="260"/>
+            </w:pPr>
+            <w:r>
+              <w:rPr>
+                <w:rFonts w:ascii="Calibri" w:cs="Calibri" w:eastAsia="Calibri" w:hAnsi="Calibri"/>
+                <w:b/>
+                <w:bCs/>
+                <w:color w:val="FFFFFF"/>
+                <w:sz w:val="19"/>
+                <w:szCs w:val="19"/>
+              </w:rPr>
+              <w:t xml:space="preserve">Entity</w:t>
+            </w:r>
+          </w:p>
+        </w:tc>
+        <w:tc>
+          <w:tcPr>
+            <w:tcW w:type="dxa" w:w="4726"/>
+            <w:shd w:fill="1A1A1A" w:color="auto" w:val="clear"/>
+            <w:tcMar>
+              <w:top w:type="dxa" w:w="80"/>
+              <w:left w:type="dxa" w:w="120"/>
+              <w:bottom w:type="dxa" w:w="80"/>
+              <w:right w:type="dxa" w:w="120"/>
+            </w:tcMar>
+          </w:tcPr>
+          <w:p>
+            <w:pPr>
+              <w:spacing w:after="0" w:line="260"/>
+            </w:pPr>
+            <w:r>
+              <w:rPr>
+                <w:rFonts w:ascii="Calibri" w:cs="Calibri" w:eastAsia="Calibri" w:hAnsi="Calibri"/>
+                <w:b/>
+                <w:bCs/>
+                <w:color w:val="FFFFFF"/>
+                <w:sz w:val="19"/>
+                <w:szCs w:val="19"/>
+              </w:rPr>
+              <w:t xml:space="preserve">How the implemented model differs</w:t>
+            </w:r>
+          </w:p>
+        </w:tc>
+      </w:tr>
+      <w:tr>
+        <w:tc>
+          <w:tcPr>
+            <w:tcW w:type="dxa" w:w="1100"/>
+            <w:tcMar>
+              <w:top w:type="dxa" w:w="80"/>
+              <w:left w:type="dxa" w:w="120"/>
+              <w:bottom w:type="dxa" w:w="80"/>
+              <w:right w:type="dxa" w:w="120"/>
+            </w:tcMar>
+          </w:tcPr>
+          <w:p>
+            <w:pPr>
+              <w:spacing w:after="0" w:line="260"/>
+            </w:pPr>
+            <w:r>
+              <w:rPr>
+                <w:rFonts w:ascii="Calibri" w:cs="Calibri" w:eastAsia="Calibri" w:hAnsi="Calibri"/>
+                <w:b/>
+                <w:bCs/>
+                <w:color w:val="1A1A1A"/>
+                <w:sz w:val="19"/>
+                <w:szCs w:val="19"/>
+              </w:rPr>
+              <w:t xml:space="preserve">001</w:t>
+            </w:r>
+          </w:p>
+        </w:tc>
+        <w:tc>
+          <w:tcPr>
+            <w:tcW w:type="dxa" w:w="3200"/>
+            <w:tcMar>
+              <w:top w:type="dxa" w:w="80"/>
+              <w:left w:type="dxa" w:w="120"/>
+              <w:bottom w:type="dxa" w:w="80"/>
+              <w:right w:type="dxa" w:w="120"/>
+            </w:tcMar>
+          </w:tcPr>
+          <w:p>
+            <w:pPr>
+              <w:spacing w:after="0" w:line="260"/>
+            </w:pPr>
+            <w:r>
+              <w:rPr>
+                <w:rFonts w:ascii="Calibri" w:cs="Calibri" w:eastAsia="Calibri" w:hAnsi="Calibri"/>
+                <w:b w:val="false"/>
+                <w:bCs w:val="false"/>
+                <w:color w:val="1A1A1A"/>
+                <w:sz w:val="19"/>
+                <w:szCs w:val="19"/>
+              </w:rPr>
+              <w:t xml:space="preserve">MenuItem</w:t>
+            </w:r>
+          </w:p>
+        </w:tc>
+        <w:tc>
+          <w:tcPr>
+            <w:tcW w:type="dxa" w:w="4726"/>
+            <w:tcMar>
+              <w:top w:type="dxa" w:w="80"/>
+              <w:left w:type="dxa" w:w="120"/>
+              <w:bottom w:type="dxa" w:w="80"/>
+              <w:right w:type="dxa" w:w="120"/>
+            </w:tcMar>
+          </w:tcPr>
+          <w:p>
+            <w:pPr>
+              <w:spacing w:after="0" w:line="260"/>
+            </w:pPr>
+            <w:r>
+              <w:rPr>
+                <w:rFonts w:ascii="Calibri" w:cs="Calibri" w:eastAsia="Calibri" w:hAnsi="Calibri"/>
+                <w:b w:val="false"/>
+                <w:bCs w:val="false"/>
+                <w:color w:val="1A1A1A"/>
+                <w:sz w:val="19"/>
+                <w:szCs w:val="19"/>
+              </w:rPr>
+              <w:t xml:space="preserve">preparation_time_minutes added — the brief requires it and the quoted wait is derived from it</w:t>
+            </w:r>
+          </w:p>
+        </w:tc>
+      </w:tr>
+      <w:tr>
+        <w:tc>
+          <w:tcPr>
+            <w:tcW w:type="dxa" w:w="1100"/>
+            <w:shd w:fill="F7F7F7" w:color="auto" w:val="clear"/>
+            <w:tcMar>
+              <w:top w:type="dxa" w:w="80"/>
+              <w:left w:type="dxa" w:w="120"/>
+              <w:bottom w:type="dxa" w:w="80"/>
+              <w:right w:type="dxa" w:w="120"/>
+            </w:tcMar>
+          </w:tcPr>
+          <w:p>
+            <w:pPr>
+              <w:spacing w:after="0" w:line="260"/>
+            </w:pPr>
+            <w:r>
+              <w:rPr>
+                <w:rFonts w:ascii="Calibri" w:cs="Calibri" w:eastAsia="Calibri" w:hAnsi="Calibri"/>
+                <w:b/>
+                <w:bCs/>
+                <w:color w:val="1A1A1A"/>
+                <w:sz w:val="19"/>
+                <w:szCs w:val="19"/>
+              </w:rPr>
+              <w:t xml:space="preserve">006</w:t>
+            </w:r>
+          </w:p>
+        </w:tc>
+        <w:tc>
+          <w:tcPr>
+            <w:tcW w:type="dxa" w:w="3200"/>
+            <w:shd w:fill="F7F7F7" w:color="auto" w:val="clear"/>
+            <w:tcMar>
+              <w:top w:type="dxa" w:w="80"/>
+              <w:left w:type="dxa" w:w="120"/>
+              <w:bottom w:type="dxa" w:w="80"/>
+              <w:right w:type="dxa" w:w="120"/>
+            </w:tcMar>
+          </w:tcPr>
+          <w:p>
+            <w:pPr>
+              <w:spacing w:after="0" w:line="260"/>
+            </w:pPr>
+            <w:r>
+              <w:rPr>
+                <w:rFonts w:ascii="Calibri" w:cs="Calibri" w:eastAsia="Calibri" w:hAnsi="Calibri"/>
+                <w:b w:val="false"/>
+                <w:bCs w:val="false"/>
+                <w:color w:val="1A1A1A"/>
+                <w:sz w:val="19"/>
+                <w:szCs w:val="19"/>
+              </w:rPr>
+              <w:t xml:space="preserve">CustomerOrder</w:t>
+            </w:r>
+          </w:p>
+        </w:tc>
+        <w:tc>
+          <w:tcPr>
+            <w:tcW w:type="dxa" w:w="4726"/>
+            <w:shd w:fill="F7F7F7" w:color="auto" w:val="clear"/>
+            <w:tcMar>
+              <w:top w:type="dxa" w:w="80"/>
+              <w:left w:type="dxa" w:w="120"/>
+              <w:bottom w:type="dxa" w:w="80"/>
+              <w:right w:type="dxa" w:w="120"/>
+            </w:tcMar>
+          </w:tcPr>
+          <w:p>
+            <w:pPr>
+              <w:spacing w:after="0" w:line="260"/>
+            </w:pPr>
+            <w:r>
+              <w:rPr>
+                <w:rFonts w:ascii="Calibri" w:cs="Calibri" w:eastAsia="Calibri" w:hAnsi="Calibri"/>
+                <w:b w:val="false"/>
+                <w:bCs w:val="false"/>
+                <w:color w:val="1A1A1A"/>
+                <w:sz w:val="19"/>
+                <w:szCs w:val="19"/>
+              </w:rPr>
+              <w:t xml:space="preserve">table_number added — without a login it is the only thing that says where to take the food</w:t>
+            </w:r>
+          </w:p>
+        </w:tc>
+      </w:tr>
+      <w:tr>
+        <w:tc>
+          <w:tcPr>
+            <w:tcW w:type="dxa" w:w="1100"/>
+            <w:tcMar>
+              <w:top w:type="dxa" w:w="80"/>
+              <w:left w:type="dxa" w:w="120"/>
+              <w:bottom w:type="dxa" w:w="80"/>
+              <w:right w:type="dxa" w:w="120"/>
+            </w:tcMar>
+          </w:tcPr>
+          <w:p>
+            <w:pPr>
+              <w:spacing w:after="0" w:line="260"/>
+            </w:pPr>
+            <w:r>
+              <w:rPr>
+                <w:rFonts w:ascii="Calibri" w:cs="Calibri" w:eastAsia="Calibri" w:hAnsi="Calibri"/>
+                <w:b/>
+                <w:bCs/>
+                <w:color w:val="1A1A1A"/>
+                <w:sz w:val="19"/>
+                <w:szCs w:val="19"/>
+              </w:rPr>
+              <w:t xml:space="preserve">007</w:t>
+            </w:r>
+          </w:p>
+        </w:tc>
+        <w:tc>
+          <w:tcPr>
+            <w:tcW w:type="dxa" w:w="3200"/>
+            <w:tcMar>
+              <w:top w:type="dxa" w:w="80"/>
+              <w:left w:type="dxa" w:w="120"/>
+              <w:bottom w:type="dxa" w:w="80"/>
+              <w:right w:type="dxa" w:w="120"/>
+            </w:tcMar>
+          </w:tcPr>
+          <w:p>
+            <w:pPr>
+              <w:spacing w:after="0" w:line="260"/>
+            </w:pPr>
+            <w:r>
+              <w:rPr>
+                <w:rFonts w:ascii="Calibri" w:cs="Calibri" w:eastAsia="Calibri" w:hAnsi="Calibri"/>
+                <w:b w:val="false"/>
+                <w:bCs w:val="false"/>
+                <w:color w:val="1A1A1A"/>
+                <w:sz w:val="19"/>
+                <w:szCs w:val="19"/>
+              </w:rPr>
+              <w:t xml:space="preserve">CustomerOrder</w:t>
+            </w:r>
+          </w:p>
+        </w:tc>
+        <w:tc>
+          <w:tcPr>
+            <w:tcW w:type="dxa" w:w="4726"/>
+            <w:tcMar>
+              <w:top w:type="dxa" w:w="80"/>
+              <w:left w:type="dxa" w:w="120"/>
+              <w:bottom w:type="dxa" w:w="80"/>
+              <w:right w:type="dxa" w:w="120"/>
+            </w:tcMar>
+          </w:tcPr>
+          <w:p>
+            <w:pPr>
+              <w:spacing w:after="0" w:line="260"/>
+            </w:pPr>
+            <w:r>
+              <w:rPr>
+                <w:rFonts w:ascii="Calibri" w:cs="Calibri" w:eastAsia="Calibri" w:hAnsi="Calibri"/>
+                <w:b w:val="false"/>
+                <w:bCs w:val="false"/>
+                <w:color w:val="1A1A1A"/>
+                <w:sz w:val="19"/>
+                <w:szCs w:val="19"/>
+              </w:rPr>
+              <w:t xml:space="preserve">status became a fixed set of four values instead of free text</w:t>
+            </w:r>
+          </w:p>
+        </w:tc>
+      </w:tr>
+      <w:tr>
+        <w:tc>
+          <w:tcPr>
+            <w:tcW w:type="dxa" w:w="1100"/>
+            <w:shd w:fill="F7F7F7" w:color="auto" w:val="clear"/>
+            <w:tcMar>
+              <w:top w:type="dxa" w:w="80"/>
+              <w:left w:type="dxa" w:w="120"/>
+              <w:bottom w:type="dxa" w:w="80"/>
+              <w:right w:type="dxa" w:w="120"/>
+            </w:tcMar>
+          </w:tcPr>
+          <w:p>
+            <w:pPr>
+              <w:spacing w:after="0" w:line="260"/>
+            </w:pPr>
+            <w:r>
+              <w:rPr>
+                <w:rFonts w:ascii="Calibri" w:cs="Calibri" w:eastAsia="Calibri" w:hAnsi="Calibri"/>
+                <w:b/>
+                <w:bCs/>
+                <w:color w:val="1A1A1A"/>
+                <w:sz w:val="19"/>
+                <w:szCs w:val="19"/>
+              </w:rPr>
+              <w:t xml:space="preserve">008</w:t>
+            </w:r>
+          </w:p>
+        </w:tc>
+        <w:tc>
+          <w:tcPr>
+            <w:tcW w:type="dxa" w:w="3200"/>
+            <w:shd w:fill="F7F7F7" w:color="auto" w:val="clear"/>
+            <w:tcMar>
+              <w:top w:type="dxa" w:w="80"/>
+              <w:left w:type="dxa" w:w="120"/>
+              <w:bottom w:type="dxa" w:w="80"/>
+              <w:right w:type="dxa" w:w="120"/>
+            </w:tcMar>
+          </w:tcPr>
+          <w:p>
+            <w:pPr>
+              <w:spacing w:after="0" w:line="260"/>
+            </w:pPr>
+            <w:r>
+              <w:rPr>
+                <w:rFonts w:ascii="Calibri" w:cs="Calibri" w:eastAsia="Calibri" w:hAnsi="Calibri"/>
+                <w:b w:val="false"/>
+                <w:bCs w:val="false"/>
+                <w:color w:val="1A1A1A"/>
+                <w:sz w:val="19"/>
+                <w:szCs w:val="19"/>
+              </w:rPr>
+              <w:t xml:space="preserve">OrderPreparation</w:t>
+            </w:r>
+          </w:p>
+        </w:tc>
+        <w:tc>
+          <w:tcPr>
+            <w:tcW w:type="dxa" w:w="4726"/>
+            <w:shd w:fill="F7F7F7" w:color="auto" w:val="clear"/>
+            <w:tcMar>
+              <w:top w:type="dxa" w:w="80"/>
+              <w:left w:type="dxa" w:w="120"/>
+              <w:bottom w:type="dxa" w:w="80"/>
+              <w:right w:type="dxa" w:w="120"/>
+            </w:tcMar>
+          </w:tcPr>
+          <w:p>
+            <w:pPr>
+              <w:spacing w:after="0" w:line="260"/>
+            </w:pPr>
+            <w:r>
+              <w:rPr>
+                <w:rFonts w:ascii="Calibri" w:cs="Calibri" w:eastAsia="Calibri" w:hAnsi="Calibri"/>
+                <w:b w:val="false"/>
+                <w:bCs w:val="false"/>
+                <w:color w:val="1A1A1A"/>
+                <w:sz w:val="19"/>
+                <w:szCs w:val="19"/>
+              </w:rPr>
+              <w:t xml:space="preserve">chef and bartender are each optional, but at least one is required</w:t>
+            </w:r>
+          </w:p>
+        </w:tc>
+      </w:tr>
+      <w:tr>
+        <w:tc>
+          <w:tcPr>
+            <w:tcW w:type="dxa" w:w="1100"/>
+            <w:tcMar>
+              <w:top w:type="dxa" w:w="80"/>
+              <w:left w:type="dxa" w:w="120"/>
+              <w:bottom w:type="dxa" w:w="80"/>
+              <w:right w:type="dxa" w:w="120"/>
+            </w:tcMar>
+          </w:tcPr>
+          <w:p>
+            <w:pPr>
+              <w:spacing w:after="0" w:line="260"/>
+            </w:pPr>
+            <w:r>
+              <w:rPr>
+                <w:rFonts w:ascii="Calibri" w:cs="Calibri" w:eastAsia="Calibri" w:hAnsi="Calibri"/>
+                <w:b/>
+                <w:bCs/>
+                <w:color w:val="1A1A1A"/>
+                <w:sz w:val="19"/>
+                <w:szCs w:val="19"/>
+              </w:rPr>
+              <w:t xml:space="preserve">009</w:t>
+            </w:r>
+          </w:p>
+        </w:tc>
+        <w:tc>
+          <w:tcPr>
+            <w:tcW w:type="dxa" w:w="3200"/>
+            <w:tcMar>
+              <w:top w:type="dxa" w:w="80"/>
+              <w:left w:type="dxa" w:w="120"/>
+              <w:bottom w:type="dxa" w:w="80"/>
+              <w:right w:type="dxa" w:w="120"/>
+            </w:tcMar>
+          </w:tcPr>
+          <w:p>
+            <w:pPr>
+              <w:spacing w:after="0" w:line="260"/>
+            </w:pPr>
+            <w:r>
+              <w:rPr>
+                <w:rFonts w:ascii="Calibri" w:cs="Calibri" w:eastAsia="Calibri" w:hAnsi="Calibri"/>
+                <w:b w:val="false"/>
+                <w:bCs w:val="false"/>
+                <w:color w:val="1A1A1A"/>
+                <w:sz w:val="19"/>
+                <w:szCs w:val="19"/>
+              </w:rPr>
+              <w:t xml:space="preserve">OrderPreparation, Rating, Payment</w:t>
+            </w:r>
+          </w:p>
+        </w:tc>
+        <w:tc>
+          <w:tcPr>
+            <w:tcW w:type="dxa" w:w="4726"/>
+            <w:tcMar>
+              <w:top w:type="dxa" w:w="80"/>
+              <w:left w:type="dxa" w:w="120"/>
+              <w:bottom w:type="dxa" w:w="80"/>
+              <w:right w:type="dxa" w:w="120"/>
+            </w:tcMar>
+          </w:tcPr>
+          <w:p>
+            <w:pPr>
+              <w:spacing w:after="0" w:line="260"/>
+            </w:pPr>
+            <w:r>
+              <w:rPr>
+                <w:rFonts w:ascii="Calibri" w:cs="Calibri" w:eastAsia="Calibri" w:hAnsi="Calibri"/>
+                <w:b w:val="false"/>
+                <w:bCs w:val="false"/>
+                <w:color w:val="1A1A1A"/>
+                <w:sz w:val="19"/>
+                <w:szCs w:val="19"/>
+              </w:rPr>
+              <w:t xml:space="preserve">order_id made unique, enforcing the 1:1 and 1:0..1 the model declares</w:t>
+            </w:r>
+          </w:p>
+        </w:tc>
+      </w:tr>
+      <w:tr>
+        <w:tc>
+          <w:tcPr>
+            <w:tcW w:type="dxa" w:w="1100"/>
+            <w:shd w:fill="F7F7F7" w:color="auto" w:val="clear"/>
+            <w:tcMar>
+              <w:top w:type="dxa" w:w="80"/>
+              <w:left w:type="dxa" w:w="120"/>
+              <w:bottom w:type="dxa" w:w="80"/>
+              <w:right w:type="dxa" w:w="120"/>
+            </w:tcMar>
+          </w:tcPr>
+          <w:p>
+            <w:pPr>
+              <w:spacing w:after="0" w:line="260"/>
+            </w:pPr>
+            <w:r>
+              <w:rPr>
+                <w:rFonts w:ascii="Calibri" w:cs="Calibri" w:eastAsia="Calibri" w:hAnsi="Calibri"/>
+                <w:b/>
+                <w:bCs/>
+                <w:color w:val="1A1A1A"/>
+                <w:sz w:val="19"/>
+                <w:szCs w:val="19"/>
+              </w:rPr>
+              <w:t xml:space="preserve">010</w:t>
+            </w:r>
+          </w:p>
+        </w:tc>
+        <w:tc>
+          <w:tcPr>
+            <w:tcW w:type="dxa" w:w="3200"/>
+            <w:shd w:fill="F7F7F7" w:color="auto" w:val="clear"/>
+            <w:tcMar>
+              <w:top w:type="dxa" w:w="80"/>
+              <w:left w:type="dxa" w:w="120"/>
+              <w:bottom w:type="dxa" w:w="80"/>
+              <w:right w:type="dxa" w:w="120"/>
+            </w:tcMar>
+          </w:tcPr>
+          <w:p>
+            <w:pPr>
+              <w:spacing w:after="0" w:line="260"/>
+            </w:pPr>
+            <w:r>
+              <w:rPr>
+                <w:rFonts w:ascii="Calibri" w:cs="Calibri" w:eastAsia="Calibri" w:hAnsi="Calibri"/>
+                <w:b w:val="false"/>
+                <w:bCs w:val="false"/>
+                <w:color w:val="1A1A1A"/>
+                <w:sz w:val="19"/>
+                <w:szCs w:val="19"/>
+              </w:rPr>
+              <w:t xml:space="preserve">Payment</w:t>
+            </w:r>
+          </w:p>
+        </w:tc>
+        <w:tc>
+          <w:tcPr>
+            <w:tcW w:type="dxa" w:w="4726"/>
+            <w:shd w:fill="F7F7F7" w:color="auto" w:val="clear"/>
+            <w:tcMar>
+              <w:top w:type="dxa" w:w="80"/>
+              <w:left w:type="dxa" w:w="120"/>
+              <w:bottom w:type="dxa" w:w="80"/>
+              <w:right w:type="dxa" w:w="120"/>
+            </w:tcMar>
+          </w:tcPr>
+          <w:p>
+            <w:pPr>
+              <w:spacing w:after="0" w:line="260"/>
+            </w:pPr>
+            <w:r>
+              <w:rPr>
+                <w:rFonts w:ascii="Calibri" w:cs="Calibri" w:eastAsia="Calibri" w:hAnsi="Calibri"/>
+                <w:b w:val="false"/>
+                <w:bCs w:val="false"/>
+                <w:color w:val="1A1A1A"/>
+                <w:sz w:val="19"/>
+                <w:szCs w:val="19"/>
+              </w:rPr>
+              <w:t xml:space="preserve">is_pretend added, so the simulation is recorded in the data and not only on screen</w:t>
+            </w:r>
+          </w:p>
+        </w:tc>
+      </w:tr>
+      <w:tr>
+        <w:tc>
+          <w:tcPr>
+            <w:tcW w:type="dxa" w:w="1100"/>
+            <w:tcMar>
+              <w:top w:type="dxa" w:w="80"/>
+              <w:left w:type="dxa" w:w="120"/>
+              <w:bottom w:type="dxa" w:w="80"/>
+              <w:right w:type="dxa" w:w="120"/>
+            </w:tcMar>
+          </w:tcPr>
+          <w:p>
+            <w:pPr>
+              <w:spacing w:after="0" w:line="260"/>
+            </w:pPr>
+            <w:r>
+              <w:rPr>
+                <w:rFonts w:ascii="Calibri" w:cs="Calibri" w:eastAsia="Calibri" w:hAnsi="Calibri"/>
+                <w:b/>
+                <w:bCs/>
+                <w:color w:val="1A1A1A"/>
+                <w:sz w:val="19"/>
+                <w:szCs w:val="19"/>
+              </w:rPr>
+              <w:t xml:space="preserve">011</w:t>
+            </w:r>
+          </w:p>
+        </w:tc>
+        <w:tc>
+          <w:tcPr>
+            <w:tcW w:type="dxa" w:w="3200"/>
+            <w:tcMar>
+              <w:top w:type="dxa" w:w="80"/>
+              <w:left w:type="dxa" w:w="120"/>
+              <w:bottom w:type="dxa" w:w="80"/>
+              <w:right w:type="dxa" w:w="120"/>
+            </w:tcMar>
+          </w:tcPr>
+          <w:p>
+            <w:pPr>
+              <w:spacing w:after="0" w:line="260"/>
+            </w:pPr>
+            <w:r>
+              <w:rPr>
+                <w:rFonts w:ascii="Calibri" w:cs="Calibri" w:eastAsia="Calibri" w:hAnsi="Calibri"/>
+                <w:b w:val="false"/>
+                <w:bCs w:val="false"/>
+                <w:color w:val="1A1A1A"/>
+                <w:sz w:val="19"/>
+                <w:szCs w:val="19"/>
+              </w:rPr>
+              <w:t xml:space="preserve">Restaurant</w:t>
+            </w:r>
+          </w:p>
+        </w:tc>
+        <w:tc>
+          <w:tcPr>
+            <w:tcW w:type="dxa" w:w="4726"/>
+            <w:tcMar>
+              <w:top w:type="dxa" w:w="80"/>
+              <w:left w:type="dxa" w:w="120"/>
+              <w:bottom w:type="dxa" w:w="80"/>
+              <w:right w:type="dxa" w:w="120"/>
+            </w:tcMar>
+          </w:tcPr>
+          <w:p>
+            <w:pPr>
+              <w:spacing w:after="0" w:line="260"/>
+            </w:pPr>
+            <w:r>
+              <w:rPr>
+                <w:rFonts w:ascii="Calibri" w:cs="Calibri" w:eastAsia="Calibri" w:hAnsi="Calibri"/>
+                <w:b w:val="false"/>
+                <w:bCs w:val="false"/>
+                <w:color w:val="1A1A1A"/>
+                <w:sz w:val="19"/>
+                <w:szCs w:val="19"/>
+              </w:rPr>
+              <w:t xml:space="preserve">opening and closing times stored as times of day, not timestamps</w:t>
+            </w:r>
+          </w:p>
+        </w:tc>
+      </w:tr>
+      <w:tr>
+        <w:tc>
+          <w:tcPr>
+            <w:tcW w:type="dxa" w:w="1100"/>
+            <w:shd w:fill="F7F7F7" w:color="auto" w:val="clear"/>
+            <w:tcMar>
+              <w:top w:type="dxa" w:w="80"/>
+              <w:left w:type="dxa" w:w="120"/>
+              <w:bottom w:type="dxa" w:w="80"/>
+              <w:right w:type="dxa" w:w="120"/>
+            </w:tcMar>
+          </w:tcPr>
+          <w:p>
+            <w:pPr>
+              <w:spacing w:after="0" w:line="260"/>
+            </w:pPr>
+            <w:r>
+              <w:rPr>
+                <w:rFonts w:ascii="Calibri" w:cs="Calibri" w:eastAsia="Calibri" w:hAnsi="Calibri"/>
+                <w:b/>
+                <w:bCs/>
+                <w:color w:val="1A1A1A"/>
+                <w:sz w:val="19"/>
+                <w:szCs w:val="19"/>
+              </w:rPr>
+              <w:t xml:space="preserve">012</w:t>
+            </w:r>
+          </w:p>
+        </w:tc>
+        <w:tc>
+          <w:tcPr>
+            <w:tcW w:type="dxa" w:w="3200"/>
+            <w:shd w:fill="F7F7F7" w:color="auto" w:val="clear"/>
+            <w:tcMar>
+              <w:top w:type="dxa" w:w="80"/>
+              <w:left w:type="dxa" w:w="120"/>
+              <w:bottom w:type="dxa" w:w="80"/>
+              <w:right w:type="dxa" w:w="120"/>
+            </w:tcMar>
+          </w:tcPr>
+          <w:p>
+            <w:pPr>
+              <w:spacing w:after="0" w:line="260"/>
+            </w:pPr>
+            <w:r>
+              <w:rPr>
+                <w:rFonts w:ascii="Calibri" w:cs="Calibri" w:eastAsia="Calibri" w:hAnsi="Calibri"/>
+                <w:b w:val="false"/>
+                <w:bCs w:val="false"/>
+                <w:color w:val="1A1A1A"/>
+                <w:sz w:val="19"/>
+                <w:szCs w:val="19"/>
+              </w:rPr>
+              <w:t xml:space="preserve">Customer</w:t>
+            </w:r>
+          </w:p>
+        </w:tc>
+        <w:tc>
+          <w:tcPr>
+            <w:tcW w:type="dxa" w:w="4726"/>
+            <w:shd w:fill="F7F7F7" w:color="auto" w:val="clear"/>
+            <w:tcMar>
+              <w:top w:type="dxa" w:w="80"/>
+              <w:left w:type="dxa" w:w="120"/>
+              <w:bottom w:type="dxa" w:w="80"/>
+              <w:right w:type="dxa" w:w="120"/>
+            </w:tcMar>
+          </w:tcPr>
+          <w:p>
+            <w:pPr>
+              <w:spacing w:after="0" w:line="260"/>
+            </w:pPr>
+            <w:r>
+              <w:rPr>
+                <w:rFonts w:ascii="Calibri" w:cs="Calibri" w:eastAsia="Calibri" w:hAnsi="Calibri"/>
+                <w:b w:val="false"/>
+                <w:bCs w:val="false"/>
+                <w:color w:val="1A1A1A"/>
+                <w:sz w:val="19"/>
+                <w:szCs w:val="19"/>
+              </w:rPr>
+              <w:t xml:space="preserve">surname, phone and email made optional — nobody logs in to supply them</w:t>
+            </w:r>
+          </w:p>
+        </w:tc>
+      </w:tr>
+      <w:tr>
+        <w:tc>
+          <w:tcPr>
+            <w:tcW w:type="dxa" w:w="1100"/>
+            <w:tcMar>
+              <w:top w:type="dxa" w:w="80"/>
+              <w:left w:type="dxa" w:w="120"/>
+              <w:bottom w:type="dxa" w:w="80"/>
+              <w:right w:type="dxa" w:w="120"/>
+            </w:tcMar>
+          </w:tcPr>
+          <w:p>
+            <w:pPr>
+              <w:spacing w:after="0" w:line="260"/>
+            </w:pPr>
+            <w:r>
+              <w:rPr>
+                <w:rFonts w:ascii="Calibri" w:cs="Calibri" w:eastAsia="Calibri" w:hAnsi="Calibri"/>
+                <w:b/>
+                <w:bCs/>
+                <w:color w:val="1A1A1A"/>
+                <w:sz w:val="19"/>
+                <w:szCs w:val="19"/>
+              </w:rPr>
+              <w:t xml:space="preserve">013</w:t>
+            </w:r>
+          </w:p>
+        </w:tc>
+        <w:tc>
+          <w:tcPr>
+            <w:tcW w:type="dxa" w:w="3200"/>
+            <w:tcMar>
+              <w:top w:type="dxa" w:w="80"/>
+              <w:left w:type="dxa" w:w="120"/>
+              <w:bottom w:type="dxa" w:w="80"/>
+              <w:right w:type="dxa" w:w="120"/>
+            </w:tcMar>
+          </w:tcPr>
+          <w:p>
+            <w:pPr>
+              <w:spacing w:after="0" w:line="260"/>
+            </w:pPr>
+            <w:r>
+              <w:rPr>
+                <w:rFonts w:ascii="Calibri" w:cs="Calibri" w:eastAsia="Calibri" w:hAnsi="Calibri"/>
+                <w:b w:val="false"/>
+                <w:bCs w:val="false"/>
+                <w:color w:val="1A1A1A"/>
+                <w:sz w:val="19"/>
+                <w:szCs w:val="19"/>
+              </w:rPr>
+              <w:t xml:space="preserve">Menu</w:t>
+            </w:r>
+          </w:p>
+        </w:tc>
+        <w:tc>
+          <w:tcPr>
+            <w:tcW w:type="dxa" w:w="4726"/>
+            <w:tcMar>
+              <w:top w:type="dxa" w:w="80"/>
+              <w:left w:type="dxa" w:w="120"/>
+              <w:bottom w:type="dxa" w:w="80"/>
+              <w:right w:type="dxa" w:w="120"/>
+            </w:tcMar>
+          </w:tcPr>
+          <w:p>
+            <w:pPr>
+              <w:spacing w:after="0" w:line="260"/>
+            </w:pPr>
+            <w:r>
+              <w:rPr>
+                <w:rFonts w:ascii="Calibri" w:cs="Calibri" w:eastAsia="Calibri" w:hAnsi="Calibri"/>
+                <w:b w:val="false"/>
+                <w:bCs w:val="false"/>
+                <w:color w:val="1A1A1A"/>
+                <w:sz w:val="19"/>
+                <w:szCs w:val="19"/>
+              </w:rPr>
+              <w:t xml:space="preserve">status became a boolean, is_active</w:t>
+            </w:r>
+          </w:p>
+        </w:tc>
+      </w:tr>
+      <w:tr>
+        <w:tc>
+          <w:tcPr>
+            <w:tcW w:type="dxa" w:w="1100"/>
+            <w:shd w:fill="F7F7F7" w:color="auto" w:val="clear"/>
+            <w:tcMar>
+              <w:top w:type="dxa" w:w="80"/>
+              <w:left w:type="dxa" w:w="120"/>
+              <w:bottom w:type="dxa" w:w="80"/>
+              <w:right w:type="dxa" w:w="120"/>
+            </w:tcMar>
+          </w:tcPr>
+          <w:p>
+            <w:pPr>
+              <w:spacing w:after="0" w:line="260"/>
+            </w:pPr>
+            <w:r>
+              <w:rPr>
+                <w:rFonts w:ascii="Calibri" w:cs="Calibri" w:eastAsia="Calibri" w:hAnsi="Calibri"/>
+                <w:b/>
+                <w:bCs/>
+                <w:color w:val="1A1A1A"/>
+                <w:sz w:val="19"/>
+                <w:szCs w:val="19"/>
+              </w:rPr>
+              <w:t xml:space="preserve">014</w:t>
+            </w:r>
+          </w:p>
+        </w:tc>
+        <w:tc>
+          <w:tcPr>
+            <w:tcW w:type="dxa" w:w="3200"/>
+            <w:shd w:fill="F7F7F7" w:color="auto" w:val="clear"/>
+            <w:tcMar>
+              <w:top w:type="dxa" w:w="80"/>
+              <w:left w:type="dxa" w:w="120"/>
+              <w:bottom w:type="dxa" w:w="80"/>
+              <w:right w:type="dxa" w:w="120"/>
+            </w:tcMar>
+          </w:tcPr>
+          <w:p>
+            <w:pPr>
+              <w:spacing w:after="0" w:line="260"/>
+            </w:pPr>
+            <w:r>
+              <w:rPr>
+                <w:rFonts w:ascii="Calibri" w:cs="Calibri" w:eastAsia="Calibri" w:hAnsi="Calibri"/>
+                <w:b w:val="false"/>
+                <w:bCs w:val="false"/>
+                <w:color w:val="1A1A1A"/>
+                <w:sz w:val="19"/>
+                <w:szCs w:val="19"/>
+              </w:rPr>
+              <w:t xml:space="preserve">MenuItem</w:t>
+            </w:r>
+          </w:p>
+        </w:tc>
+        <w:tc>
+          <w:tcPr>
+            <w:tcW w:type="dxa" w:w="4726"/>
+            <w:shd w:fill="F7F7F7" w:color="auto" w:val="clear"/>
+            <w:tcMar>
+              <w:top w:type="dxa" w:w="80"/>
+              <w:left w:type="dxa" w:w="120"/>
+              <w:bottom w:type="dxa" w:w="80"/>
+              <w:right w:type="dxa" w:w="120"/>
+            </w:tcMar>
+          </w:tcPr>
+          <w:p>
+            <w:pPr>
+              <w:spacing w:after="0" w:line="260"/>
+            </w:pPr>
+            <w:r>
+              <w:rPr>
+                <w:rFonts w:ascii="Calibri" w:cs="Calibri" w:eastAsia="Calibri" w:hAnsi="Calibri"/>
+                <w:b w:val="false"/>
+                <w:bCs w:val="false"/>
+                <w:color w:val="1A1A1A"/>
+                <w:sz w:val="19"/>
+                <w:szCs w:val="19"/>
+              </w:rPr>
+              <w:t xml:space="preserve">emoji added, presentation only</w:t>
+            </w:r>
+          </w:p>
+        </w:tc>
+      </w:tr>
+      <w:tr>
+        <w:tc>
+          <w:tcPr>
+            <w:tcW w:type="dxa" w:w="1100"/>
+            <w:tcMar>
+              <w:top w:type="dxa" w:w="80"/>
+              <w:left w:type="dxa" w:w="120"/>
+              <w:bottom w:type="dxa" w:w="80"/>
+              <w:right w:type="dxa" w:w="120"/>
+            </w:tcMar>
+          </w:tcPr>
+          <w:p>
+            <w:pPr>
+              <w:spacing w:after="0" w:line="260"/>
+            </w:pPr>
+            <w:r>
+              <w:rPr>
+                <w:rFonts w:ascii="Calibri" w:cs="Calibri" w:eastAsia="Calibri" w:hAnsi="Calibri"/>
+                <w:b/>
+                <w:bCs/>
+                <w:color w:val="1A1A1A"/>
+                <w:sz w:val="19"/>
+                <w:szCs w:val="19"/>
+              </w:rPr>
+              <w:t xml:space="preserve">015</w:t>
+            </w:r>
+          </w:p>
+        </w:tc>
+        <w:tc>
+          <w:tcPr>
+            <w:tcW w:type="dxa" w:w="3200"/>
+            <w:tcMar>
+              <w:top w:type="dxa" w:w="80"/>
+              <w:left w:type="dxa" w:w="120"/>
+              <w:bottom w:type="dxa" w:w="80"/>
+              <w:right w:type="dxa" w:w="120"/>
+            </w:tcMar>
+          </w:tcPr>
+          <w:p>
+            <w:pPr>
+              <w:spacing w:after="0" w:line="260"/>
+            </w:pPr>
+            <w:r>
+              <w:rPr>
+                <w:rFonts w:ascii="Calibri" w:cs="Calibri" w:eastAsia="Calibri" w:hAnsi="Calibri"/>
+                <w:b w:val="false"/>
+                <w:bCs w:val="false"/>
+                <w:color w:val="1A1A1A"/>
+                <w:sz w:val="19"/>
+                <w:szCs w:val="19"/>
+              </w:rPr>
+              <w:t xml:space="preserve">CustomerOrder</w:t>
+            </w:r>
+          </w:p>
+        </w:tc>
+        <w:tc>
+          <w:tcPr>
+            <w:tcW w:type="dxa" w:w="4726"/>
+            <w:tcMar>
+              <w:top w:type="dxa" w:w="80"/>
+              <w:left w:type="dxa" w:w="120"/>
+              <w:bottom w:type="dxa" w:w="80"/>
+              <w:right w:type="dxa" w:w="120"/>
+            </w:tcMar>
+          </w:tcPr>
+          <w:p>
+            <w:pPr>
+              <w:spacing w:after="0" w:line="260"/>
+            </w:pPr>
+            <w:r>
+              <w:rPr>
+                <w:rFonts w:ascii="Calibri" w:cs="Calibri" w:eastAsia="Calibri" w:hAnsi="Calibri"/>
+                <w:b w:val="false"/>
+                <w:bCs w:val="false"/>
+                <w:color w:val="1A1A1A"/>
+                <w:sz w:val="19"/>
+                <w:szCs w:val="19"/>
+              </w:rPr>
+              <w:t xml:space="preserve">reference added — a short readable code such as ORD048</w:t>
+            </w:r>
+          </w:p>
+        </w:tc>
+      </w:tr>
+    </w:tbl>
+    <w:p>
+      <w:pPr>
         <w:spacing w:after="160"/>
       </w:pPr>
     </w:p>
@@ -3681,7 +5209,7 @@
           <w:sz w:val="20"/>
           <w:szCs w:val="20"/>
         </w:rPr>
-        <w:t xml:space="preserve">The brief says: where the build forces a change to the model, make the change and say why. Every such change is recorded in Section 4, and the final implemented model will be restated here once the schema is settled.</w:t>
+        <w:t xml:space="preserve">The brief says: where the build forces a change to the model, make the change and say why. All twelve entities above were implemented as designed; the differences are listed below and each one is justified in section 4. Every deviation is also marked in prisma/schema.prisma with the same change number, so the schema and this document can be read against each other.</w:t>
       </w:r>
     </w:p>
     <w:p>
@@ -3734,7 +5262,35 @@
           <w:sz w:val="21"/>
           <w:szCs w:val="21"/>
         </w:rPr>
-        <w:t xml:space="preserve">The deployed URL and the finished procedure are recorded here once the application is live.</w:t>
+        <w:t xml:space="preserve">Live at https://chowly-red.vercel.app, from https://github.com/Thatguy-tobi/Chowly.</w:t>
+      </w:r>
+    </w:p>
+    <w:p>
+      <w:pPr>
+        <w:spacing w:after="120" w:line="276"/>
+      </w:pPr>
+      <w:r>
+        <w:rPr>
+          <w:rFonts w:ascii="Calibri" w:cs="Calibri" w:eastAsia="Calibri" w:hAnsi="Calibri"/>
+          <w:color w:val="1A1A1A"/>
+          <w:sz w:val="21"/>
+          <w:szCs w:val="21"/>
+        </w:rPr>
+        <w:t xml:space="preserve">The procedure, as actually carried out: the repository was pushed to GitHub and imported into Vercel, which detected Next.js without any configuration. The two Neon connection strings were entered as environment variables before the first build rather than after — a missing DIRECT_URL fails the build outright, because migrations cannot run through the pooler. Vercel offers to provision a database during import; that was declined, since doing so would have created an empty one and overwritten the connection strings pointing at the database already holding the data. The build runs prisma migrate deploy before next build, so the schema is brought up to date on every deployment, and prisma generate is bound to the install step so the generated client cannot go stale against Vercel's dependency cache.</w:t>
+      </w:r>
+    </w:p>
+    <w:p>
+      <w:pPr>
+        <w:spacing w:after="120" w:line="276"/>
+      </w:pPr>
+      <w:r>
+        <w:rPr>
+          <w:rFonts w:ascii="Calibri" w:cs="Calibri" w:eastAsia="Calibri" w:hAnsi="Calibri"/>
+          <w:color w:val="1A1A1A"/>
+          <w:sz w:val="21"/>
+          <w:szCs w:val="21"/>
+        </w:rPr>
+        <w:t xml:space="preserve">The deployment was then verified by walking the whole assignment on the live site rather than by trusting that the build succeeded: an order was placed as a customer (ORD048, ₦16,300, quoted 33 minutes), prepared and served as the waiter, then rated, complained about and paid for as the customer again. The stored record was read back from the database and checked field by field against what the screens had shown.</w:t>
       </w:r>
     </w:p>
     <w:p>
@@ -3796,7 +5352,7 @@
           <w:sz w:val="21"/>
           <w:szCs w:val="21"/>
         </w:rPr>
-        <w:t xml:space="preserve">Every change to the model or to the shape of the application, with the reason for it. Entries marked AWAITING REASON are decisions that have been made but whose rationale has not yet been recorded — they are not written up until the reason is confirmed rather than guessed.</w:t>
+        <w:t xml:space="preserve">Every change to the model or to the shape of the application, with the reason for it. Nothing was written up until the reason for it was confirmed rather than guessed, which is why several entries were left open for days before being completed. Entries 018, 019 and 021 record faults rather than decisions: the brief asks for an honest history, and a log showing only good choices would not be one.</w:t>
       </w:r>
     </w:p>
     <w:tbl>
@@ -8396,7 +9952,7 @@
     </w:p>
     <w:p>
       <w:pPr>
-        <w:spacing w:after="80" w:line="276"/>
+        <w:spacing w:after="100" w:line="276"/>
       </w:pPr>
       <w:r>
         <w:rPr>
@@ -8421,18 +9977,75 @@
     </w:p>
     <w:p>
       <w:pPr>
-        <w:spacing w:after="120" w:line="276"/>
+        <w:spacing w:after="60" w:line="276"/>
       </w:pPr>
       <w:r>
         <w:rPr>
           <w:rFonts w:ascii="Calibri" w:cs="Calibri" w:eastAsia="Calibri" w:hAnsi="Calibri"/>
-          <w:i/>
-          <w:iCs/>
-          <w:color w:val="5F6368"/>
+          <w:b/>
+          <w:bCs/>
+          <w:color w:val="1A1A1A"/>
           <w:sz w:val="21"/>
           <w:szCs w:val="21"/>
         </w:rPr>
-        <w:t xml:space="preserve">Implemented behaviour — to be written once built.</w:t>
+        <w:t xml:space="preserve">Implemented behaviour</w:t>
+      </w:r>
+    </w:p>
+    <w:p>
+      <w:pPr>
+        <w:pStyle w:val="ListParagraph"/>
+        <w:numPr>
+          <w:ilvl w:val="0"/>
+          <w:numId w:val="2"/>
+        </w:numPr>
+        <w:spacing w:after="80" w:line="276"/>
+      </w:pPr>
+      <w:r>
+        <w:rPr>
+          <w:rFonts w:ascii="Calibri" w:cs="Calibri" w:eastAsia="Calibri" w:hAnsi="Calibri"/>
+          <w:color w:val="1A1A1A"/>
+          <w:sz w:val="21"/>
+          <w:szCs w:val="21"/>
+        </w:rPr>
+        <w:t xml:space="preserve">The customer picks their restaurant, gives a first name and a table number, and is taken to that restaurant's menu. A Customer row is found or created at that point, so every order has a real customer behind it even though nobody logged in.</w:t>
+      </w:r>
+    </w:p>
+    <w:p>
+      <w:pPr>
+        <w:pStyle w:val="ListParagraph"/>
+        <w:numPr>
+          <w:ilvl w:val="0"/>
+          <w:numId w:val="2"/>
+        </w:numPr>
+        <w:spacing w:after="80" w:line="276"/>
+      </w:pPr>
+      <w:r>
+        <w:rPr>
+          <w:rFonts w:ascii="Calibri" w:cs="Calibri" w:eastAsia="Calibri" w:hAnsi="Calibri"/>
+          <w:color w:val="1A1A1A"/>
+          <w:sz w:val="21"/>
+          <w:szCs w:val="21"/>
+        </w:rPr>
+        <w:t xml:space="preserve">The menu is fetched for that restaurant alone. Items that are unavailable, and menus that are not active, are excluded in the database query rather than fetched and then hidden, so an unavailable dish is never sent to the browser at all. Food and drinks are separated into two tabs, because somebody who wants a drink should not have to scroll past thirty dishes to find one.</w:t>
+      </w:r>
+    </w:p>
+    <w:p>
+      <w:pPr>
+        <w:pStyle w:val="ListParagraph"/>
+        <w:numPr>
+          <w:ilvl w:val="0"/>
+          <w:numId w:val="2"/>
+        </w:numPr>
+        <w:spacing w:after="80" w:line="276"/>
+      </w:pPr>
+      <w:r>
+        <w:rPr>
+          <w:rFonts w:ascii="Calibri" w:cs="Calibri" w:eastAsia="Calibri" w:hAnsi="Calibri"/>
+          <w:color w:val="1A1A1A"/>
+          <w:sz w:val="21"/>
+          <w:szCs w:val="21"/>
+        </w:rPr>
+        <w:t xml:space="preserve">Every item shows its name, description, price in naira and preparation time. The preparation time is shown on each row deliberately rather than hidden away: it is what the quoted wait is built from, and it lets someone in a hurry see that a grilled croaker is 33 minutes and a Sprite is 3 before they commit to either.</w:t>
       </w:r>
     </w:p>
     <w:p>
@@ -8454,7 +10067,7 @@
     </w:p>
     <w:p>
       <w:pPr>
-        <w:spacing w:after="80" w:line="276"/>
+        <w:spacing w:after="100" w:line="276"/>
       </w:pPr>
       <w:r>
         <w:rPr>
@@ -8479,18 +10092,75 @@
     </w:p>
     <w:p>
       <w:pPr>
-        <w:spacing w:after="120" w:line="276"/>
+        <w:spacing w:after="60" w:line="276"/>
       </w:pPr>
       <w:r>
         <w:rPr>
           <w:rFonts w:ascii="Calibri" w:cs="Calibri" w:eastAsia="Calibri" w:hAnsi="Calibri"/>
-          <w:i/>
-          <w:iCs/>
-          <w:color w:val="5F6368"/>
+          <w:b/>
+          <w:bCs/>
+          <w:color w:val="1A1A1A"/>
           <w:sz w:val="21"/>
           <w:szCs w:val="21"/>
         </w:rPr>
-        <w:t xml:space="preserve">Implemented behaviour — to be written once built.</w:t>
+        <w:t xml:space="preserve">Implemented behaviour</w:t>
+      </w:r>
+    </w:p>
+    <w:p>
+      <w:pPr>
+        <w:pStyle w:val="ListParagraph"/>
+        <w:numPr>
+          <w:ilvl w:val="0"/>
+          <w:numId w:val="2"/>
+        </w:numPr>
+        <w:spacing w:after="80" w:line="276"/>
+      </w:pPr>
+      <w:r>
+        <w:rPr>
+          <w:rFonts w:ascii="Calibri" w:cs="Calibri" w:eastAsia="Calibri" w:hAnsi="Calibri"/>
+          <w:color w:val="1A1A1A"/>
+          <w:sz w:val="21"/>
+          <w:szCs w:val="21"/>
+        </w:rPr>
+        <w:t xml:space="preserve">Chosen items are held in the browser while the customer is still deciding, but nothing the browser says about them is trusted. When the order is submitted, the server re-reads every item from the database, confirms it is available on an active menu belonging to that restaurant, and prices it from that row. A browser claiming its own price is ignored; an item from another restaurant is refused outright.</w:t>
+      </w:r>
+    </w:p>
+    <w:p>
+      <w:pPr>
+        <w:pStyle w:val="ListParagraph"/>
+        <w:numPr>
+          <w:ilvl w:val="0"/>
+          <w:numId w:val="2"/>
+        </w:numPr>
+        <w:spacing w:after="80" w:line="276"/>
+      </w:pPr>
+      <w:r>
+        <w:rPr>
+          <w:rFonts w:ascii="Calibri" w:cs="Calibri" w:eastAsia="Calibri" w:hAnsi="Calibri"/>
+          <w:color w:val="1A1A1A"/>
+          <w:sz w:val="21"/>
+          <w:szCs w:val="21"/>
+        </w:rPr>
+        <w:t xml:space="preserve">The total and the estimated wait are both computed on the server, so the figure the customer agreed to is the figure that is stored. The wait is not the sum of the preparation times — the kitchen and the bar work at the same time, and a kitchen does not cook two fish one after the other — so it is the slower of the two streams: the slowest food item plus three minutes for each extra food portion, against the slowest drink plus two minutes for each extra drink.</w:t>
+      </w:r>
+    </w:p>
+    <w:p>
+      <w:pPr>
+        <w:pStyle w:val="ListParagraph"/>
+        <w:numPr>
+          <w:ilvl w:val="0"/>
+          <w:numId w:val="2"/>
+        </w:numPr>
+        <w:spacing w:after="80" w:line="276"/>
+      </w:pPr>
+      <w:r>
+        <w:rPr>
+          <w:rFonts w:ascii="Calibri" w:cs="Calibri" w:eastAsia="Calibri" w:hAnsi="Calibri"/>
+          <w:color w:val="1A1A1A"/>
+          <w:sz w:val="21"/>
+          <w:szCs w:val="21"/>
+        </w:rPr>
+        <w:t xml:space="preserve">A waiter is assigned immediately, the order is given a short readable reference such as ORD048, and the customer lands on the order page. That page shows the reference, the table, the four stages of the order, and a countdown against the quoted time which ticks every second and turns red once the quoted time has passed. It refreshes itself, so the waiter's actions appear without the customer touching anything.</w:t>
       </w:r>
     </w:p>
     <w:p>
@@ -8512,7 +10182,7 @@
     </w:p>
     <w:p>
       <w:pPr>
-        <w:spacing w:after="80" w:line="276"/>
+        <w:spacing w:after="100" w:line="276"/>
       </w:pPr>
       <w:r>
         <w:rPr>
@@ -8537,18 +10207,75 @@
     </w:p>
     <w:p>
       <w:pPr>
-        <w:spacing w:after="120" w:line="276"/>
+        <w:spacing w:after="60" w:line="276"/>
       </w:pPr>
       <w:r>
         <w:rPr>
           <w:rFonts w:ascii="Calibri" w:cs="Calibri" w:eastAsia="Calibri" w:hAnsi="Calibri"/>
-          <w:i/>
-          <w:iCs/>
-          <w:color w:val="5F6368"/>
+          <w:b/>
+          <w:bCs/>
+          <w:color w:val="1A1A1A"/>
           <w:sz w:val="21"/>
           <w:szCs w:val="21"/>
         </w:rPr>
-        <w:t xml:space="preserve">Implemented behaviour — to be written once built.</w:t>
+        <w:t xml:space="preserve">Implemented behaviour</w:t>
+      </w:r>
+    </w:p>
+    <w:p>
+      <w:pPr>
+        <w:pStyle w:val="ListParagraph"/>
+        <w:numPr>
+          <w:ilvl w:val="0"/>
+          <w:numId w:val="2"/>
+        </w:numPr>
+        <w:spacing w:after="80" w:line="276"/>
+      </w:pPr>
+      <w:r>
+        <w:rPr>
+          <w:rFonts w:ascii="Calibri" w:cs="Calibri" w:eastAsia="Calibri" w:hAnsi="Calibri"/>
+          <w:color w:val="1A1A1A"/>
+          <w:sz w:val="21"/>
+          <w:szCs w:val="21"/>
+        </w:rPr>
+        <w:t xml:space="preserve">The waiter view lists that restaurant's orders with the work still outstanding at the top, oldest first — the table that has waited longest is the one most likely to complain. Orders that have been served but not paid sit below, and paid ones are folded away behind a toggle. Anything running past its quoted time is marked, and the queue refreshes on its own.</w:t>
+      </w:r>
+    </w:p>
+    <w:p>
+      <w:pPr>
+        <w:pStyle w:val="ListParagraph"/>
+        <w:numPr>
+          <w:ilvl w:val="0"/>
+          <w:numId w:val="2"/>
+        </w:numPr>
+        <w:spacing w:after="80" w:line="276"/>
+      </w:pPr>
+      <w:r>
+        <w:rPr>
+          <w:rFonts w:ascii="Calibri" w:cs="Calibri" w:eastAsia="Calibri" w:hAnsi="Calibri"/>
+          <w:color w:val="1A1A1A"/>
+          <w:sz w:val="21"/>
+          <w:szCs w:val="21"/>
+        </w:rPr>
+        <w:t xml:space="preserve">Opening an order splits it into what the kitchen owes and what the bar owes, so the waiter knows who to chase, and states plainly how far past the quoted time it is running. The chef and the bartender are chosen from that restaurant's own staff, and only the roles the order actually needs are offered: a drinks-only order shows no chef, because there is no food for a chef to have cooked.</w:t>
+      </w:r>
+    </w:p>
+    <w:p>
+      <w:pPr>
+        <w:pStyle w:val="ListParagraph"/>
+        <w:numPr>
+          <w:ilvl w:val="0"/>
+          <w:numId w:val="2"/>
+        </w:numPr>
+        <w:spacing w:after="80" w:line="276"/>
+      </w:pPr>
+      <w:r>
+        <w:rPr>
+          <w:rFonts w:ascii="Calibri" w:cs="Calibri" w:eastAsia="Calibri" w:hAnsi="Calibri"/>
+          <w:color w:val="1A1A1A"/>
+          <w:sz w:val="21"/>
+          <w:szCs w:val="21"/>
+        </w:rPr>
+        <w:t xml:space="preserve">Recording the pair writes the preparation record and moves the order to Preparing, which is what the customer sees change on their own screen. Marking it served is refused until that has happened — the button is disabled, and the server refuses it independently as well, so the step cannot be skipped from either direction. Serving stamps the finish time, which is what the order was ultimately judged against.</w:t>
       </w:r>
     </w:p>
     <w:p>
@@ -8570,7 +10297,7 @@
     </w:p>
     <w:p>
       <w:pPr>
-        <w:spacing w:after="80" w:line="276"/>
+        <w:spacing w:after="100" w:line="276"/>
       </w:pPr>
       <w:r>
         <w:rPr>
@@ -8595,18 +10322,75 @@
     </w:p>
     <w:p>
       <w:pPr>
-        <w:spacing w:after="120" w:line="276"/>
+        <w:spacing w:after="60" w:line="276"/>
       </w:pPr>
       <w:r>
         <w:rPr>
           <w:rFonts w:ascii="Calibri" w:cs="Calibri" w:eastAsia="Calibri" w:hAnsi="Calibri"/>
-          <w:i/>
-          <w:iCs/>
-          <w:color w:val="5F6368"/>
+          <w:b/>
+          <w:bCs/>
+          <w:color w:val="1A1A1A"/>
           <w:sz w:val="21"/>
           <w:szCs w:val="21"/>
         </w:rPr>
-        <w:t xml:space="preserve">Implemented behaviour — to be written once built.</w:t>
+        <w:t xml:space="preserve">Implemented behaviour</w:t>
+      </w:r>
+    </w:p>
+    <w:p>
+      <w:pPr>
+        <w:pStyle w:val="ListParagraph"/>
+        <w:numPr>
+          <w:ilvl w:val="0"/>
+          <w:numId w:val="2"/>
+        </w:numPr>
+        <w:spacing w:after="80" w:line="276"/>
+      </w:pPr>
+      <w:r>
+        <w:rPr>
+          <w:rFonts w:ascii="Calibri" w:cs="Calibri" w:eastAsia="Calibri" w:hAnsi="Calibri"/>
+          <w:color w:val="1A1A1A"/>
+          <w:sz w:val="21"/>
+          <w:szCs w:val="21"/>
+        </w:rPr>
+        <w:t xml:space="preserve">Both are stored against the order itself rather than against the restaurant, so a complaint can always be traced to the meal, the table and the staff who handled it. Both are refused if they claim to come from a customer other than the one who placed the order.</w:t>
+      </w:r>
+    </w:p>
+    <w:p>
+      <w:pPr>
+        <w:pStyle w:val="ListParagraph"/>
+        <w:numPr>
+          <w:ilvl w:val="0"/>
+          <w:numId w:val="2"/>
+        </w:numPr>
+        <w:spacing w:after="80" w:line="276"/>
+      </w:pPr>
+      <w:r>
+        <w:rPr>
+          <w:rFonts w:ascii="Calibri" w:cs="Calibri" w:eastAsia="Calibri" w:hAnsi="Calibri"/>
+          <w:color w:val="1A1A1A"/>
+          <w:sz w:val="21"/>
+          <w:szCs w:val="21"/>
+        </w:rPr>
+        <w:t xml:space="preserve">The two are deliberately governed by different rules. A rating is a verdict on a meal, so it is only accepted once the order has been served; the schema allows one rating per order, and rating again replaces the score rather than adding a second, because a customer changing their mind is reasonable while two ratings on one meal is not. A complaint is accepted at any stage, because the delay the brief describes is felt while the customer is still waiting — insisting the food arrive first would refuse the complaint at exactly the moment it is most justified.</w:t>
+      </w:r>
+    </w:p>
+    <w:p>
+      <w:pPr>
+        <w:pStyle w:val="ListParagraph"/>
+        <w:numPr>
+          <w:ilvl w:val="0"/>
+          <w:numId w:val="2"/>
+        </w:numPr>
+        <w:spacing w:after="80" w:line="276"/>
+      </w:pPr>
+      <w:r>
+        <w:rPr>
+          <w:rFonts w:ascii="Calibri" w:cs="Calibri" w:eastAsia="Calibri" w:hAnsi="Calibri"/>
+          <w:color w:val="1A1A1A"/>
+          <w:sz w:val="21"/>
+          <w:szCs w:val="21"/>
+        </w:rPr>
+        <w:t xml:space="preserve">Complaints appear on the waiter's copy of the order, so the person who can do something about it sees it.</w:t>
       </w:r>
     </w:p>
     <w:p>
@@ -8628,7 +10412,7 @@
     </w:p>
     <w:p>
       <w:pPr>
-        <w:spacing w:after="80" w:line="276"/>
+        <w:spacing w:after="100" w:line="276"/>
       </w:pPr>
       <w:r>
         <w:rPr>
@@ -8653,18 +10437,75 @@
     </w:p>
     <w:p>
       <w:pPr>
-        <w:spacing w:after="120" w:line="276"/>
+        <w:spacing w:after="60" w:line="276"/>
       </w:pPr>
       <w:r>
         <w:rPr>
           <w:rFonts w:ascii="Calibri" w:cs="Calibri" w:eastAsia="Calibri" w:hAnsi="Calibri"/>
-          <w:i/>
-          <w:iCs/>
-          <w:color w:val="5F6368"/>
+          <w:b/>
+          <w:bCs/>
+          <w:color w:val="1A1A1A"/>
           <w:sz w:val="21"/>
           <w:szCs w:val="21"/>
         </w:rPr>
-        <w:t xml:space="preserve">Implemented behaviour — to be written once built.</w:t>
+        <w:t xml:space="preserve">Implemented behaviour</w:t>
+      </w:r>
+    </w:p>
+    <w:p>
+      <w:pPr>
+        <w:pStyle w:val="ListParagraph"/>
+        <w:numPr>
+          <w:ilvl w:val="0"/>
+          <w:numId w:val="2"/>
+        </w:numPr>
+        <w:spacing w:after="80" w:line="276"/>
+      </w:pPr>
+      <w:r>
+        <w:rPr>
+          <w:rFonts w:ascii="Calibri" w:cs="Calibri" w:eastAsia="Calibri" w:hAnsi="Calibri"/>
+          <w:color w:val="1A1A1A"/>
+          <w:sz w:val="21"/>
+          <w:szCs w:val="21"/>
+        </w:rPr>
+        <w:t xml:space="preserve">No money moves and no card details are ever requested. The screen says so before the customer pays and again on the receipt afterwards.</w:t>
+      </w:r>
+    </w:p>
+    <w:p>
+      <w:pPr>
+        <w:pStyle w:val="ListParagraph"/>
+        <w:numPr>
+          <w:ilvl w:val="0"/>
+          <w:numId w:val="2"/>
+        </w:numPr>
+        <w:spacing w:after="80" w:line="276"/>
+      </w:pPr>
+      <w:r>
+        <w:rPr>
+          <w:rFonts w:ascii="Calibri" w:cs="Calibri" w:eastAsia="Calibri" w:hAnsi="Calibri"/>
+          <w:color w:val="1A1A1A"/>
+          <w:sz w:val="21"/>
+          <w:szCs w:val="21"/>
+        </w:rPr>
+        <w:t xml:space="preserve">The amount is taken from the order total held in the database, never from the request, so the sum paid cannot disagree with the sum owed. The payment carries a method, a unique transaction reference and an isPretend flag stored on the row itself — not merely wording on a screen — so anyone reading the payments table later can see that the transaction was simulated without needing to know how the interface was phrased.</w:t>
+      </w:r>
+    </w:p>
+    <w:p>
+      <w:pPr>
+        <w:pStyle w:val="ListParagraph"/>
+        <w:numPr>
+          <w:ilvl w:val="0"/>
+          <w:numId w:val="2"/>
+        </w:numPr>
+        <w:spacing w:after="80" w:line="276"/>
+      </w:pPr>
+      <w:r>
+        <w:rPr>
+          <w:rFonts w:ascii="Calibri" w:cs="Calibri" w:eastAsia="Calibri" w:hAnsi="Calibri"/>
+          <w:color w:val="1A1A1A"/>
+          <w:sz w:val="21"/>
+          <w:szCs w:val="21"/>
+        </w:rPr>
+        <w:t xml:space="preserve">Paying is only offered once the order has been served, a second payment against the same order is refused, and Paid cannot be reached any other way: the endpoint that changes an order's status will not set it. An order is therefore only ever marked paid when there is a payment record to account for it.</w:t>
       </w:r>
     </w:p>
     <w:p>
@@ -8698,7 +10539,457 @@
           <w:sz w:val="21"/>
           <w:szCs w:val="21"/>
         </w:rPr>
-        <w:t xml:space="preserve">A walkthrough a stranger can follow on the deployed link, including how to switch between the customer and the waiter. To be written once the application is deployed.</w:t>
+        <w:t xml:space="preserve">Open </w:t>
+      </w:r>
+      <w:r>
+        <w:rPr>
+          <w:rFonts w:ascii="Calibri" w:cs="Calibri" w:eastAsia="Calibri" w:hAnsi="Calibri"/>
+          <w:b/>
+          <w:bCs/>
+          <w:color w:val="1A1A1A"/>
+          <w:sz w:val="21"/>
+          <w:szCs w:val="21"/>
+        </w:rPr>
+        <w:t xml:space="preserve">https://chowly-red.vercel.app</w:t>
+      </w:r>
+      <w:r>
+        <w:rPr>
+          <w:rFonts w:ascii="Calibri" w:cs="Calibri" w:eastAsia="Calibri" w:hAnsi="Calibri"/>
+          <w:color w:val="1A1A1A"/>
+          <w:sz w:val="21"/>
+          <w:szCs w:val="21"/>
+        </w:rPr>
+        <w:t xml:space="preserve"> in any browser, on a phone or a computer. There is nothing to install, no account to create and no password. The steps below walk the whole story — ordering a meal, preparing it, serving it, complaining about it and paying for it — and take about three minutes.</w:t>
+      </w:r>
+    </w:p>
+    <w:p>
+      <w:pPr>
+        <w:pBdr>
+          <w:left w:val="single" w:color="C00000" w:sz="12" w:space="8"/>
+        </w:pBdr>
+        <w:spacing w:after="160" w:before="100" w:line="276"/>
+        <w:ind w:left="200"/>
+      </w:pPr>
+      <w:r>
+        <w:rPr>
+          <w:rFonts w:ascii="Calibri" w:cs="Calibri" w:eastAsia="Calibri" w:hAnsi="Calibri"/>
+          <w:i/>
+          <w:iCs/>
+          <w:color w:val="5F6368"/>
+          <w:sz w:val="20"/>
+          <w:szCs w:val="20"/>
+        </w:rPr>
+        <w:t xml:space="preserve">Nothing on this site takes money. The payment step is simulated, no card details are asked for at any point, and every payment is stored flagged as pretend.</w:t>
+      </w:r>
+    </w:p>
+    <w:p>
+      <w:pPr>
+        <w:pStyle w:val="Heading2"/>
+        <w:spacing w:after="120" w:before="260"/>
+      </w:pPr>
+      <w:r>
+        <w:rPr>
+          <w:rFonts w:ascii="Calibri" w:cs="Calibri" w:eastAsia="Calibri" w:hAnsi="Calibri"/>
+          <w:b/>
+          <w:bCs/>
+          <w:color w:val="C00000"/>
+          <w:sz w:val="23"/>
+          <w:szCs w:val="23"/>
+        </w:rPr>
+        <w:t xml:space="preserve">As the customer</w:t>
+      </w:r>
+    </w:p>
+    <w:p>
+      <w:pPr>
+        <w:pStyle w:val="ListParagraph"/>
+        <w:numPr>
+          <w:ilvl w:val="0"/>
+          <w:numId w:val="3"/>
+        </w:numPr>
+        <w:spacing w:after="80" w:line="276"/>
+      </w:pPr>
+      <w:r>
+        <w:rPr>
+          <w:rFonts w:ascii="Calibri" w:cs="Calibri" w:eastAsia="Calibri" w:hAnsi="Calibri"/>
+          <w:color w:val="1A1A1A"/>
+          <w:sz w:val="21"/>
+          <w:szCs w:val="21"/>
+        </w:rPr>
+        <w:t xml:space="preserve">Pick a restaurant from the twelve listed. Terra Kulture is a good one to try.</w:t>
+      </w:r>
+    </w:p>
+    <w:p>
+      <w:pPr>
+        <w:pStyle w:val="ListParagraph"/>
+        <w:numPr>
+          <w:ilvl w:val="0"/>
+          <w:numId w:val="3"/>
+        </w:numPr>
+        <w:spacing w:after="80" w:line="276"/>
+      </w:pPr>
+      <w:r>
+        <w:rPr>
+          <w:rFonts w:ascii="Calibri" w:cs="Calibri" w:eastAsia="Calibri" w:hAnsi="Calibri"/>
+          <w:color w:val="1A1A1A"/>
+          <w:sz w:val="21"/>
+          <w:szCs w:val="21"/>
+        </w:rPr>
+        <w:t xml:space="preserve">Type any first name and any table number, then press “Start ordering”. That is the whole sign-in — the name and table are what let a waiter bring food to the right person.</w:t>
+      </w:r>
+    </w:p>
+    <w:p>
+      <w:pPr>
+        <w:pStyle w:val="ListParagraph"/>
+        <w:numPr>
+          <w:ilvl w:val="0"/>
+          <w:numId w:val="3"/>
+        </w:numPr>
+        <w:spacing w:after="80" w:line="276"/>
+      </w:pPr>
+      <w:r>
+        <w:rPr>
+          <w:rFonts w:ascii="Calibri" w:cs="Calibri" w:eastAsia="Calibri" w:hAnsi="Calibri"/>
+          <w:color w:val="1A1A1A"/>
+          <w:sz w:val="21"/>
+          <w:szCs w:val="21"/>
+        </w:rPr>
+        <w:t xml:space="preserve">Add a dish from the Food tab and a drink from the Drinks tab. Each item shows its price and how long it takes to prepare.</w:t>
+      </w:r>
+    </w:p>
+    <w:p>
+      <w:pPr>
+        <w:pStyle w:val="ListParagraph"/>
+        <w:numPr>
+          <w:ilvl w:val="0"/>
+          <w:numId w:val="3"/>
+        </w:numPr>
+        <w:spacing w:after="80" w:line="276"/>
+      </w:pPr>
+      <w:r>
+        <w:rPr>
+          <w:rFonts w:ascii="Calibri" w:cs="Calibri" w:eastAsia="Calibri" w:hAnsi="Calibri"/>
+          <w:color w:val="1A1A1A"/>
+          <w:sz w:val="21"/>
+          <w:szCs w:val="21"/>
+        </w:rPr>
+        <w:t xml:space="preserve">Press “Review order”. The total and the estimated wait are shown. The wait is not the two preparation times added together, because the kitchen and the bar work at the same time — it is whichever of them takes longer.</w:t>
+      </w:r>
+    </w:p>
+    <w:p>
+      <w:pPr>
+        <w:pStyle w:val="ListParagraph"/>
+        <w:numPr>
+          <w:ilvl w:val="0"/>
+          <w:numId w:val="3"/>
+        </w:numPr>
+        <w:spacing w:after="80" w:line="276"/>
+      </w:pPr>
+      <w:r>
+        <w:rPr>
+          <w:rFonts w:ascii="Calibri" w:cs="Calibri" w:eastAsia="Calibri" w:hAnsi="Calibri"/>
+          <w:color w:val="1A1A1A"/>
+          <w:sz w:val="21"/>
+          <w:szCs w:val="21"/>
+        </w:rPr>
+        <w:t xml:space="preserve">Press “Place order”. You are given an order reference such as ORD048 and a countdown against the quoted time. Leave this page open, or come back to it later from “My orders”.</w:t>
+      </w:r>
+    </w:p>
+    <w:p>
+      <w:pPr>
+        <w:pStyle w:val="Heading2"/>
+        <w:spacing w:after="120" w:before="260"/>
+      </w:pPr>
+      <w:r>
+        <w:rPr>
+          <w:rFonts w:ascii="Calibri" w:cs="Calibri" w:eastAsia="Calibri" w:hAnsi="Calibri"/>
+          <w:b/>
+          <w:bCs/>
+          <w:color w:val="C00000"/>
+          <w:sz w:val="23"/>
+          <w:szCs w:val="23"/>
+        </w:rPr>
+        <w:t xml:space="preserve">As the waiter</w:t>
+      </w:r>
+    </w:p>
+    <w:p>
+      <w:pPr>
+        <w:pStyle w:val="ListParagraph"/>
+        <w:numPr>
+          <w:ilvl w:val="0"/>
+          <w:numId w:val="4"/>
+        </w:numPr>
+        <w:spacing w:after="80" w:line="276"/>
+      </w:pPr>
+      <w:r>
+        <w:rPr>
+          <w:rFonts w:ascii="Calibri" w:cs="Calibri" w:eastAsia="Calibri" w:hAnsi="Calibri"/>
+          <w:color w:val="1A1A1A"/>
+          <w:sz w:val="21"/>
+          <w:szCs w:val="21"/>
+        </w:rPr>
+        <w:t xml:space="preserve">At the top of the screen there is a switch reading customer / waiter. Press “waiter”. There is no login: the same person can be both, which is what the brief asks for.</w:t>
+      </w:r>
+    </w:p>
+    <w:p>
+      <w:pPr>
+        <w:pStyle w:val="ListParagraph"/>
+        <w:numPr>
+          <w:ilvl w:val="0"/>
+          <w:numId w:val="4"/>
+        </w:numPr>
+        <w:spacing w:after="80" w:line="276"/>
+      </w:pPr>
+      <w:r>
+        <w:rPr>
+          <w:rFonts w:ascii="Calibri" w:cs="Calibri" w:eastAsia="Calibri" w:hAnsi="Calibri"/>
+          <w:color w:val="1A1A1A"/>
+          <w:sz w:val="21"/>
+          <w:szCs w:val="21"/>
+        </w:rPr>
+        <w:t xml:space="preserve">You are now looking at the kitchen queue for that restaurant. The order you just placed is in it, along with the orders already in the system. Anything running past its quoted time is flagged.</w:t>
+      </w:r>
+    </w:p>
+    <w:p>
+      <w:pPr>
+        <w:pStyle w:val="ListParagraph"/>
+        <w:numPr>
+          <w:ilvl w:val="0"/>
+          <w:numId w:val="4"/>
+        </w:numPr>
+        <w:spacing w:after="80" w:line="276"/>
+      </w:pPr>
+      <w:r>
+        <w:rPr>
+          <w:rFonts w:ascii="Calibri" w:cs="Calibri" w:eastAsia="Calibri" w:hAnsi="Calibri"/>
+          <w:color w:val="1A1A1A"/>
+          <w:sz w:val="21"/>
+          <w:szCs w:val="21"/>
+        </w:rPr>
+        <w:t xml:space="preserve">Open your order. It is split into what the kitchen owes and what the bar owes.</w:t>
+      </w:r>
+    </w:p>
+    <w:p>
+      <w:pPr>
+        <w:pStyle w:val="ListParagraph"/>
+        <w:numPr>
+          <w:ilvl w:val="0"/>
+          <w:numId w:val="4"/>
+        </w:numPr>
+        <w:spacing w:after="80" w:line="276"/>
+      </w:pPr>
+      <w:r>
+        <w:rPr>
+          <w:rFonts w:ascii="Calibri" w:cs="Calibri" w:eastAsia="Calibri" w:hAnsi="Calibri"/>
+          <w:color w:val="1A1A1A"/>
+          <w:sz w:val="21"/>
+          <w:szCs w:val="21"/>
+        </w:rPr>
+        <w:t xml:space="preserve">Choose a chef and a bartender from the restaurant's staff, then press “Record preparation”. The order moves to Preparing.</w:t>
+      </w:r>
+    </w:p>
+    <w:p>
+      <w:pPr>
+        <w:pStyle w:val="ListParagraph"/>
+        <w:numPr>
+          <w:ilvl w:val="0"/>
+          <w:numId w:val="4"/>
+        </w:numPr>
+        <w:spacing w:after="80" w:line="276"/>
+      </w:pPr>
+      <w:r>
+        <w:rPr>
+          <w:rFonts w:ascii="Calibri" w:cs="Calibri" w:eastAsia="Calibri" w:hAnsi="Calibri"/>
+          <w:color w:val="1A1A1A"/>
+          <w:sz w:val="21"/>
+          <w:szCs w:val="21"/>
+        </w:rPr>
+        <w:t xml:space="preserve">Press “Mark as served”. Note that this button is disabled until a chef and bartender have been recorded — the order cannot be served by someone unnamed.</w:t>
+      </w:r>
+    </w:p>
+    <w:p>
+      <w:pPr>
+        <w:pStyle w:val="Heading2"/>
+        <w:spacing w:after="120" w:before="260"/>
+      </w:pPr>
+      <w:r>
+        <w:rPr>
+          <w:rFonts w:ascii="Calibri" w:cs="Calibri" w:eastAsia="Calibri" w:hAnsi="Calibri"/>
+          <w:b/>
+          <w:bCs/>
+          <w:color w:val="C00000"/>
+          <w:sz w:val="23"/>
+          <w:szCs w:val="23"/>
+        </w:rPr>
+        <w:t xml:space="preserve">Back as the customer</w:t>
+      </w:r>
+    </w:p>
+    <w:p>
+      <w:pPr>
+        <w:pStyle w:val="ListParagraph"/>
+        <w:numPr>
+          <w:ilvl w:val="0"/>
+          <w:numId w:val="5"/>
+        </w:numPr>
+        <w:spacing w:after="80" w:line="276"/>
+      </w:pPr>
+      <w:r>
+        <w:rPr>
+          <w:rFonts w:ascii="Calibri" w:cs="Calibri" w:eastAsia="Calibri" w:hAnsi="Calibri"/>
+          <w:color w:val="1A1A1A"/>
+          <w:sz w:val="21"/>
+          <w:szCs w:val="21"/>
+        </w:rPr>
+        <w:t xml:space="preserve">Switch back to customer at the top of the screen and open the order again. The chef and bartender the waiter recorded are now shown, and the order reads as served.</w:t>
+      </w:r>
+    </w:p>
+    <w:p>
+      <w:pPr>
+        <w:pStyle w:val="ListParagraph"/>
+        <w:numPr>
+          <w:ilvl w:val="0"/>
+          <w:numId w:val="5"/>
+        </w:numPr>
+        <w:spacing w:after="80" w:line="276"/>
+      </w:pPr>
+      <w:r>
+        <w:rPr>
+          <w:rFonts w:ascii="Calibri" w:cs="Calibri" w:eastAsia="Calibri" w:hAnsi="Calibri"/>
+          <w:color w:val="1A1A1A"/>
+          <w:sz w:val="21"/>
+          <w:szCs w:val="21"/>
+        </w:rPr>
+        <w:t xml:space="preserve">Give it a rating out of five and add a comment. Ratings only appear once the meal has arrived.</w:t>
+      </w:r>
+    </w:p>
+    <w:p>
+      <w:pPr>
+        <w:pStyle w:val="ListParagraph"/>
+        <w:numPr>
+          <w:ilvl w:val="0"/>
+          <w:numId w:val="5"/>
+        </w:numPr>
+        <w:spacing w:after="80" w:line="276"/>
+      </w:pPr>
+      <w:r>
+        <w:rPr>
+          <w:rFonts w:ascii="Calibri" w:cs="Calibri" w:eastAsia="Calibri" w:hAnsi="Calibri"/>
+          <w:color w:val="1A1A1A"/>
+          <w:sz w:val="21"/>
+          <w:szCs w:val="21"/>
+        </w:rPr>
+        <w:t xml:space="preserve">Press “Something wrong with this order?” to leave a complaint. A complaint can be made at any point, including while you are still waiting, because that is when a delay is actually felt. The waiter sees it on their copy of the order.</w:t>
+      </w:r>
+    </w:p>
+    <w:p>
+      <w:pPr>
+        <w:pStyle w:val="ListParagraph"/>
+        <w:numPr>
+          <w:ilvl w:val="0"/>
+          <w:numId w:val="5"/>
+        </w:numPr>
+        <w:spacing w:after="80" w:line="276"/>
+      </w:pPr>
+      <w:r>
+        <w:rPr>
+          <w:rFonts w:ascii="Calibri" w:cs="Calibri" w:eastAsia="Calibri" w:hAnsi="Calibri"/>
+          <w:color w:val="1A1A1A"/>
+          <w:sz w:val="21"/>
+          <w:szCs w:val="21"/>
+        </w:rPr>
+        <w:t xml:space="preserve">Press “Pay”. The receipt shows the amount, the method and a transaction reference, and states plainly that the payment was simulated.</w:t>
+      </w:r>
+    </w:p>
+    <w:p>
+      <w:pPr>
+        <w:pStyle w:val="ListParagraph"/>
+        <w:numPr>
+          <w:ilvl w:val="0"/>
+          <w:numId w:val="5"/>
+        </w:numPr>
+        <w:spacing w:after="80" w:line="276"/>
+      </w:pPr>
+      <w:r>
+        <w:rPr>
+          <w:rFonts w:ascii="Calibri" w:cs="Calibri" w:eastAsia="Calibri" w:hAnsi="Calibri"/>
+          <w:color w:val="1A1A1A"/>
+          <w:sz w:val="21"/>
+          <w:szCs w:val="21"/>
+        </w:rPr>
+        <w:t xml:space="preserve">Refresh the page, or close the browser and open the link again. The order, the rating, the complaint and the payment are all still there — they live in the database, not in the browser.</w:t>
+      </w:r>
+    </w:p>
+    <w:p>
+      <w:pPr>
+        <w:pStyle w:val="Heading2"/>
+        <w:spacing w:after="120" w:before="260"/>
+      </w:pPr>
+      <w:r>
+        <w:rPr>
+          <w:rFonts w:ascii="Calibri" w:cs="Calibri" w:eastAsia="Calibri" w:hAnsi="Calibri"/>
+          <w:b/>
+          <w:bCs/>
+          <w:color w:val="C00000"/>
+          <w:sz w:val="23"/>
+          <w:szCs w:val="23"/>
+        </w:rPr>
+        <w:t xml:space="preserve">Things worth trying</w:t>
+      </w:r>
+    </w:p>
+    <w:p>
+      <w:pPr>
+        <w:pStyle w:val="ListParagraph"/>
+        <w:numPr>
+          <w:ilvl w:val="0"/>
+          <w:numId w:val="2"/>
+        </w:numPr>
+        <w:spacing w:after="80" w:line="276"/>
+      </w:pPr>
+      <w:r>
+        <w:rPr>
+          <w:rFonts w:ascii="Calibri" w:cs="Calibri" w:eastAsia="Calibri" w:hAnsi="Calibri"/>
+          <w:color w:val="1A1A1A"/>
+          <w:sz w:val="21"/>
+          <w:szCs w:val="21"/>
+        </w:rPr>
+        <w:t xml:space="preserve">Switch to the waiter and change restaurant from the menu at the top. Your own table at the first restaurant is remembered separately, so switching back as a customer returns you to it — one person can be a customer in one place and a waiter in another.</w:t>
+      </w:r>
+    </w:p>
+    <w:p>
+      <w:pPr>
+        <w:pStyle w:val="ListParagraph"/>
+        <w:numPr>
+          <w:ilvl w:val="0"/>
+          <w:numId w:val="2"/>
+        </w:numPr>
+        <w:spacing w:after="80" w:line="276"/>
+      </w:pPr>
+      <w:r>
+        <w:rPr>
+          <w:rFonts w:ascii="Calibri" w:cs="Calibri" w:eastAsia="Calibri" w:hAnsi="Calibri"/>
+          <w:color w:val="1A1A1A"/>
+          <w:sz w:val="21"/>
+          <w:szCs w:val="21"/>
+        </w:rPr>
+        <w:t xml:space="preserve">Try to mark an order served without recording who prepared it. The interface will not let you, and neither will the server if asked directly.</w:t>
+      </w:r>
+    </w:p>
+    <w:p>
+      <w:pPr>
+        <w:pStyle w:val="ListParagraph"/>
+        <w:numPr>
+          <w:ilvl w:val="0"/>
+          <w:numId w:val="2"/>
+        </w:numPr>
+        <w:spacing w:after="80" w:line="276"/>
+      </w:pPr>
+      <w:r>
+        <w:rPr>
+          <w:rFonts w:ascii="Calibri" w:cs="Calibri" w:eastAsia="Calibri" w:hAnsi="Calibri"/>
+          <w:color w:val="1A1A1A"/>
+          <w:sz w:val="21"/>
+          <w:szCs w:val="21"/>
+        </w:rPr>
+        <w:t xml:space="preserve">Try to pay twice. The second attempt is refused.</w:t>
       </w:r>
     </w:p>
     <w:p>
@@ -8940,6 +11231,18 @@
       </w:pPr>
     </w:lvl>
   </w:abstractNum>
+  <w:abstractNum w:abstractNumId="3" w15:restartNumberingAfterBreak="0">
+    <w:multiLevelType w:val="hybridMultilevel"/>
+    <w:lvl w:ilvl="0" w15:tentative="1">
+      <w:start w:val="1"/>
+      <w:numFmt w:val="decimal"/>
+      <w:lvlText w:val="%1."/>
+      <w:lvlJc w:val="start"/>
+      <w:pPr>
+        <w:ind w:left="460" w:hanging="260"/>
+      </w:pPr>
+    </w:lvl>
+  </w:abstractNum>
   <w:num w:numId="1">
     <w:abstractNumId w:val="1"/>
     <w:lvlOverride w:ilvl="0">
@@ -8948,6 +11251,24 @@
   </w:num>
   <w:num w:numId="2">
     <w:abstractNumId w:val="2"/>
+    <w:lvlOverride w:ilvl="0">
+      <w:startOverride w:val="1"/>
+    </w:lvlOverride>
+  </w:num>
+  <w:num w:numId="3">
+    <w:abstractNumId w:val="3"/>
+    <w:lvlOverride w:ilvl="0">
+      <w:startOverride w:val="1"/>
+    </w:lvlOverride>
+  </w:num>
+  <w:num w:numId="4">
+    <w:abstractNumId w:val="3"/>
+    <w:lvlOverride w:ilvl="0">
+      <w:startOverride w:val="1"/>
+    </w:lvlOverride>
+  </w:num>
+  <w:num w:numId="5">
+    <w:abstractNumId w:val="3"/>
     <w:lvlOverride w:ilvl="0">
       <w:startOverride w:val="1"/>
     </w:lvlOverride>

</xml_diff>

<commit_message>
Support screenshots in the project log
</commit_message>
<xml_diff>
--- a/Chowly - Project Log.docx
+++ b/Chowly - Project Log.docx
@@ -12231,6 +12231,54 @@
     </w:p>
     <w:p>
       <w:pPr>
+        <w:spacing w:after="120" w:line="276"/>
+      </w:pPr>
+      <w:r>
+        <w:rPr>
+          <w:rFonts w:ascii="Calibri" w:cs="Calibri" w:eastAsia="Calibri" w:hAnsi="Calibri"/>
+          <w:i/>
+          <w:iCs/>
+          <w:color w:val="C00000"/>
+          <w:sz w:val="21"/>
+          <w:szCs w:val="21"/>
+        </w:rPr>
+        <w:t xml:space="preserve">[ screenshot not found: docs/screenshots/01-landing.png ]</w:t>
+      </w:r>
+    </w:p>
+    <w:p>
+      <w:pPr>
+        <w:spacing w:after="120" w:line="276"/>
+      </w:pPr>
+      <w:r>
+        <w:rPr>
+          <w:rFonts w:ascii="Calibri" w:cs="Calibri" w:eastAsia="Calibri" w:hAnsi="Calibri"/>
+          <w:i/>
+          <w:iCs/>
+          <w:color w:val="C00000"/>
+          <w:sz w:val="21"/>
+          <w:szCs w:val="21"/>
+        </w:rPr>
+        <w:t xml:space="preserve">[ screenshot not found: docs/screenshots/02-entry.png ]</w:t>
+      </w:r>
+    </w:p>
+    <w:p>
+      <w:pPr>
+        <w:spacing w:after="120" w:line="276"/>
+      </w:pPr>
+      <w:r>
+        <w:rPr>
+          <w:rFonts w:ascii="Calibri" w:cs="Calibri" w:eastAsia="Calibri" w:hAnsi="Calibri"/>
+          <w:i/>
+          <w:iCs/>
+          <w:color w:val="C00000"/>
+          <w:sz w:val="21"/>
+          <w:szCs w:val="21"/>
+        </w:rPr>
+        <w:t xml:space="preserve">[ screenshot not found: docs/screenshots/03-menu.png ]</w:t>
+      </w:r>
+    </w:p>
+    <w:p>
+      <w:pPr>
         <w:pStyle w:val="Heading2"/>
         <w:spacing w:after="120" w:before="260"/>
       </w:pPr>
@@ -12342,6 +12390,38 @@
           <w:szCs w:val="21"/>
         </w:rPr>
         <w:t xml:space="preserve">A waiter is assigned immediately, the order is given a short readable reference such as ORD048, and the customer lands on the order page. That page shows the reference, the table, the four stages of the order, and a countdown against the quoted time which ticks every second and turns red once the quoted time has passed. It refreshes itself, so the waiter's actions appear without the customer touching anything.</w:t>
+      </w:r>
+    </w:p>
+    <w:p>
+      <w:pPr>
+        <w:spacing w:after="120" w:line="276"/>
+      </w:pPr>
+      <w:r>
+        <w:rPr>
+          <w:rFonts w:ascii="Calibri" w:cs="Calibri" w:eastAsia="Calibri" w:hAnsi="Calibri"/>
+          <w:i/>
+          <w:iCs/>
+          <w:color w:val="C00000"/>
+          <w:sz w:val="21"/>
+          <w:szCs w:val="21"/>
+        </w:rPr>
+        <w:t xml:space="preserve">[ screenshot not found: docs/screenshots/04-cart.png ]</w:t>
+      </w:r>
+    </w:p>
+    <w:p>
+      <w:pPr>
+        <w:spacing w:after="120" w:line="276"/>
+      </w:pPr>
+      <w:r>
+        <w:rPr>
+          <w:rFonts w:ascii="Calibri" w:cs="Calibri" w:eastAsia="Calibri" w:hAnsi="Calibri"/>
+          <w:i/>
+          <w:iCs/>
+          <w:color w:val="C00000"/>
+          <w:sz w:val="21"/>
+          <w:szCs w:val="21"/>
+        </w:rPr>
+        <w:t xml:space="preserve">[ screenshot not found: docs/screenshots/05-order-placed.png ]</w:t>
       </w:r>
     </w:p>
     <w:p>
@@ -12461,6 +12541,22 @@
     </w:p>
     <w:p>
       <w:pPr>
+        <w:spacing w:after="120" w:line="276"/>
+      </w:pPr>
+      <w:r>
+        <w:rPr>
+          <w:rFonts w:ascii="Calibri" w:cs="Calibri" w:eastAsia="Calibri" w:hAnsi="Calibri"/>
+          <w:i/>
+          <w:iCs/>
+          <w:color w:val="C00000"/>
+          <w:sz w:val="21"/>
+          <w:szCs w:val="21"/>
+        </w:rPr>
+        <w:t xml:space="preserve">[ screenshot not found: docs/screenshots/06-waiter-order.png ]</w:t>
+      </w:r>
+    </w:p>
+    <w:p>
+      <w:pPr>
         <w:pStyle w:val="Heading2"/>
         <w:spacing w:after="120" w:before="260"/>
       </w:pPr>
@@ -12572,6 +12668,22 @@
           <w:szCs w:val="21"/>
         </w:rPr>
         <w:t xml:space="preserve">Complaints appear on the waiter's copy of the order, and the waiter can mark one resolved or reopen it. Without that the status stored against every complaint would read Open for ever, which would make it a label rather than a record of anything.</w:t>
+      </w:r>
+    </w:p>
+    <w:p>
+      <w:pPr>
+        <w:spacing w:after="120" w:line="276"/>
+      </w:pPr>
+      <w:r>
+        <w:rPr>
+          <w:rFonts w:ascii="Calibri" w:cs="Calibri" w:eastAsia="Calibri" w:hAnsi="Calibri"/>
+          <w:i/>
+          <w:iCs/>
+          <w:color w:val="C00000"/>
+          <w:sz w:val="21"/>
+          <w:szCs w:val="21"/>
+        </w:rPr>
+        <w:t xml:space="preserve">[ screenshot not found: docs/screenshots/07-rating.png ]</w:t>
       </w:r>
     </w:p>
     <w:p>
@@ -12691,6 +12803,38 @@
     </w:p>
     <w:p>
       <w:pPr>
+        <w:spacing w:after="120" w:line="276"/>
+      </w:pPr>
+      <w:r>
+        <w:rPr>
+          <w:rFonts w:ascii="Calibri" w:cs="Calibri" w:eastAsia="Calibri" w:hAnsi="Calibri"/>
+          <w:i/>
+          <w:iCs/>
+          <w:color w:val="C00000"/>
+          <w:sz w:val="21"/>
+          <w:szCs w:val="21"/>
+        </w:rPr>
+        <w:t xml:space="preserve">[ screenshot not found: docs/screenshots/08-payment.png ]</w:t>
+      </w:r>
+    </w:p>
+    <w:p>
+      <w:pPr>
+        <w:spacing w:after="120" w:line="276"/>
+      </w:pPr>
+      <w:r>
+        <w:rPr>
+          <w:rFonts w:ascii="Calibri" w:cs="Calibri" w:eastAsia="Calibri" w:hAnsi="Calibri"/>
+          <w:i/>
+          <w:iCs/>
+          <w:color w:val="C00000"/>
+          <w:sz w:val="21"/>
+          <w:szCs w:val="21"/>
+        </w:rPr>
+        <w:t xml:space="preserve">[ screenshot not found: docs/screenshots/09-paid.png ]</w:t>
+      </w:r>
+    </w:p>
+    <w:p>
+      <w:pPr>
         <w:pStyle w:val="Heading2"/>
         <w:spacing w:after="120" w:before="260"/>
       </w:pPr>
@@ -12806,6 +12950,22 @@
     </w:p>
     <w:p>
       <w:pPr>
+        <w:spacing w:after="120" w:line="276"/>
+      </w:pPr>
+      <w:r>
+        <w:rPr>
+          <w:rFonts w:ascii="Calibri" w:cs="Calibri" w:eastAsia="Calibri" w:hAnsi="Calibri"/>
+          <w:i/>
+          <w:iCs/>
+          <w:color w:val="C00000"/>
+          <w:sz w:val="21"/>
+          <w:szCs w:val="21"/>
+        </w:rPr>
+        <w:t xml:space="preserve">[ screenshot not found: docs/screenshots/10-admin.png ]</w:t>
+      </w:r>
+    </w:p>
+    <w:p>
+      <w:pPr>
         <w:pStyle w:val="Heading2"/>
         <w:spacing w:after="120" w:before="260"/>
       </w:pPr>
@@ -12917,6 +13077,22 @@
           <w:szCs w:val="21"/>
         </w:rPr>
         <w:t xml:space="preserve">This screen earned its place immediately by making change 022 visible: a reported average wait of 231 minutes against 26 quoted was what exposed that served orders had never recorded when they were served.</w:t>
+      </w:r>
+    </w:p>
+    <w:p>
+      <w:pPr>
+        <w:spacing w:after="120" w:line="276"/>
+      </w:pPr>
+      <w:r>
+        <w:rPr>
+          <w:rFonts w:ascii="Calibri" w:cs="Calibri" w:eastAsia="Calibri" w:hAnsi="Calibri"/>
+          <w:i/>
+          <w:iCs/>
+          <w:color w:val="C00000"/>
+          <w:sz w:val="21"/>
+          <w:szCs w:val="21"/>
+        </w:rPr>
+        <w:t xml:space="preserve">[ screenshot not found: docs/screenshots/11-dashboard.png ]</w:t>
       </w:r>
     </w:p>
     <w:p>

</xml_diff>

<commit_message>
Correct stale counts and duplicated text in the project log
</commit_message>
<xml_diff>
--- a/Chowly - Project Log.docx
+++ b/Chowly - Project Log.docx
@@ -1167,7 +1167,7 @@
                 <w:sz w:val="19"/>
                 <w:szCs w:val="19"/>
               </w:rPr>
-              <w:t xml:space="preserve">Done — 236 items across 12 restaurants</w:t>
+              <w:t xml:space="preserve">Done — 236 items seeded across 12 restaurants, plus any added since</w:t>
             </w:r>
           </w:p>
         </w:tc>
@@ -5295,7 +5295,7 @@
           <w:sz w:val="20"/>
           <w:szCs w:val="20"/>
         </w:rPr>
-        <w:t xml:space="preserve">The brief says: where the build forces a change to the model, make the change and say why. All twelve entities above were implemented as designed; the differences are listed below and each one is justified in section 4. Every deviation is also marked in prisma/schema.prisma with the same change number, so the schema and this document can be read against each other.</w:t>
+        <w:t xml:space="preserve">The brief says: where the build forces a change to the model, make the change and say why. All twelve entities were implemented as designed; the table above lists where the implementation differs, and each difference is justified in section 4. Every deviation is also marked in prisma/schema.prisma with the same change number, so the schema and this document can be read against each other.</w:t>
       </w:r>
     </w:p>
     <w:p>
@@ -5390,7 +5390,7 @@
           <w:sz w:val="21"/>
           <w:szCs w:val="21"/>
         </w:rPr>
-        <w:t xml:space="preserve">The repository is pushed to GitHub and imported into Vercel, which redeploys automatically on every push — so the commit history and the live link stay in step with each other. Two connection strings are held as environment variables: a pooled one used by the running application, and a direct one used for migrations.</w:t>
+        <w:t xml:space="preserve">Vercel redeploys automatically on every push, so the commit history and the live link stay in step with each other.</w:t>
       </w:r>
     </w:p>
     <w:p>
@@ -5404,7 +5404,7 @@
           <w:sz w:val="21"/>
           <w:szCs w:val="21"/>
         </w:rPr>
-        <w:t xml:space="preserve">That split is not decoration. Vercel runs the API routes as serverless functions, and each invocation can open its own database connection, which exhausts the connection limit quickly. Neon's pooled endpoint sits in front of the database to absorb that, while schema migrations need the direct endpoint because they cannot run through the pooler. Prisma is configured with both, and 'prisma generate' is bound to the install step so that the generated client cannot go stale against Vercel's dependency cache.</w:t>
+        <w:t xml:space="preserve">The two connection strings are not duplication. Vercel runs the API routes as serverless functions and each invocation can open its own database connection, which exhausts the limit quickly, so the running application goes through Neon's pooled endpoint. Migrations use the direct endpoint because they cannot run through a pooler at all. Prisma is configured with both.</w:t>
       </w:r>
     </w:p>
     <w:p>
@@ -5438,7 +5438,7 @@
           <w:sz w:val="21"/>
           <w:szCs w:val="21"/>
         </w:rPr>
-        <w:t xml:space="preserve">Every change to the model or to the shape of the application, with the reason for it. Nothing was written up until the reason for it was confirmed rather than guessed, which is why several entries were left open for days before being completed. Entries 018, 019 and 021 record faults rather than decisions: the brief asks for an honest history, and a log showing only good choices would not be one.</w:t>
+        <w:t xml:space="preserve">Every change to the model or to the shape of the application, with the reason for it. Nothing was written up until the reason for it was confirmed rather than guessed, which is why several entries were left open for days before being completed. Entries 018, 019, 021, 022, 029, 030, 031 and 032 record faults rather than decisions: the brief asks for an honest history, and a log showing only good choices would not be one.</w:t>
       </w:r>
     </w:p>
     <w:tbl>
@@ -9199,7 +9199,7 @@
                 <w:sz w:val="19"/>
                 <w:szCs w:val="19"/>
               </w:rPr>
-              <w:t xml:space="preserve">A restaurant here can carry thirty-four items and the platform holds two hundred and thirty-six, which is more than is reasonable to scroll. Searching spans food and drinks together, because somebody typing the name of a drink should find it without first knowing which tab it lives under. Separately, the spinners were replaced with outlines of the content that is coming: on the deployed site every query crosses to Frankfurt and back, which is long enough for a blank screen to look like a broken one.</w:t>
+              <w:t xml:space="preserve">A restaurant here can carry thirty-four items and the platform well over two hundred, which is more than is reasonable to scroll. Searching spans food and drinks together, because somebody typing the name of a drink should find it without first knowing which tab it lives under. Separately, the spinners were replaced with outlines of the content that is coming: on the deployed site every query crosses to Frankfurt and back, which is long enough for a blank screen to look like a broken one.</w:t>
             </w:r>
           </w:p>
         </w:tc>
@@ -9337,7 +9337,7 @@
                 <w:sz w:val="19"/>
                 <w:szCs w:val="19"/>
               </w:rPr>
-              <w:t xml:space="preserve">Beyond the brief. Twelve entities are worth little if nothing ever reads across them, so this joins orders, items, staff, ratings, complaints and payments into figures a manager would actually ask for: takings against money still owed, actual waits against quoted ones, how many orders beat their quote, the spread of ratings, and the same broken down per restaurant. It is deliberately group-wide — around fifty orders across twelve restaurants means any single one is four rows and a lot of white space. It also earned its place immediately by exposing change 022.</w:t>
+              <w:t xml:space="preserve">Beyond the brief. Twelve entities are worth little if nothing ever reads across them, so this joins orders, items, staff, ratings, complaints and payments into figures a manager would actually ask for: takings against money still owed, actual waits against quoted ones, how many orders beat their quote, the spread of ratings, and the same broken down per restaurant. It is deliberately group-wide — around fifty orders across a dozen or more restaurants means any single one is four rows and a lot of white space. It also earned its place immediately by exposing change 022.</w:t>
             </w:r>
           </w:p>
         </w:tc>
@@ -9895,7 +9895,7 @@
                 <w:sz w:val="19"/>
                 <w:szCs w:val="19"/>
               </w:rPr>
-              <w:t xml:space="preserve">Two artefacts of the generator that the dashboard made visible. Orders not deliberately delayed were given a margin of minus four to plus three minutes, so about half of them drifted a minute or two past the quote and the group reported 14% served on time — a figure that reads as a broken application rather than as pessimistic sample data. Ratings were scored one to two after a complaint and four to five otherwise, which left a permanent gap in the middle of the chart that looked like a fault in the rating feature. Now 39% on time, and three stars occur. The remaining severity is genuine: at least twenty complaints across forty-five orders was the requirement, so roughly half of them go wrong by design, and the average rating follows from that rather than from a defect.</w:t>
+              <w:t xml:space="preserve">Two artefacts of the generator that the dashboard made visible. Orders not deliberately delayed were given a margin of minus four to plus three minutes, so about half of them drifted a minute or two past the quote and the group reported 14% served on time — a figure that reads as a broken application rather than as pessimistic sample data. Ratings were scored one to two after a complaint and four to five otherwise, which left a permanent gap in the middle of the chart that looked like a fault in the rating feature. Now around two in five are served within the quote, and three stars occur. The remaining severity is genuine: at least twenty complaints across forty-five orders was the requirement, so roughly half of them go wrong by design, and the average rating follows from that rather than from a defect.</w:t>
             </w:r>
           </w:p>
         </w:tc>
@@ -12231,50 +12231,185 @@
     </w:p>
     <w:p>
       <w:pPr>
-        <w:spacing w:after="120" w:line="276"/>
+        <w:spacing w:after="60" w:before="140"/>
+      </w:pPr>
+      <w:r>
+        <w:drawing>
+          <wp:inline distT="0" distB="0" distL="0" distR="0">
+            <wp:extent cx="5524500" cy="5934075"/>
+            <wp:effectExtent t="0" r="0" b="0" l="0"/>
+            <wp:docPr id="1" name="" descr="" title=""/>
+            <wp:cNvGraphicFramePr>
+              <a:graphicFrameLocks xmlns:a="http://schemas.openxmlformats.org/drawingml/2006/main" noChangeAspect="1"/>
+            </wp:cNvGraphicFramePr>
+            <a:graphic xmlns:a="http://schemas.openxmlformats.org/drawingml/2006/main">
+              <a:graphicData uri="http://schemas.openxmlformats.org/drawingml/2006/picture">
+                <pic:pic xmlns:pic="http://schemas.openxmlformats.org/drawingml/2006/picture">
+                  <pic:nvPicPr>
+                    <pic:cNvPr id="0" name="" descr=""/>
+                    <pic:cNvPicPr>
+                      <a:picLocks noChangeAspect="1" noChangeArrowheads="1"/>
+                    </pic:cNvPicPr>
+                  </pic:nvPicPr>
+                  <pic:blipFill>
+                    <a:blip r:embed="rId7" cstate="none"/>
+                    <a:srcRect/>
+                    <a:stretch>
+                      <a:fillRect/>
+                    </a:stretch>
+                  </pic:blipFill>
+                  <pic:spPr bwMode="auto">
+                    <a:xfrm>
+                      <a:off x="0" y="0"/>
+                      <a:ext cx="5524500" cy="5934075"/>
+                    </a:xfrm>
+                    <a:prstGeom prst="rect">
+                      <a:avLst/>
+                    </a:prstGeom>
+                  </pic:spPr>
+                </pic:pic>
+              </a:graphicData>
+            </a:graphic>
+          </wp:inline>
+        </w:drawing>
+      </w:r>
+    </w:p>
+    <w:p>
+      <w:pPr>
+        <w:spacing w:after="200" w:line="276"/>
       </w:pPr>
       <w:r>
         <w:rPr>
           <w:rFonts w:ascii="Calibri" w:cs="Calibri" w:eastAsia="Calibri" w:hAnsi="Calibri"/>
           <w:i/>
           <w:iCs/>
-          <w:color w:val="C00000"/>
-          <w:sz w:val="21"/>
-          <w:szCs w:val="21"/>
+          <w:color w:val="5F6368"/>
+          <w:sz w:val="18"/>
+          <w:szCs w:val="18"/>
         </w:rPr>
-        <w:t xml:space="preserve">[ screenshot not found: docs/screenshots/01-landing.png ]</w:t>
+        <w:t xml:space="preserve">Choosing a restaurant. Each card shows opening hours and how many items are on the menu; one that cannot yet take orders is greyed out.</w:t>
       </w:r>
     </w:p>
     <w:p>
       <w:pPr>
-        <w:spacing w:after="120" w:line="276"/>
+        <w:spacing w:after="60" w:before="140"/>
+      </w:pPr>
+      <w:r>
+        <w:drawing>
+          <wp:inline distT="0" distB="0" distL="0" distR="0">
+            <wp:extent cx="5524500" cy="6267450"/>
+            <wp:effectExtent t="0" r="0" b="0" l="0"/>
+            <wp:docPr id="1" name="" descr="" title=""/>
+            <wp:cNvGraphicFramePr>
+              <a:graphicFrameLocks xmlns:a="http://schemas.openxmlformats.org/drawingml/2006/main" noChangeAspect="1"/>
+            </wp:cNvGraphicFramePr>
+            <a:graphic xmlns:a="http://schemas.openxmlformats.org/drawingml/2006/main">
+              <a:graphicData uri="http://schemas.openxmlformats.org/drawingml/2006/picture">
+                <pic:pic xmlns:pic="http://schemas.openxmlformats.org/drawingml/2006/picture">
+                  <pic:nvPicPr>
+                    <pic:cNvPr id="0" name="" descr=""/>
+                    <pic:cNvPicPr>
+                      <a:picLocks noChangeAspect="1" noChangeArrowheads="1"/>
+                    </pic:cNvPicPr>
+                  </pic:nvPicPr>
+                  <pic:blipFill>
+                    <a:blip r:embed="rId8" cstate="none"/>
+                    <a:srcRect/>
+                    <a:stretch>
+                      <a:fillRect/>
+                    </a:stretch>
+                  </pic:blipFill>
+                  <pic:spPr bwMode="auto">
+                    <a:xfrm>
+                      <a:off x="0" y="0"/>
+                      <a:ext cx="5524500" cy="6267450"/>
+                    </a:xfrm>
+                    <a:prstGeom prst="rect">
+                      <a:avLst/>
+                    </a:prstGeom>
+                  </pic:spPr>
+                </pic:pic>
+              </a:graphicData>
+            </a:graphic>
+          </wp:inline>
+        </w:drawing>
+      </w:r>
+    </w:p>
+    <w:p>
+      <w:pPr>
+        <w:spacing w:after="200" w:line="276"/>
       </w:pPr>
       <w:r>
         <w:rPr>
           <w:rFonts w:ascii="Calibri" w:cs="Calibri" w:eastAsia="Calibri" w:hAnsi="Calibri"/>
           <w:i/>
           <w:iCs/>
-          <w:color w:val="C00000"/>
-          <w:sz w:val="21"/>
-          <w:szCs w:val="21"/>
+          <w:color w:val="5F6368"/>
+          <w:sz w:val="18"/>
+          <w:szCs w:val="18"/>
         </w:rPr>
-        <w:t xml:space="preserve">[ screenshot not found: docs/screenshots/02-entry.png ]</w:t>
+        <w:t xml:space="preserve">A first name and a table number are the whole of signing in. The staff view is reached from the same screen.</w:t>
       </w:r>
     </w:p>
     <w:p>
       <w:pPr>
-        <w:spacing w:after="120" w:line="276"/>
+        <w:spacing w:after="60" w:before="140"/>
+      </w:pPr>
+      <w:r>
+        <w:drawing>
+          <wp:inline distT="0" distB="0" distL="0" distR="0">
+            <wp:extent cx="5524500" cy="6096000"/>
+            <wp:effectExtent t="0" r="0" b="0" l="0"/>
+            <wp:docPr id="1" name="" descr="" title=""/>
+            <wp:cNvGraphicFramePr>
+              <a:graphicFrameLocks xmlns:a="http://schemas.openxmlformats.org/drawingml/2006/main" noChangeAspect="1"/>
+            </wp:cNvGraphicFramePr>
+            <a:graphic xmlns:a="http://schemas.openxmlformats.org/drawingml/2006/main">
+              <a:graphicData uri="http://schemas.openxmlformats.org/drawingml/2006/picture">
+                <pic:pic xmlns:pic="http://schemas.openxmlformats.org/drawingml/2006/picture">
+                  <pic:nvPicPr>
+                    <pic:cNvPr id="0" name="" descr=""/>
+                    <pic:cNvPicPr>
+                      <a:picLocks noChangeAspect="1" noChangeArrowheads="1"/>
+                    </pic:cNvPicPr>
+                  </pic:nvPicPr>
+                  <pic:blipFill>
+                    <a:blip r:embed="rId9" cstate="none"/>
+                    <a:srcRect/>
+                    <a:stretch>
+                      <a:fillRect/>
+                    </a:stretch>
+                  </pic:blipFill>
+                  <pic:spPr bwMode="auto">
+                    <a:xfrm>
+                      <a:off x="0" y="0"/>
+                      <a:ext cx="5524500" cy="6096000"/>
+                    </a:xfrm>
+                    <a:prstGeom prst="rect">
+                      <a:avLst/>
+                    </a:prstGeom>
+                  </pic:spPr>
+                </pic:pic>
+              </a:graphicData>
+            </a:graphic>
+          </wp:inline>
+        </w:drawing>
+      </w:r>
+    </w:p>
+    <w:p>
+      <w:pPr>
+        <w:spacing w:after="200" w:line="276"/>
       </w:pPr>
       <w:r>
         <w:rPr>
           <w:rFonts w:ascii="Calibri" w:cs="Calibri" w:eastAsia="Calibri" w:hAnsi="Calibri"/>
           <w:i/>
           <w:iCs/>
-          <w:color w:val="C00000"/>
-          <w:sz w:val="21"/>
-          <w:szCs w:val="21"/>
+          <w:color w:val="5F6368"/>
+          <w:sz w:val="18"/>
+          <w:szCs w:val="18"/>
         </w:rPr>
-        <w:t xml:space="preserve">[ screenshot not found: docs/screenshots/03-menu.png ]</w:t>
+        <w:t xml:space="preserve">The menu, split into food and drinks, with a search across both. Every item carries its price and its preparation time.</w:t>
       </w:r>
     </w:p>
     <w:p>
@@ -12394,34 +12529,124 @@
     </w:p>
     <w:p>
       <w:pPr>
-        <w:spacing w:after="120" w:line="276"/>
+        <w:spacing w:after="60" w:before="140"/>
+      </w:pPr>
+      <w:r>
+        <w:drawing>
+          <wp:inline distT="0" distB="0" distL="0" distR="0">
+            <wp:extent cx="5524500" cy="6191250"/>
+            <wp:effectExtent t="0" r="0" b="0" l="0"/>
+            <wp:docPr id="1" name="" descr="" title=""/>
+            <wp:cNvGraphicFramePr>
+              <a:graphicFrameLocks xmlns:a="http://schemas.openxmlformats.org/drawingml/2006/main" noChangeAspect="1"/>
+            </wp:cNvGraphicFramePr>
+            <a:graphic xmlns:a="http://schemas.openxmlformats.org/drawingml/2006/main">
+              <a:graphicData uri="http://schemas.openxmlformats.org/drawingml/2006/picture">
+                <pic:pic xmlns:pic="http://schemas.openxmlformats.org/drawingml/2006/picture">
+                  <pic:nvPicPr>
+                    <pic:cNvPr id="0" name="" descr=""/>
+                    <pic:cNvPicPr>
+                      <a:picLocks noChangeAspect="1" noChangeArrowheads="1"/>
+                    </pic:cNvPicPr>
+                  </pic:nvPicPr>
+                  <pic:blipFill>
+                    <a:blip r:embed="rId10" cstate="none"/>
+                    <a:srcRect/>
+                    <a:stretch>
+                      <a:fillRect/>
+                    </a:stretch>
+                  </pic:blipFill>
+                  <pic:spPr bwMode="auto">
+                    <a:xfrm>
+                      <a:off x="0" y="0"/>
+                      <a:ext cx="5524500" cy="6191250"/>
+                    </a:xfrm>
+                    <a:prstGeom prst="rect">
+                      <a:avLst/>
+                    </a:prstGeom>
+                  </pic:spPr>
+                </pic:pic>
+              </a:graphicData>
+            </a:graphic>
+          </wp:inline>
+        </w:drawing>
+      </w:r>
+    </w:p>
+    <w:p>
+      <w:pPr>
+        <w:spacing w:after="200" w:line="276"/>
       </w:pPr>
       <w:r>
         <w:rPr>
           <w:rFonts w:ascii="Calibri" w:cs="Calibri" w:eastAsia="Calibri" w:hAnsi="Calibri"/>
           <w:i/>
           <w:iCs/>
-          <w:color w:val="C00000"/>
-          <w:sz w:val="21"/>
-          <w:szCs w:val="21"/>
+          <w:color w:val="5F6368"/>
+          <w:sz w:val="18"/>
+          <w:szCs w:val="18"/>
         </w:rPr>
-        <w:t xml:space="preserve">[ screenshot not found: docs/screenshots/04-cart.png ]</w:t>
+        <w:t xml:space="preserve">Barbecue ribs at 39 minutes and a doughnut at 8, both from the kitchen: the quoted wait is 42 minutes — the slower item plus three minutes for the second portion — not the 47 that adding them would give.</w:t>
       </w:r>
     </w:p>
     <w:p>
       <w:pPr>
-        <w:spacing w:after="120" w:line="276"/>
+        <w:spacing w:after="60" w:before="140"/>
+      </w:pPr>
+      <w:r>
+        <w:drawing>
+          <wp:inline distT="0" distB="0" distL="0" distR="0">
+            <wp:extent cx="5524500" cy="6353175"/>
+            <wp:effectExtent t="0" r="0" b="0" l="0"/>
+            <wp:docPr id="1" name="" descr="" title=""/>
+            <wp:cNvGraphicFramePr>
+              <a:graphicFrameLocks xmlns:a="http://schemas.openxmlformats.org/drawingml/2006/main" noChangeAspect="1"/>
+            </wp:cNvGraphicFramePr>
+            <a:graphic xmlns:a="http://schemas.openxmlformats.org/drawingml/2006/main">
+              <a:graphicData uri="http://schemas.openxmlformats.org/drawingml/2006/picture">
+                <pic:pic xmlns:pic="http://schemas.openxmlformats.org/drawingml/2006/picture">
+                  <pic:nvPicPr>
+                    <pic:cNvPr id="0" name="" descr=""/>
+                    <pic:cNvPicPr>
+                      <a:picLocks noChangeAspect="1" noChangeArrowheads="1"/>
+                    </pic:cNvPicPr>
+                  </pic:nvPicPr>
+                  <pic:blipFill>
+                    <a:blip r:embed="rId11" cstate="none"/>
+                    <a:srcRect/>
+                    <a:stretch>
+                      <a:fillRect/>
+                    </a:stretch>
+                  </pic:blipFill>
+                  <pic:spPr bwMode="auto">
+                    <a:xfrm>
+                      <a:off x="0" y="0"/>
+                      <a:ext cx="5524500" cy="6353175"/>
+                    </a:xfrm>
+                    <a:prstGeom prst="rect">
+                      <a:avLst/>
+                    </a:prstGeom>
+                  </pic:spPr>
+                </pic:pic>
+              </a:graphicData>
+            </a:graphic>
+          </wp:inline>
+        </w:drawing>
+      </w:r>
+    </w:p>
+    <w:p>
+      <w:pPr>
+        <w:spacing w:after="200" w:line="276"/>
       </w:pPr>
       <w:r>
         <w:rPr>
           <w:rFonts w:ascii="Calibri" w:cs="Calibri" w:eastAsia="Calibri" w:hAnsi="Calibri"/>
           <w:i/>
           <w:iCs/>
-          <w:color w:val="C00000"/>
-          <w:sz w:val="21"/>
-          <w:szCs w:val="21"/>
+          <w:color w:val="5F6368"/>
+          <w:sz w:val="18"/>
+          <w:szCs w:val="18"/>
         </w:rPr>
-        <w:t xml:space="preserve">[ screenshot not found: docs/screenshots/05-order-placed.png ]</w:t>
+        <w:t xml:space="preserve">The order as the customer follows it: reference, countdown against the quote, the four stages, and who is looking after it. The chef and bartender are still blank because the waiter has not recorded them yet.</w:t>
       </w:r>
     </w:p>
     <w:p>
@@ -12541,18 +12766,63 @@
     </w:p>
     <w:p>
       <w:pPr>
-        <w:spacing w:after="120" w:line="276"/>
+        <w:spacing w:after="60" w:before="140"/>
+      </w:pPr>
+      <w:r>
+        <w:drawing>
+          <wp:inline distT="0" distB="0" distL="0" distR="0">
+            <wp:extent cx="5524500" cy="5857875"/>
+            <wp:effectExtent t="0" r="0" b="0" l="0"/>
+            <wp:docPr id="1" name="" descr="" title=""/>
+            <wp:cNvGraphicFramePr>
+              <a:graphicFrameLocks xmlns:a="http://schemas.openxmlformats.org/drawingml/2006/main" noChangeAspect="1"/>
+            </wp:cNvGraphicFramePr>
+            <a:graphic xmlns:a="http://schemas.openxmlformats.org/drawingml/2006/main">
+              <a:graphicData uri="http://schemas.openxmlformats.org/drawingml/2006/picture">
+                <pic:pic xmlns:pic="http://schemas.openxmlformats.org/drawingml/2006/picture">
+                  <pic:nvPicPr>
+                    <pic:cNvPr id="0" name="" descr=""/>
+                    <pic:cNvPicPr>
+                      <a:picLocks noChangeAspect="1" noChangeArrowheads="1"/>
+                    </pic:cNvPicPr>
+                  </pic:nvPicPr>
+                  <pic:blipFill>
+                    <a:blip r:embed="rId12" cstate="none"/>
+                    <a:srcRect/>
+                    <a:stretch>
+                      <a:fillRect/>
+                    </a:stretch>
+                  </pic:blipFill>
+                  <pic:spPr bwMode="auto">
+                    <a:xfrm>
+                      <a:off x="0" y="0"/>
+                      <a:ext cx="5524500" cy="5857875"/>
+                    </a:xfrm>
+                    <a:prstGeom prst="rect">
+                      <a:avLst/>
+                    </a:prstGeom>
+                  </pic:spPr>
+                </pic:pic>
+              </a:graphicData>
+            </a:graphic>
+          </wp:inline>
+        </w:drawing>
+      </w:r>
+    </w:p>
+    <w:p>
+      <w:pPr>
+        <w:spacing w:after="200" w:line="276"/>
       </w:pPr>
       <w:r>
         <w:rPr>
           <w:rFonts w:ascii="Calibri" w:cs="Calibri" w:eastAsia="Calibri" w:hAnsi="Calibri"/>
           <w:i/>
           <w:iCs/>
-          <w:color w:val="C00000"/>
-          <w:sz w:val="21"/>
-          <w:szCs w:val="21"/>
+          <w:color w:val="5F6368"/>
+          <w:sz w:val="18"/>
+          <w:szCs w:val="18"/>
         </w:rPr>
-        <w:t xml:space="preserve">[ screenshot not found: docs/screenshots/06-waiter-order.png ]</w:t>
+        <w:t xml:space="preserve">The same order as the waiter works it, split into what the kitchen owes and what the bar owes. Both items are food, so only a chef is offered — the bar column reads “Nothing from the bar” and no bartender is asked for.</w:t>
       </w:r>
     </w:p>
     <w:p>
@@ -12672,18 +12942,63 @@
     </w:p>
     <w:p>
       <w:pPr>
-        <w:spacing w:after="120" w:line="276"/>
+        <w:spacing w:after="60" w:before="140"/>
+      </w:pPr>
+      <w:r>
+        <w:drawing>
+          <wp:inline distT="0" distB="0" distL="0" distR="0">
+            <wp:extent cx="5524500" cy="6467475"/>
+            <wp:effectExtent t="0" r="0" b="0" l="0"/>
+            <wp:docPr id="1" name="" descr="" title=""/>
+            <wp:cNvGraphicFramePr>
+              <a:graphicFrameLocks xmlns:a="http://schemas.openxmlformats.org/drawingml/2006/main" noChangeAspect="1"/>
+            </wp:cNvGraphicFramePr>
+            <a:graphic xmlns:a="http://schemas.openxmlformats.org/drawingml/2006/main">
+              <a:graphicData uri="http://schemas.openxmlformats.org/drawingml/2006/picture">
+                <pic:pic xmlns:pic="http://schemas.openxmlformats.org/drawingml/2006/picture">
+                  <pic:nvPicPr>
+                    <pic:cNvPr id="0" name="" descr=""/>
+                    <pic:cNvPicPr>
+                      <a:picLocks noChangeAspect="1" noChangeArrowheads="1"/>
+                    </pic:cNvPicPr>
+                  </pic:nvPicPr>
+                  <pic:blipFill>
+                    <a:blip r:embed="rId13" cstate="none"/>
+                    <a:srcRect/>
+                    <a:stretch>
+                      <a:fillRect/>
+                    </a:stretch>
+                  </pic:blipFill>
+                  <pic:spPr bwMode="auto">
+                    <a:xfrm>
+                      <a:off x="0" y="0"/>
+                      <a:ext cx="5524500" cy="6467475"/>
+                    </a:xfrm>
+                    <a:prstGeom prst="rect">
+                      <a:avLst/>
+                    </a:prstGeom>
+                  </pic:spPr>
+                </pic:pic>
+              </a:graphicData>
+            </a:graphic>
+          </wp:inline>
+        </w:drawing>
+      </w:r>
+    </w:p>
+    <w:p>
+      <w:pPr>
+        <w:spacing w:after="200" w:line="276"/>
       </w:pPr>
       <w:r>
         <w:rPr>
           <w:rFonts w:ascii="Calibri" w:cs="Calibri" w:eastAsia="Calibri" w:hAnsi="Calibri"/>
           <w:i/>
           <w:iCs/>
-          <w:color w:val="C00000"/>
-          <w:sz w:val="21"/>
-          <w:szCs w:val="21"/>
+          <w:color w:val="5F6368"/>
+          <w:sz w:val="18"/>
+          <w:szCs w:val="18"/>
         </w:rPr>
-        <w:t xml:space="preserve">[ screenshot not found: docs/screenshots/07-rating.png ]</w:t>
+        <w:t xml:space="preserve">Rating appears only once the meal has arrived. The complaint link below it is available at any stage, including while the customer is still waiting.</w:t>
       </w:r>
     </w:p>
     <w:p>
@@ -12803,34 +13118,124 @@
     </w:p>
     <w:p>
       <w:pPr>
-        <w:spacing w:after="120" w:line="276"/>
+        <w:spacing w:after="60" w:before="140"/>
+      </w:pPr>
+      <w:r>
+        <w:drawing>
+          <wp:inline distT="0" distB="0" distL="0" distR="0">
+            <wp:extent cx="5524500" cy="5838825"/>
+            <wp:effectExtent t="0" r="0" b="0" l="0"/>
+            <wp:docPr id="1" name="" descr="" title=""/>
+            <wp:cNvGraphicFramePr>
+              <a:graphicFrameLocks xmlns:a="http://schemas.openxmlformats.org/drawingml/2006/main" noChangeAspect="1"/>
+            </wp:cNvGraphicFramePr>
+            <a:graphic xmlns:a="http://schemas.openxmlformats.org/drawingml/2006/main">
+              <a:graphicData uri="http://schemas.openxmlformats.org/drawingml/2006/picture">
+                <pic:pic xmlns:pic="http://schemas.openxmlformats.org/drawingml/2006/picture">
+                  <pic:nvPicPr>
+                    <pic:cNvPr id="0" name="" descr=""/>
+                    <pic:cNvPicPr>
+                      <a:picLocks noChangeAspect="1" noChangeArrowheads="1"/>
+                    </pic:cNvPicPr>
+                  </pic:nvPicPr>
+                  <pic:blipFill>
+                    <a:blip r:embed="rId14" cstate="none"/>
+                    <a:srcRect/>
+                    <a:stretch>
+                      <a:fillRect/>
+                    </a:stretch>
+                  </pic:blipFill>
+                  <pic:spPr bwMode="auto">
+                    <a:xfrm>
+                      <a:off x="0" y="0"/>
+                      <a:ext cx="5524500" cy="5838825"/>
+                    </a:xfrm>
+                    <a:prstGeom prst="rect">
+                      <a:avLst/>
+                    </a:prstGeom>
+                  </pic:spPr>
+                </pic:pic>
+              </a:graphicData>
+            </a:graphic>
+          </wp:inline>
+        </w:drawing>
+      </w:r>
+    </w:p>
+    <w:p>
+      <w:pPr>
+        <w:spacing w:after="200" w:line="276"/>
       </w:pPr>
       <w:r>
         <w:rPr>
           <w:rFonts w:ascii="Calibri" w:cs="Calibri" w:eastAsia="Calibri" w:hAnsi="Calibri"/>
           <w:i/>
           <w:iCs/>
-          <w:color w:val="C00000"/>
-          <w:sz w:val="21"/>
-          <w:szCs w:val="21"/>
+          <w:color w:val="5F6368"/>
+          <w:sz w:val="18"/>
+          <w:szCs w:val="18"/>
         </w:rPr>
-        <w:t xml:space="preserve">[ screenshot not found: docs/screenshots/08-payment.png ]</w:t>
+        <w:t xml:space="preserve">Before serving: the methods are offered but the order cannot be paid for yet, and the screen says so.</w:t>
       </w:r>
     </w:p>
     <w:p>
       <w:pPr>
-        <w:spacing w:after="120" w:line="276"/>
+        <w:spacing w:after="60" w:before="140"/>
+      </w:pPr>
+      <w:r>
+        <w:drawing>
+          <wp:inline distT="0" distB="0" distL="0" distR="0">
+            <wp:extent cx="5524500" cy="6296025"/>
+            <wp:effectExtent t="0" r="0" b="0" l="0"/>
+            <wp:docPr id="1" name="" descr="" title=""/>
+            <wp:cNvGraphicFramePr>
+              <a:graphicFrameLocks xmlns:a="http://schemas.openxmlformats.org/drawingml/2006/main" noChangeAspect="1"/>
+            </wp:cNvGraphicFramePr>
+            <a:graphic xmlns:a="http://schemas.openxmlformats.org/drawingml/2006/main">
+              <a:graphicData uri="http://schemas.openxmlformats.org/drawingml/2006/picture">
+                <pic:pic xmlns:pic="http://schemas.openxmlformats.org/drawingml/2006/picture">
+                  <pic:nvPicPr>
+                    <pic:cNvPr id="0" name="" descr=""/>
+                    <pic:cNvPicPr>
+                      <a:picLocks noChangeAspect="1" noChangeArrowheads="1"/>
+                    </pic:cNvPicPr>
+                  </pic:nvPicPr>
+                  <pic:blipFill>
+                    <a:blip r:embed="rId15" cstate="none"/>
+                    <a:srcRect/>
+                    <a:stretch>
+                      <a:fillRect/>
+                    </a:stretch>
+                  </pic:blipFill>
+                  <pic:spPr bwMode="auto">
+                    <a:xfrm>
+                      <a:off x="0" y="0"/>
+                      <a:ext cx="5524500" cy="6296025"/>
+                    </a:xfrm>
+                    <a:prstGeom prst="rect">
+                      <a:avLst/>
+                    </a:prstGeom>
+                  </pic:spPr>
+                </pic:pic>
+              </a:graphicData>
+            </a:graphic>
+          </wp:inline>
+        </w:drawing>
+      </w:r>
+    </w:p>
+    <w:p>
+      <w:pPr>
+        <w:spacing w:after="200" w:line="276"/>
       </w:pPr>
       <w:r>
         <w:rPr>
           <w:rFonts w:ascii="Calibri" w:cs="Calibri" w:eastAsia="Calibri" w:hAnsi="Calibri"/>
           <w:i/>
           <w:iCs/>
-          <w:color w:val="C00000"/>
-          <w:sz w:val="21"/>
-          <w:szCs w:val="21"/>
+          <w:color w:val="5F6368"/>
+          <w:sz w:val="18"/>
+          <w:szCs w:val="18"/>
         </w:rPr>
-        <w:t xml:space="preserve">[ screenshot not found: docs/screenshots/09-paid.png ]</w:t>
+        <w:t xml:space="preserve">The receipt afterwards — amount, method, transaction reference and time, with the payment labelled as pretend. The same flag is stored on the row itself, not only shown here.</w:t>
       </w:r>
     </w:p>
     <w:p>
@@ -12950,18 +13355,63 @@
     </w:p>
     <w:p>
       <w:pPr>
-        <w:spacing w:after="120" w:line="276"/>
+        <w:spacing w:after="60" w:before="140"/>
+      </w:pPr>
+      <w:r>
+        <w:drawing>
+          <wp:inline distT="0" distB="0" distL="0" distR="0">
+            <wp:extent cx="5524500" cy="6096000"/>
+            <wp:effectExtent t="0" r="0" b="0" l="0"/>
+            <wp:docPr id="1" name="" descr="" title=""/>
+            <wp:cNvGraphicFramePr>
+              <a:graphicFrameLocks xmlns:a="http://schemas.openxmlformats.org/drawingml/2006/main" noChangeAspect="1"/>
+            </wp:cNvGraphicFramePr>
+            <a:graphic xmlns:a="http://schemas.openxmlformats.org/drawingml/2006/main">
+              <a:graphicData uri="http://schemas.openxmlformats.org/drawingml/2006/picture">
+                <pic:pic xmlns:pic="http://schemas.openxmlformats.org/drawingml/2006/picture">
+                  <pic:nvPicPr>
+                    <pic:cNvPr id="0" name="" descr=""/>
+                    <pic:cNvPicPr>
+                      <a:picLocks noChangeAspect="1" noChangeArrowheads="1"/>
+                    </pic:cNvPicPr>
+                  </pic:nvPicPr>
+                  <pic:blipFill>
+                    <a:blip r:embed="rId16" cstate="none"/>
+                    <a:srcRect/>
+                    <a:stretch>
+                      <a:fillRect/>
+                    </a:stretch>
+                  </pic:blipFill>
+                  <pic:spPr bwMode="auto">
+                    <a:xfrm>
+                      <a:off x="0" y="0"/>
+                      <a:ext cx="5524500" cy="6096000"/>
+                    </a:xfrm>
+                    <a:prstGeom prst="rect">
+                      <a:avLst/>
+                    </a:prstGeom>
+                  </pic:spPr>
+                </pic:pic>
+              </a:graphicData>
+            </a:graphic>
+          </wp:inline>
+        </w:drawing>
+      </w:r>
+    </w:p>
+    <w:p>
+      <w:pPr>
+        <w:spacing w:after="200" w:line="276"/>
       </w:pPr>
       <w:r>
         <w:rPr>
           <w:rFonts w:ascii="Calibri" w:cs="Calibri" w:eastAsia="Calibri" w:hAnsi="Calibri"/>
           <w:i/>
           <w:iCs/>
-          <w:color w:val="C00000"/>
-          <w:sz w:val="21"/>
-          <w:szCs w:val="21"/>
+          <w:color w:val="5F6368"/>
+          <w:sz w:val="18"/>
+          <w:szCs w:val="18"/>
         </w:rPr>
-        <w:t xml:space="preserve">[ screenshot not found: docs/screenshots/10-admin.png ]</w:t>
+        <w:t xml:space="preserve">A restaurant built through the interface rather than the seed: its menu, the item added to it with a price and a preparation time, and the staff hired to work there.</w:t>
       </w:r>
     </w:p>
     <w:p>
@@ -13003,7 +13453,7 @@
           <w:sz w:val="21"/>
           <w:szCs w:val="21"/>
         </w:rPr>
-        <w:t xml:space="preserve">The twelve restaurants read together — takings, waits against what was quoted, ratings, and complaints.</w:t>
+        <w:t xml:space="preserve">The restaurants read together — takings, waits against what was quoted, ratings, and complaints.</w:t>
       </w:r>
     </w:p>
     <w:p>
@@ -13057,7 +13507,7 @@
           <w:sz w:val="21"/>
           <w:szCs w:val="21"/>
         </w:rPr>
-        <w:t xml:space="preserve">It is deliberately group-wide with a per-restaurant table underneath. Around fifty orders spread across twelve restaurants means any single restaurant is four rows and a lot of white space; read together they say something. The same view breaks down to a single restaurant in the table below.</w:t>
+        <w:t xml:space="preserve">It is deliberately group-wide with a per-restaurant table underneath. Around fifty orders spread across a dozen or more restaurants means any single restaurant is four rows and a lot of white space; read together they say something. The same view breaks down to a single restaurant in the table below.</w:t>
       </w:r>
     </w:p>
     <w:p>
@@ -13081,18 +13531,63 @@
     </w:p>
     <w:p>
       <w:pPr>
-        <w:spacing w:after="120" w:line="276"/>
+        <w:spacing w:after="60" w:before="140"/>
+      </w:pPr>
+      <w:r>
+        <w:drawing>
+          <wp:inline distT="0" distB="0" distL="0" distR="0">
+            <wp:extent cx="5524500" cy="5867400"/>
+            <wp:effectExtent t="0" r="0" b="0" l="0"/>
+            <wp:docPr id="1" name="" descr="" title=""/>
+            <wp:cNvGraphicFramePr>
+              <a:graphicFrameLocks xmlns:a="http://schemas.openxmlformats.org/drawingml/2006/main" noChangeAspect="1"/>
+            </wp:cNvGraphicFramePr>
+            <a:graphic xmlns:a="http://schemas.openxmlformats.org/drawingml/2006/main">
+              <a:graphicData uri="http://schemas.openxmlformats.org/drawingml/2006/picture">
+                <pic:pic xmlns:pic="http://schemas.openxmlformats.org/drawingml/2006/picture">
+                  <pic:nvPicPr>
+                    <pic:cNvPr id="0" name="" descr=""/>
+                    <pic:cNvPicPr>
+                      <a:picLocks noChangeAspect="1" noChangeArrowheads="1"/>
+                    </pic:cNvPicPr>
+                  </pic:nvPicPr>
+                  <pic:blipFill>
+                    <a:blip r:embed="rId17" cstate="none"/>
+                    <a:srcRect/>
+                    <a:stretch>
+                      <a:fillRect/>
+                    </a:stretch>
+                  </pic:blipFill>
+                  <pic:spPr bwMode="auto">
+                    <a:xfrm>
+                      <a:off x="0" y="0"/>
+                      <a:ext cx="5524500" cy="5867400"/>
+                    </a:xfrm>
+                    <a:prstGeom prst="rect">
+                      <a:avLst/>
+                    </a:prstGeom>
+                  </pic:spPr>
+                </pic:pic>
+              </a:graphicData>
+            </a:graphic>
+          </wp:inline>
+        </w:drawing>
+      </w:r>
+    </w:p>
+    <w:p>
+      <w:pPr>
+        <w:spacing w:after="200" w:line="276"/>
       </w:pPr>
       <w:r>
         <w:rPr>
           <w:rFonts w:ascii="Calibri" w:cs="Calibri" w:eastAsia="Calibri" w:hAnsi="Calibri"/>
           <w:i/>
           <w:iCs/>
-          <w:color w:val="C00000"/>
-          <w:sz w:val="21"/>
-          <w:szCs w:val="21"/>
+          <w:color w:val="5F6368"/>
+          <w:sz w:val="18"/>
+          <w:szCs w:val="18"/>
         </w:rPr>
-        <w:t xml:space="preserve">[ screenshot not found: docs/screenshots/11-dashboard.png ]</w:t>
+        <w:t xml:space="preserve">Takings against money still owed, actual waits against quoted ones, the spread of ratings, and the same figures broken down per restaurant.</w:t>
       </w:r>
     </w:p>
     <w:p>
@@ -13202,7 +13697,7 @@
           <w:sz w:val="21"/>
           <w:szCs w:val="21"/>
         </w:rPr>
-        <w:t xml:space="preserve">Pick a restaurant from the twelve listed. Terra Kulture is a good one to try.</w:t>
+        <w:t xml:space="preserve">Pick a restaurant from the list. Terra Kulture is a good one to try.</w:t>
       </w:r>
     </w:p>
     <w:p>
@@ -13371,7 +13866,7 @@
           <w:sz w:val="21"/>
           <w:szCs w:val="21"/>
         </w:rPr>
-        <w:t xml:space="preserve">Choose a chef and a bartender from the restaurant's staff, then press “Record preparation”. The order moves to Preparing.</w:t>
+        <w:t xml:space="preserve">Choose a chef and a bartender from the restaurant's staff, then press “Record preparation”. The order moves to Preparing. Only the roles the order actually needs are offered — a drinks-only order asks for no chef.</w:t>
       </w:r>
     </w:p>
     <w:p>
@@ -13390,7 +13885,7 @@
           <w:sz w:val="21"/>
           <w:szCs w:val="21"/>
         </w:rPr>
-        <w:t xml:space="preserve">Press “Mark as served”. Note that this button is disabled until a chef and bartender have been recorded — the order cannot be served by someone unnamed.</w:t>
+        <w:t xml:space="preserve">Press “Mark as served”. Note that this button is disabled until preparation has been recorded — the order cannot be served by someone unnamed.</w:t>
       </w:r>
     </w:p>
     <w:p>
@@ -13679,7 +14174,7 @@
           <w:sz w:val="21"/>
           <w:szCs w:val="21"/>
         </w:rPr>
-        <w:t xml:space="preserve">Still outstanding. Resolved questions move into the change log in section 4 with the reason attached.</w:t>
+        <w:t xml:space="preserve">Questions raised during the build and not yet answered. Once resolved they move into the change log in section 4 with the reason attached.</w:t>
       </w:r>
     </w:p>
     <w:p>

</xml_diff>